<commit_message>
记录 E09-R13 checkpoint-900 验证
</commit_message>
<xml_diff>
--- a/docs/reports/02-微调与数据.docx
+++ b/docs/reports/02-微调与数据.docx
@@ -12,7 +12,7 @@
     </w:p>
     <w:p>
       <w:r>
-        <w:t>更新：2026-10-01T22:46:44+08:00。本册按实际实验整理，原始运行记录单独保存。</w:t>
+        <w:t>更新：2026-10-01T22:55:41+08:00。本册按实际实验整理，原始运行记录单独保存。</w:t>
       </w:r>
     </w:p>
     <w:p>
@@ -1336,7 +1336,7 @@
               <w:spacing w:after="40" w:line="240" w:lineRule="auto"/>
             </w:pPr>
             <w:r>
-              <w:t>800</w:t>
+              <w:t>900</w:t>
             </w:r>
           </w:p>
         </w:tc>
@@ -1349,7 +1349,7 @@
               <w:spacing w:after="40" w:line="240" w:lineRule="auto"/>
             </w:pPr>
             <w:r>
-              <w:t>0.12630</w:t>
+              <w:t>0.12322</w:t>
             </w:r>
           </w:p>
         </w:tc>

</xml_diff>

<commit_message>
记录 E09-R13 checkpoint-1000 验证
</commit_message>
<xml_diff>
--- a/docs/reports/02-微调与数据.docx
+++ b/docs/reports/02-微调与数据.docx
@@ -12,7 +12,7 @@
     </w:p>
     <w:p>
       <w:r>
-        <w:t>更新：2026-10-01T22:55:41+08:00。本册按实际实验整理，原始运行记录单独保存。</w:t>
+        <w:t>更新：2026-10-01T23:03:09+08:00。本册按实际实验整理，原始运行记录单独保存。</w:t>
       </w:r>
     </w:p>
     <w:p>
@@ -1336,7 +1336,7 @@
               <w:spacing w:after="40" w:line="240" w:lineRule="auto"/>
             </w:pPr>
             <w:r>
-              <w:t>900</w:t>
+              <w:t>1000</w:t>
             </w:r>
           </w:p>
         </w:tc>
@@ -1349,7 +1349,7 @@
               <w:spacing w:after="40" w:line="240" w:lineRule="auto"/>
             </w:pPr>
             <w:r>
-              <w:t>0.12322</w:t>
+              <w:t>0.12060</w:t>
             </w:r>
           </w:p>
         </w:tc>

</xml_diff>

<commit_message>
记录 E09-R13 checkpoint-1100 验证
</commit_message>
<xml_diff>
--- a/docs/reports/02-微调与数据.docx
+++ b/docs/reports/02-微调与数据.docx
@@ -12,7 +12,7 @@
     </w:p>
     <w:p>
       <w:r>
-        <w:t>更新：2026-10-01T23:03:09+08:00。本册按实际实验整理，原始运行记录单独保存。</w:t>
+        <w:t>更新：2026-10-01T23:10:45+08:00。本册按实际实验整理，原始运行记录单独保存。</w:t>
       </w:r>
     </w:p>
     <w:p>
@@ -1336,7 +1336,7 @@
               <w:spacing w:after="40" w:line="240" w:lineRule="auto"/>
             </w:pPr>
             <w:r>
-              <w:t>1000</w:t>
+              <w:t>1100</w:t>
             </w:r>
           </w:p>
         </w:tc>
@@ -1349,7 +1349,7 @@
               <w:spacing w:after="40" w:line="240" w:lineRule="auto"/>
             </w:pPr>
             <w:r>
-              <w:t>0.12060</w:t>
+              <w:t>0.11937</w:t>
             </w:r>
           </w:p>
         </w:tc>

</xml_diff>

<commit_message>
记录 E09-R13 checkpoint-1500 验证
</commit_message>
<xml_diff>
--- a/docs/reports/02-微调与数据.docx
+++ b/docs/reports/02-微调与数据.docx
@@ -12,7 +12,7 @@
     </w:p>
     <w:p>
       <w:r>
-        <w:t>更新：2026-10-01T23:10:45+08:00。本册按实际实验整理，原始运行记录单独保存。</w:t>
+        <w:t>更新：2026-10-01T23:40:39+08:00。本册按实际实验整理，原始运行记录单独保存。</w:t>
       </w:r>
     </w:p>
     <w:p>
@@ -1336,7 +1336,7 @@
               <w:spacing w:after="40" w:line="240" w:lineRule="auto"/>
             </w:pPr>
             <w:r>
-              <w:t>1100</w:t>
+              <w:t>1500</w:t>
             </w:r>
           </w:p>
         </w:tc>
@@ -1349,7 +1349,7 @@
               <w:spacing w:after="40" w:line="240" w:lineRule="auto"/>
             </w:pPr>
             <w:r>
-              <w:t>0.11937</w:t>
+              <w:t>0.11235</w:t>
             </w:r>
           </w:p>
         </w:tc>

</xml_diff>

<commit_message>
记录 E09-R13 checkpoint-1600 验证
</commit_message>
<xml_diff>
--- a/docs/reports/02-微调与数据.docx
+++ b/docs/reports/02-微调与数据.docx
@@ -12,7 +12,7 @@
     </w:p>
     <w:p>
       <w:r>
-        <w:t>更新：2026-10-01T23:40:39+08:00。本册按实际实验整理，原始运行记录单独保存。</w:t>
+        <w:t>更新：2026-10-01T23:49:37+08:00。本册按实际实验整理，原始运行记录单独保存。</w:t>
       </w:r>
     </w:p>
     <w:p>
@@ -1336,7 +1336,7 @@
               <w:spacing w:after="40" w:line="240" w:lineRule="auto"/>
             </w:pPr>
             <w:r>
-              <w:t>1500</w:t>
+              <w:t>1600</w:t>
             </w:r>
           </w:p>
         </w:tc>
@@ -1349,7 +1349,7 @@
               <w:spacing w:after="40" w:line="240" w:lineRule="auto"/>
             </w:pPr>
             <w:r>
-              <w:t>0.11235</w:t>
+              <w:t>0.11163</w:t>
             </w:r>
           </w:p>
         </w:tc>

</xml_diff>

<commit_message>
记录 E09-R13 checkpoint-1700 验证
</commit_message>
<xml_diff>
--- a/docs/reports/02-微调与数据.docx
+++ b/docs/reports/02-微调与数据.docx
@@ -12,7 +12,7 @@
     </w:p>
     <w:p>
       <w:r>
-        <w:t>更新：2026-10-01T23:49:37+08:00。本册按实际实验整理，原始运行记录单独保存。</w:t>
+        <w:t>更新：2026-10-02T00:05:37+08:00。本册按实际实验整理，原始运行记录单独保存。</w:t>
       </w:r>
     </w:p>
     <w:p>
@@ -1336,7 +1336,7 @@
               <w:spacing w:after="40" w:line="240" w:lineRule="auto"/>
             </w:pPr>
             <w:r>
-              <w:t>1600</w:t>
+              <w:t>1700</w:t>
             </w:r>
           </w:p>
         </w:tc>
@@ -1349,7 +1349,7 @@
               <w:spacing w:after="40" w:line="240" w:lineRule="auto"/>
             </w:pPr>
             <w:r>
-              <w:t>0.11163</w:t>
+              <w:t>0.11130</w:t>
             </w:r>
           </w:p>
         </w:tc>

</xml_diff>

<commit_message>
记录 E09-R13 checkpoint-1800 验证
</commit_message>
<xml_diff>
--- a/docs/reports/02-微调与数据.docx
+++ b/docs/reports/02-微调与数据.docx
@@ -12,7 +12,7 @@
     </w:p>
     <w:p>
       <w:r>
-        <w:t>更新：2026-10-02T00:05:37+08:00。本册按实际实验整理，原始运行记录单独保存。</w:t>
+        <w:t>更新：2026-10-02T00:22:13+08:00。本册按实际实验整理，原始运行记录单独保存。</w:t>
       </w:r>
     </w:p>
     <w:p>
@@ -1336,7 +1336,7 @@
               <w:spacing w:after="40" w:line="240" w:lineRule="auto"/>
             </w:pPr>
             <w:r>
-              <w:t>1700</w:t>
+              <w:t>1800</w:t>
             </w:r>
           </w:p>
         </w:tc>
@@ -1349,7 +1349,7 @@
               <w:spacing w:after="40" w:line="240" w:lineRule="auto"/>
             </w:pPr>
             <w:r>
-              <w:t>0.11130</w:t>
+              <w:t>0.10974</w:t>
             </w:r>
           </w:p>
         </w:tc>

</xml_diff>

<commit_message>
记录 E09-R13 checkpoint-2000 验证与报告
</commit_message>
<xml_diff>
--- a/docs/reports/02-微调与数据.docx
+++ b/docs/reports/02-微调与数据.docx
@@ -12,7 +12,7 @@
     </w:p>
     <w:p>
       <w:r>
-        <w:t>更新：2026-10-02T00:32:18+08:00。本册按实际实验整理，原始运行记录单独保存。</w:t>
+        <w:t>更新：2026-10-02T00:55:26+08:00。本册按实际实验整理，原始运行记录单独保存。</w:t>
       </w:r>
     </w:p>
     <w:p>
@@ -1336,7 +1336,7 @@
               <w:spacing w:after="40" w:line="240" w:lineRule="auto"/>
             </w:pPr>
             <w:r>
-              <w:t>1889</w:t>
+              <w:t>2000</w:t>
             </w:r>
           </w:p>
         </w:tc>
@@ -1349,7 +1349,7 @@
               <w:spacing w:after="40" w:line="240" w:lineRule="auto"/>
             </w:pPr>
             <w:r>
-              <w:t>0.10974</w:t>
+              <w:t>0.10707</w:t>
             </w:r>
           </w:p>
         </w:tc>

</xml_diff>

<commit_message>
记录 E09-R13 checkpoint-2100 验证与报告
</commit_message>
<xml_diff>
--- a/docs/reports/02-微调与数据.docx
+++ b/docs/reports/02-微调与数据.docx
@@ -12,7 +12,7 @@
     </w:p>
     <w:p>
       <w:r>
-        <w:t>更新：2026-10-02T00:55:26+08:00。本册按实际实验整理，原始运行记录单独保存。</w:t>
+        <w:t>更新：2026-10-02T01:12:04+08:00。本册按实际实验整理，原始运行记录单独保存。</w:t>
       </w:r>
     </w:p>
     <w:p>
@@ -1336,7 +1336,7 @@
               <w:spacing w:after="40" w:line="240" w:lineRule="auto"/>
             </w:pPr>
             <w:r>
-              <w:t>2000</w:t>
+              <w:t>2100</w:t>
             </w:r>
           </w:p>
         </w:tc>
@@ -1349,7 +1349,7 @@
               <w:spacing w:after="40" w:line="240" w:lineRule="auto"/>
             </w:pPr>
             <w:r>
-              <w:t>0.10707</w:t>
+              <w:t>0.10580</w:t>
             </w:r>
           </w:p>
         </w:tc>

</xml_diff>

<commit_message>
记录 E09-R13 checkpoint-2200 验证与报告
</commit_message>
<xml_diff>
--- a/docs/reports/02-微调与数据.docx
+++ b/docs/reports/02-微调与数据.docx
@@ -12,7 +12,7 @@
     </w:p>
     <w:p>
       <w:r>
-        <w:t>更新：2026-10-02T01:12:04+08:00。本册按实际实验整理，原始运行记录单独保存。</w:t>
+        <w:t>更新：2026-10-02T01:28:43+08:00。本册按实际实验整理，原始运行记录单独保存。</w:t>
       </w:r>
     </w:p>
     <w:p>
@@ -1336,7 +1336,7 @@
               <w:spacing w:after="40" w:line="240" w:lineRule="auto"/>
             </w:pPr>
             <w:r>
-              <w:t>2100</w:t>
+              <w:t>2200</w:t>
             </w:r>
           </w:p>
         </w:tc>
@@ -1349,7 +1349,7 @@
               <w:spacing w:after="40" w:line="240" w:lineRule="auto"/>
             </w:pPr>
             <w:r>
-              <w:t>0.10580</w:t>
+              <w:t>0.10431</w:t>
             </w:r>
           </w:p>
         </w:tc>

</xml_diff>

<commit_message>
记录 E09-R13 checkpoint-2300 验证与报告
</commit_message>
<xml_diff>
--- a/docs/reports/02-微调与数据.docx
+++ b/docs/reports/02-微调与数据.docx
@@ -12,7 +12,7 @@
     </w:p>
     <w:p>
       <w:r>
-        <w:t>更新：2026-10-02T01:28:43+08:00。本册按实际实验整理，原始运行记录单独保存。</w:t>
+        <w:t>更新：2026-10-02T01:45:26+08:00。本册按实际实验整理，原始运行记录单独保存。</w:t>
       </w:r>
     </w:p>
     <w:p>
@@ -1336,7 +1336,7 @@
               <w:spacing w:after="40" w:line="240" w:lineRule="auto"/>
             </w:pPr>
             <w:r>
-              <w:t>2200</w:t>
+              <w:t>2300</w:t>
             </w:r>
           </w:p>
         </w:tc>
@@ -1349,7 +1349,7 @@
               <w:spacing w:after="40" w:line="240" w:lineRule="auto"/>
             </w:pPr>
             <w:r>
-              <w:t>0.10431</w:t>
+              <w:t>0.10393</w:t>
             </w:r>
           </w:p>
         </w:tc>

</xml_diff>

<commit_message>
记录 E09-R13 checkpoint-2400 验证与报告
</commit_message>
<xml_diff>
--- a/docs/reports/02-微调与数据.docx
+++ b/docs/reports/02-微调与数据.docx
@@ -12,7 +12,7 @@
     </w:p>
     <w:p>
       <w:r>
-        <w:t>更新：2026-10-02T01:45:26+08:00。本册按实际实验整理，原始运行记录单独保存。</w:t>
+        <w:t>更新：2026-10-02T02:02:09+08:00。本册按实际实验整理，原始运行记录单独保存。</w:t>
       </w:r>
     </w:p>
     <w:p>
@@ -1336,7 +1336,7 @@
               <w:spacing w:after="40" w:line="240" w:lineRule="auto"/>
             </w:pPr>
             <w:r>
-              <w:t>2300</w:t>
+              <w:t>2400</w:t>
             </w:r>
           </w:p>
         </w:tc>
@@ -1349,7 +1349,7 @@
               <w:spacing w:after="40" w:line="240" w:lineRule="auto"/>
             </w:pPr>
             <w:r>
-              <w:t>0.10393</w:t>
+              <w:t>0.10353</w:t>
             </w:r>
           </w:p>
         </w:tc>

</xml_diff>

<commit_message>
更新 E09-R13 step-2489 进度与报告
</commit_message>
<xml_diff>
--- a/docs/reports/02-微调与数据.docx
+++ b/docs/reports/02-微调与数据.docx
@@ -12,7 +12,7 @@
     </w:p>
     <w:p>
       <w:r>
-        <w:t>更新：2026-10-02T02:02:09+08:00。本册按实际实验整理，原始运行记录单独保存。</w:t>
+        <w:t>更新：2026-10-02T02:12:15+08:00。本册按实际实验整理，原始运行记录单独保存。</w:t>
       </w:r>
     </w:p>
     <w:p>
@@ -1336,7 +1336,7 @@
               <w:spacing w:after="40" w:line="240" w:lineRule="auto"/>
             </w:pPr>
             <w:r>
-              <w:t>2400</w:t>
+              <w:t>2489</w:t>
             </w:r>
           </w:p>
         </w:tc>

</xml_diff>

<commit_message>
记录 E09-R13 checkpoint-2500 验证与报告
</commit_message>
<xml_diff>
--- a/docs/reports/02-微调与数据.docx
+++ b/docs/reports/02-微调与数据.docx
@@ -12,7 +12,7 @@
     </w:p>
     <w:p>
       <w:r>
-        <w:t>更新：2026-10-02T02:12:15+08:00。本册按实际实验整理，原始运行记录单独保存。</w:t>
+        <w:t>更新：2026-10-02T02:28:48+08:00。本册按实际实验整理，原始运行记录单独保存。</w:t>
       </w:r>
     </w:p>
     <w:p>
@@ -1336,7 +1336,7 @@
               <w:spacing w:after="40" w:line="240" w:lineRule="auto"/>
             </w:pPr>
             <w:r>
-              <w:t>2489</w:t>
+              <w:t>2588</w:t>
             </w:r>
           </w:p>
         </w:tc>
@@ -1349,7 +1349,7 @@
               <w:spacing w:after="40" w:line="240" w:lineRule="auto"/>
             </w:pPr>
             <w:r>
-              <w:t>0.10353</w:t>
+              <w:t>0.10298</w:t>
             </w:r>
           </w:p>
         </w:tc>

</xml_diff>

<commit_message>
记录 E09-R13 checkpoint-2600 验证与报告
</commit_message>
<xml_diff>
--- a/docs/reports/02-微调与数据.docx
+++ b/docs/reports/02-微调与数据.docx
@@ -12,7 +12,7 @@
     </w:p>
     <w:p>
       <w:r>
-        <w:t>更新：2026-10-02T02:28:48+08:00。本册按实际实验整理，原始运行记录单独保存。</w:t>
+        <w:t>更新：2026-10-02T02:35:24+08:00。本册按实际实验整理，原始运行记录单独保存。</w:t>
       </w:r>
     </w:p>
     <w:p>
@@ -1336,7 +1336,7 @@
               <w:spacing w:after="40" w:line="240" w:lineRule="auto"/>
             </w:pPr>
             <w:r>
-              <w:t>2588</w:t>
+              <w:t>2600</w:t>
             </w:r>
           </w:p>
         </w:tc>
@@ -1349,7 +1349,7 @@
               <w:spacing w:after="40" w:line="240" w:lineRule="auto"/>
             </w:pPr>
             <w:r>
-              <w:t>0.10298</w:t>
+              <w:t>0.10128</w:t>
             </w:r>
           </w:p>
         </w:tc>

</xml_diff>

<commit_message>
记录 E09-R13 checkpoint-2700 验证与报告
</commit_message>
<xml_diff>
--- a/docs/reports/02-微调与数据.docx
+++ b/docs/reports/02-微调与数据.docx
@@ -12,7 +12,7 @@
     </w:p>
     <w:p>
       <w:r>
-        <w:t>更新：2026-10-02T02:35:24+08:00。本册按实际实验整理，原始运行记录单独保存。</w:t>
+        <w:t>更新：2026-10-02T02:52:04+08:00。本册按实际实验整理，原始运行记录单独保存。</w:t>
       </w:r>
     </w:p>
     <w:p>
@@ -1336,7 +1336,7 @@
               <w:spacing w:after="40" w:line="240" w:lineRule="auto"/>
             </w:pPr>
             <w:r>
-              <w:t>2600</w:t>
+              <w:t>2700</w:t>
             </w:r>
           </w:p>
         </w:tc>
@@ -1349,7 +1349,7 @@
               <w:spacing w:after="40" w:line="240" w:lineRule="auto"/>
             </w:pPr>
             <w:r>
-              <w:t>0.10128</w:t>
+              <w:t>0.10068</w:t>
             </w:r>
           </w:p>
         </w:tc>

</xml_diff>

<commit_message>
记录 E09-R13 checkpoint-2800 验证与报告
</commit_message>
<xml_diff>
--- a/docs/reports/02-微调与数据.docx
+++ b/docs/reports/02-微调与数据.docx
@@ -12,7 +12,7 @@
     </w:p>
     <w:p>
       <w:r>
-        <w:t>更新：2026-10-02T02:52:04+08:00。本册按实际实验整理，原始运行记录单独保存。</w:t>
+        <w:t>更新：2026-10-02T03:00:47+08:00。本册按实际实验整理，原始运行记录单独保存。</w:t>
       </w:r>
     </w:p>
     <w:p>
@@ -1336,7 +1336,7 @@
               <w:spacing w:after="40" w:line="240" w:lineRule="auto"/>
             </w:pPr>
             <w:r>
-              <w:t>2700</w:t>
+              <w:t>2800</w:t>
             </w:r>
           </w:p>
         </w:tc>
@@ -1349,7 +1349,7 @@
               <w:spacing w:after="40" w:line="240" w:lineRule="auto"/>
             </w:pPr>
             <w:r>
-              <w:t>0.10068</w:t>
+              <w:t>0.09976</w:t>
             </w:r>
           </w:p>
         </w:tc>

</xml_diff>

<commit_message>
记录 E09-R13 checkpoint-2900 验证与报告
</commit_message>
<xml_diff>
--- a/docs/reports/02-微调与数据.docx
+++ b/docs/reports/02-微调与数据.docx
@@ -12,7 +12,7 @@
     </w:p>
     <w:p>
       <w:r>
-        <w:t>更新：2026-10-02T03:00:47+08:00。本册按实际实验整理，原始运行记录单独保存。</w:t>
+        <w:t>更新：2026-10-02T03:08:49+08:00。本册按实际实验整理，原始运行记录单独保存。</w:t>
       </w:r>
     </w:p>
     <w:p>
@@ -1336,7 +1336,7 @@
               <w:spacing w:after="40" w:line="240" w:lineRule="auto"/>
             </w:pPr>
             <w:r>
-              <w:t>2800</w:t>
+              <w:t>2900</w:t>
             </w:r>
           </w:p>
         </w:tc>
@@ -1349,7 +1349,7 @@
               <w:spacing w:after="40" w:line="240" w:lineRule="auto"/>
             </w:pPr>
             <w:r>
-              <w:t>0.09976</w:t>
+              <w:t>0.09848</w:t>
             </w:r>
           </w:p>
         </w:tc>

</xml_diff>

<commit_message>
记录 E09-R13 checkpoint-3000 验证与报告
</commit_message>
<xml_diff>
--- a/docs/reports/02-微调与数据.docx
+++ b/docs/reports/02-微调与数据.docx
@@ -12,7 +12,7 @@
     </w:p>
     <w:p>
       <w:r>
-        <w:t>更新：2026-10-02T03:08:49+08:00。本册按实际实验整理，原始运行记录单独保存。</w:t>
+        <w:t>更新：2026-10-02T03:16:56+08:00。本册按实际实验整理，原始运行记录单独保存。</w:t>
       </w:r>
     </w:p>
     <w:p>
@@ -1336,7 +1336,7 @@
               <w:spacing w:after="40" w:line="240" w:lineRule="auto"/>
             </w:pPr>
             <w:r>
-              <w:t>2900</w:t>
+              <w:t>3000</w:t>
             </w:r>
           </w:p>
         </w:tc>

</xml_diff>

<commit_message>
记录 E09-R13 checkpoint-3200 验证与报告
</commit_message>
<xml_diff>
--- a/docs/reports/02-微调与数据.docx
+++ b/docs/reports/02-微调与数据.docx
@@ -12,7 +12,7 @@
     </w:p>
     <w:p>
       <w:r>
-        <w:t>更新：2026-10-02T03:16:56+08:00。本册按实际实验整理，原始运行记录单独保存。</w:t>
+        <w:t>更新：2026-10-02T03:32:58+08:00。本册按实际实验整理，原始运行记录单独保存。</w:t>
       </w:r>
     </w:p>
     <w:p>
@@ -1336,7 +1336,7 @@
               <w:spacing w:after="40" w:line="240" w:lineRule="auto"/>
             </w:pPr>
             <w:r>
-              <w:t>3000</w:t>
+              <w:t>3200</w:t>
             </w:r>
           </w:p>
         </w:tc>
@@ -1349,7 +1349,7 @@
               <w:spacing w:after="40" w:line="240" w:lineRule="auto"/>
             </w:pPr>
             <w:r>
-              <w:t>0.09848</w:t>
+              <w:t>0.09753</w:t>
             </w:r>
           </w:p>
         </w:tc>

</xml_diff>

<commit_message>
记录 E09-R13 checkpoint-3300 验证与报告
</commit_message>
<xml_diff>
--- a/docs/reports/02-微调与数据.docx
+++ b/docs/reports/02-微调与数据.docx
@@ -12,7 +12,7 @@
     </w:p>
     <w:p>
       <w:r>
-        <w:t>更新：2026-10-02T03:32:58+08:00。本册按实际实验整理，原始运行记录单独保存。</w:t>
+        <w:t>更新：2026-10-02T03:41:08+08:00。本册按实际实验整理，原始运行记录单独保存。</w:t>
       </w:r>
     </w:p>
     <w:p>
@@ -1336,7 +1336,7 @@
               <w:spacing w:after="40" w:line="240" w:lineRule="auto"/>
             </w:pPr>
             <w:r>
-              <w:t>3200</w:t>
+              <w:t>3300</w:t>
             </w:r>
           </w:p>
         </w:tc>
@@ -1349,7 +1349,7 @@
               <w:spacing w:after="40" w:line="240" w:lineRule="auto"/>
             </w:pPr>
             <w:r>
-              <w:t>0.09753</w:t>
+              <w:t>0.09702</w:t>
             </w:r>
           </w:p>
         </w:tc>

</xml_diff>

<commit_message>
记录 E09-R13 checkpoint-3400 评测与归档
</commit_message>
<xml_diff>
--- a/docs/reports/02-微调与数据.docx
+++ b/docs/reports/02-微调与数据.docx
@@ -12,7 +12,7 @@
     </w:p>
     <w:p>
       <w:r>
-        <w:t>更新：2026-10-02T03:41:08+08:00。本册按实际实验整理，原始运行记录单独保存。</w:t>
+        <w:t>更新：2026-10-02T03:49:13+08:00。本册按实际实验整理，原始运行记录单独保存。</w:t>
       </w:r>
     </w:p>
     <w:p>
@@ -1336,7 +1336,7 @@
               <w:spacing w:after="40" w:line="240" w:lineRule="auto"/>
             </w:pPr>
             <w:r>
-              <w:t>3300</w:t>
+              <w:t>3400</w:t>
             </w:r>
           </w:p>
         </w:tc>
@@ -1349,7 +1349,7 @@
               <w:spacing w:after="40" w:line="240" w:lineRule="auto"/>
             </w:pPr>
             <w:r>
-              <w:t>0.09702</w:t>
+              <w:t>0.09658</w:t>
             </w:r>
           </w:p>
         </w:tc>

</xml_diff>

<commit_message>
记录 E09-R13 checkpoint-3500 评测与归档
</commit_message>
<xml_diff>
--- a/docs/reports/02-微调与数据.docx
+++ b/docs/reports/02-微调与数据.docx
@@ -12,7 +12,7 @@
     </w:p>
     <w:p>
       <w:r>
-        <w:t>更新：2026-10-02T03:49:13+08:00。本册按实际实验整理，原始运行记录单独保存。</w:t>
+        <w:t>更新：2026-10-02T03:57:18+08:00。本册按实际实验整理，原始运行记录单独保存。</w:t>
       </w:r>
     </w:p>
     <w:p>
@@ -1336,7 +1336,7 @@
               <w:spacing w:after="40" w:line="240" w:lineRule="auto"/>
             </w:pPr>
             <w:r>
-              <w:t>3400</w:t>
+              <w:t>3500</w:t>
             </w:r>
           </w:p>
         </w:tc>
@@ -1349,7 +1349,7 @@
               <w:spacing w:after="40" w:line="240" w:lineRule="auto"/>
             </w:pPr>
             <w:r>
-              <w:t>0.09658</w:t>
+              <w:t>0.09637</w:t>
             </w:r>
           </w:p>
         </w:tc>

</xml_diff>

<commit_message>
记录 E09-R14 seed42 完整 dev 工具评测
</commit_message>
<xml_diff>
--- a/docs/reports/02-微调与数据.docx
+++ b/docs/reports/02-微调与数据.docx
@@ -12,7 +12,7 @@
     </w:p>
     <w:p>
       <w:r>
-        <w:t>更新：2026-10-02T04:17:37+08:00。本册按实际实验整理，原始运行记录单独保存。</w:t>
+        <w:t>更新：2026-10-02T04:34:31+08:00。本册按实际实验整理，原始运行记录单独保存。</w:t>
       </w:r>
     </w:p>
     <w:p>
@@ -30,7 +30,7 @@
     </w:p>
     <w:p>
       <w:r>
-        <w:t>最近这轮用了 10,000 条训练轨迹，完整 dev 通过 409/500；调用轮为 490/568，不调用轮为 335/360。loss 与实际工具决策分开看，不能把更容易生成调用当成任务成功率提升。</w:t>
+        <w:t>最近这轮用了 10,000 条训练轨迹，完整 dev 通过 410/500；调用轮为 492/568，不调用轮为 338/360。loss 与实际工具决策分开看，不能把更容易生成调用当成任务成功率提升。</w:t>
       </w:r>
     </w:p>
     <w:p>
@@ -492,7 +492,7 @@
     </w:p>
     <w:p>
       <w:r>
-        <w:t>这轮用了 10,000 条训练轨迹，完整 dev 通过 409/500；原模型加固定示例为 355/500。调用轮相差 +34 条，不调用轮相差 +36 条。先把这两类决策分开，才看得清模型具体改变了什么；其余规模和 seed 仍需继续比较。</w:t>
+        <w:t>这轮用了 10,000 条训练轨迹，完整 dev 通过 410/500；原模型加固定示例为 355/500。调用轮相差 +36 条，不调用轮相差 +39 条。先把这两类决策分开，才看得清模型具体改变了什么；其余规模和 seed 仍需继续比较。</w:t>
       </w:r>
     </w:p>
     <w:p>
@@ -1362,7 +1362,90 @@
               <w:spacing w:after="40" w:line="240" w:lineRule="auto"/>
             </w:pPr>
             <w:r>
-              <w:t>从 checkpoint-400 恢复后训练完成，待工具评测</w:t>
+              <w:t>断点恢复后训练与完整 dev 工具评测结束</w:t>
+            </w:r>
+          </w:p>
+        </w:tc>
+      </w:tr>
+      <w:tr>
+        <w:trPr>
+          <w:cantSplit/>
+        </w:trPr>
+        <w:tc>
+          <w:tcPr>
+            <w:tcW w:type="dxa" w:w="1606"/>
+          </w:tcPr>
+          <w:p>
+            <w:pPr>
+              <w:spacing w:after="40" w:line="240" w:lineRule="auto"/>
+            </w:pPr>
+            <w:r>
+              <w:t>E09-R15</w:t>
+            </w:r>
+          </w:p>
+        </w:tc>
+        <w:tc>
+          <w:tcPr>
+            <w:tcW w:type="dxa" w:w="1606"/>
+          </w:tcPr>
+          <w:p>
+            <w:pPr>
+              <w:spacing w:after="40" w:line="240" w:lineRule="auto"/>
+            </w:pPr>
+            <w:r>
+              <w:t>10000</w:t>
+            </w:r>
+          </w:p>
+        </w:tc>
+        <w:tc>
+          <w:tcPr>
+            <w:tcW w:type="dxa" w:w="1606"/>
+          </w:tcPr>
+          <w:p>
+            <w:pPr>
+              <w:spacing w:after="40" w:line="240" w:lineRule="auto"/>
+            </w:pPr>
+            <w:r>
+              <w:t>2026</w:t>
+            </w:r>
+          </w:p>
+        </w:tc>
+        <w:tc>
+          <w:tcPr>
+            <w:tcW w:type="dxa" w:w="1606"/>
+          </w:tcPr>
+          <w:p>
+            <w:pPr>
+              <w:spacing w:after="40" w:line="240" w:lineRule="auto"/>
+            </w:pPr>
+            <w:r>
+              <w:t>0</w:t>
+            </w:r>
+          </w:p>
+        </w:tc>
+        <w:tc>
+          <w:tcPr>
+            <w:tcW w:type="dxa" w:w="1606"/>
+          </w:tcPr>
+          <w:p>
+            <w:pPr>
+              <w:spacing w:after="40" w:line="240" w:lineRule="auto"/>
+            </w:pPr>
+            <w:r>
+              <w:t>尚未保存</w:t>
+            </w:r>
+          </w:p>
+        </w:tc>
+        <w:tc>
+          <w:tcPr>
+            <w:tcW w:type="dxa" w:w="1606"/>
+          </w:tcPr>
+          <w:p>
+            <w:pPr>
+              <w:spacing w:after="40" w:line="240" w:lineRule="auto"/>
+            </w:pPr>
+            <w:r>
+              <w:t>运行中</w:t>
             </w:r>
           </w:p>
         </w:tc>
@@ -1514,25 +1597,12 @@
         <w:pStyle w:val="Heading2"/>
       </w:pPr>
       <w:r>
-        <w:t>生成评测进行到哪一步？</w:t>
-      </w:r>
-    </w:p>
-    <w:p>
-      <w:r>
-        <w:t>E09-R13 的独立生成评测为 E09-R14，已落盘 436/928 个决策轮。还没有覆盖完整 500 条轨迹，暂时不把当前通过数写成最终成绩。</w:t>
-      </w:r>
-    </w:p>
-    <w:p>
-      <w:pPr>
-        <w:pStyle w:val="Heading2"/>
-      </w:pPr>
-      <w:r>
         <w:t>loss 降下来了，工具调用也改善了吗？</w:t>
       </w:r>
     </w:p>
     <w:p>
       <w:r>
-        <w:t>最近完成的 E09-R11 通过 409/500；调用轮为 490/568，不调用轮为 335/360。是否比原模型好，要在相同条件下逐项比较。</w:t>
+        <w:t>最近完成的 E09-R13 通过 410/500；调用轮为 492/568，不调用轮为 338/360。是否比原模型好，要在相同条件下逐项比较。</w:t>
       </w:r>
     </w:p>
     <w:p>
@@ -1994,6 +2064,89 @@
           </w:p>
         </w:tc>
       </w:tr>
+      <w:tr>
+        <w:trPr>
+          <w:cantSplit/>
+        </w:trPr>
+        <w:tc>
+          <w:tcPr>
+            <w:tcW w:type="dxa" w:w="1606"/>
+          </w:tcPr>
+          <w:p>
+            <w:pPr>
+              <w:spacing w:after="40" w:line="240" w:lineRule="auto"/>
+            </w:pPr>
+            <w:r>
+              <w:t>E09-R13</w:t>
+            </w:r>
+          </w:p>
+        </w:tc>
+        <w:tc>
+          <w:tcPr>
+            <w:tcW w:type="dxa" w:w="1606"/>
+          </w:tcPr>
+          <w:p>
+            <w:pPr>
+              <w:spacing w:after="40" w:line="240" w:lineRule="auto"/>
+            </w:pPr>
+            <w:r>
+              <w:t>10,000 / 42</w:t>
+            </w:r>
+          </w:p>
+        </w:tc>
+        <w:tc>
+          <w:tcPr>
+            <w:tcW w:type="dxa" w:w="1606"/>
+          </w:tcPr>
+          <w:p>
+            <w:pPr>
+              <w:spacing w:after="40" w:line="240" w:lineRule="auto"/>
+            </w:pPr>
+            <w:r>
+              <w:t>410/500</w:t>
+            </w:r>
+          </w:p>
+        </w:tc>
+        <w:tc>
+          <w:tcPr>
+            <w:tcW w:type="dxa" w:w="1606"/>
+          </w:tcPr>
+          <w:p>
+            <w:pPr>
+              <w:spacing w:after="40" w:line="240" w:lineRule="auto"/>
+            </w:pPr>
+            <w:r>
+              <w:t>492/568</w:t>
+            </w:r>
+          </w:p>
+        </w:tc>
+        <w:tc>
+          <w:tcPr>
+            <w:tcW w:type="dxa" w:w="1606"/>
+          </w:tcPr>
+          <w:p>
+            <w:pPr>
+              <w:spacing w:after="40" w:line="240" w:lineRule="auto"/>
+            </w:pPr>
+            <w:r>
+              <w:t>338/360</w:t>
+            </w:r>
+          </w:p>
+        </w:tc>
+        <w:tc>
+          <w:tcPr>
+            <w:tcW w:type="dxa" w:w="1606"/>
+          </w:tcPr>
+          <w:p>
+            <w:pPr>
+              <w:spacing w:after="40" w:line="240" w:lineRule="auto"/>
+            </w:pPr>
+            <w:r>
+              <w:t>1</w:t>
+            </w:r>
+          </w:p>
+        </w:tc>
+      </w:tr>
     </w:tbl>
     <w:p>
       <w:pPr>
@@ -2046,7 +2199,7 @@
     </w:p>
     <w:p>
       <w:r>
-        <w:t>最近完成的 E09-R11 通过 409/500，与原模型相差 +54 条，即 +10.8 个百分点。调用轮相差 +34 条，不调用轮相差 +36 条。先分别看这两类决策，才能判断模型是否只是更愿意调工具。</w:t>
+        <w:t>最近完成的 E09-R13 通过 410/500，与原模型相差 +55 条，即 +11.0 个百分点。调用轮相差 +36 条，不调用轮相差 +39 条。先分别看这两类决策，才能判断模型是否只是更愿意调工具。</w:t>
       </w:r>
     </w:p>
     <w:p>

</xml_diff>

<commit_message>
记录 E09-R15 seed2026 第100步验证进展
</commit_message>
<xml_diff>
--- a/docs/reports/02-微调与数据.docx
+++ b/docs/reports/02-微调与数据.docx
@@ -12,7 +12,7 @@
     </w:p>
     <w:p>
       <w:r>
-        <w:t>更新：2026-10-02T04:34:31+08:00。本册按实际实验整理，原始运行记录单独保存。</w:t>
+        <w:t>更新：2026-10-02T04:42:39+08:00。本册按实际实验整理，原始运行记录单独保存。</w:t>
       </w:r>
     </w:p>
     <w:p>
@@ -1419,7 +1419,7 @@
               <w:spacing w:after="40" w:line="240" w:lineRule="auto"/>
             </w:pPr>
             <w:r>
-              <w:t>0</w:t>
+              <w:t>100</w:t>
             </w:r>
           </w:p>
         </w:tc>
@@ -1432,7 +1432,7 @@
               <w:spacing w:after="40" w:line="240" w:lineRule="auto"/>
             </w:pPr>
             <w:r>
-              <w:t>尚未保存</w:t>
+              <w:t>0.19180</w:t>
             </w:r>
           </w:p>
         </w:tc>
@@ -1526,7 +1526,7 @@
               <a:graphicData uri="http://schemas.openxmlformats.org/drawingml/2006/picture">
                 <pic:pic>
                   <pic:nvPicPr>
-                    <pic:cNvPr id="0" name="E09-R13-loss.png"/>
+                    <pic:cNvPr id="0" name="E09-R15-loss.png"/>
                     <pic:cNvPicPr/>
                   </pic:nvPicPr>
                   <pic:blipFill>
@@ -1554,27 +1554,12 @@
         <w:jc w:val="center"/>
       </w:pPr>
       <w:r>
-        <w:t>图 E09-1：E09-R13，逐步训练 loss 与完整 dev 测量点。</w:t>
+        <w:t>图 E09-1：E09-R15，逐步训练 loss 与完整 dev 测量点。</w:t>
       </w:r>
     </w:p>
     <w:p>
       <w:r>
         <w:t>训练点是 TRL 每次参数更新的 loss，验证点来自完整 dev 的监督 token 加权交叉熵。它们的聚合窗口不同，先观察各自趋势，再结合工具生成结果判断；不能把一两个低点当成能力改善。</w:t>
-      </w:r>
-    </w:p>
-    <w:p>
-      <w:r>
-        <w:t xml:space="preserve">E09-R13 的训练日志跨过一次断点：首次运行记录到第 489 步，但最后可恢复权重只到 </w:t>
-      </w:r>
-      <w:r>
-        <w:rPr>
-          <w:rFonts w:ascii="Consolas" w:hAnsi="Consolas"/>
-          <w:sz w:val="20"/>
-        </w:rPr>
-        <w:t>checkpoint-400</w:t>
-      </w:r>
-      <w:r>
-        <w:t>；恢复后的 loss 从下一段单独绘制。图里保留了重启前未保存的尾段记录，也保留恢复后的实际曲线，没有把两次进程的 loss 连成一条连续训练轨迹。</w:t>
       </w:r>
     </w:p>
     <w:p>

</xml_diff>

<commit_message>
docs: capture E09-R15 validation at 2800 steps
</commit_message>
<xml_diff>
--- a/docs/reports/02-微调与数据.docx
+++ b/docs/reports/02-微调与数据.docx
@@ -12,7 +12,7 @@
     </w:p>
     <w:p>
       <w:r>
-        <w:t>更新：2026-10-02T07:54:25+08:00。本册按实际实验整理，原始运行记录单独保存。</w:t>
+        <w:t>更新：2026-10-02T08:18:25+08:00。本册按实际实验整理，原始运行记录单独保存。</w:t>
       </w:r>
     </w:p>
     <w:p>
@@ -1419,7 +1419,7 @@
               <w:spacing w:after="40" w:line="240" w:lineRule="auto"/>
             </w:pPr>
             <w:r>
-              <w:t>2500</w:t>
+              <w:t>2800</w:t>
             </w:r>
           </w:p>
         </w:tc>
@@ -1432,7 +1432,7 @@
               <w:spacing w:after="40" w:line="240" w:lineRule="auto"/>
             </w:pPr>
             <w:r>
-              <w:t>0.10249</w:t>
+              <w:t>0.10030</w:t>
             </w:r>
           </w:p>
         </w:tc>

</xml_diff>

<commit_message>
docs: record E09-R15 validation at 3100 steps
</commit_message>
<xml_diff>
--- a/docs/reports/02-微调与数据.docx
+++ b/docs/reports/02-微调与数据.docx
@@ -12,7 +12,7 @@
     </w:p>
     <w:p>
       <w:r>
-        <w:t>更新：2026-10-02T08:18:25+08:00。本册按实际实验整理，原始运行记录单独保存。</w:t>
+        <w:t>更新：2026-10-02T08:42:25+08:00。本册按实际实验整理，原始运行记录单独保存。</w:t>
       </w:r>
     </w:p>
     <w:p>
@@ -1419,7 +1419,7 @@
               <w:spacing w:after="40" w:line="240" w:lineRule="auto"/>
             </w:pPr>
             <w:r>
-              <w:t>2800</w:t>
+              <w:t>3100</w:t>
             </w:r>
           </w:p>
         </w:tc>
@@ -1432,7 +1432,7 @@
               <w:spacing w:after="40" w:line="240" w:lineRule="auto"/>
             </w:pPr>
             <w:r>
-              <w:t>0.10030</w:t>
+              <w:t>0.09846</w:t>
             </w:r>
           </w:p>
         </w:tc>

</xml_diff>

<commit_message>
docs: record E09-R15 validation at 3300 steps
</commit_message>
<xml_diff>
--- a/docs/reports/02-微调与数据.docx
+++ b/docs/reports/02-微调与数据.docx
@@ -12,7 +12,7 @@
     </w:p>
     <w:p>
       <w:r>
-        <w:t>更新：2026-10-02T08:42:25+08:00。本册按实际实验整理，原始运行记录单独保存。</w:t>
+        <w:t>更新：2026-10-02T08:58:17+08:00。本册按实际实验整理，原始运行记录单独保存。</w:t>
       </w:r>
     </w:p>
     <w:p>
@@ -1419,7 +1419,7 @@
               <w:spacing w:after="40" w:line="240" w:lineRule="auto"/>
             </w:pPr>
             <w:r>
-              <w:t>3100</w:t>
+              <w:t>3300</w:t>
             </w:r>
           </w:p>
         </w:tc>
@@ -1432,7 +1432,7 @@
               <w:spacing w:after="40" w:line="240" w:lineRule="auto"/>
             </w:pPr>
             <w:r>
-              <w:t>0.09846</w:t>
+              <w:t>0.09707</w:t>
             </w:r>
           </w:p>
         </w:tc>

</xml_diff>

<commit_message>
docs: record E09-R15 validation at 3500 steps
</commit_message>
<xml_diff>
--- a/docs/reports/02-微调与数据.docx
+++ b/docs/reports/02-微调与数据.docx
@@ -12,7 +12,7 @@
     </w:p>
     <w:p>
       <w:r>
-        <w:t>更新：2026-10-02T08:58:17+08:00。本册按实际实验整理，原始运行记录单独保存。</w:t>
+        <w:t>更新：2026-10-02T09:16:25+08:00。本册按实际实验整理，原始运行记录单独保存。</w:t>
       </w:r>
     </w:p>
     <w:p>
@@ -1419,7 +1419,7 @@
               <w:spacing w:after="40" w:line="240" w:lineRule="auto"/>
             </w:pPr>
             <w:r>
-              <w:t>3300</w:t>
+              <w:t>3500</w:t>
             </w:r>
           </w:p>
         </w:tc>
@@ -1432,7 +1432,7 @@
               <w:spacing w:after="40" w:line="240" w:lineRule="auto"/>
             </w:pPr>
             <w:r>
-              <w:t>0.09707</w:t>
+              <w:t>0.09653</w:t>
             </w:r>
           </w:p>
         </w:tc>

</xml_diff>

<commit_message>
Record E09 seed 2026 training validation
</commit_message>
<xml_diff>
--- a/docs/reports/02-微调与数据.docx
+++ b/docs/reports/02-微调与数据.docx
@@ -12,7 +12,7 @@
     </w:p>
     <w:p>
       <w:r>
-        <w:t>更新：2026-10-02T09:16:25+08:00。本册按实际实验整理，原始运行记录单独保存。</w:t>
+        <w:t>更新：2026-10-02T09:39:26+08:00。本册按实际实验整理，原始运行记录单独保存。</w:t>
       </w:r>
     </w:p>
     <w:p>
@@ -1419,7 +1419,7 @@
               <w:spacing w:after="40" w:line="240" w:lineRule="auto"/>
             </w:pPr>
             <w:r>
-              <w:t>3500</w:t>
+              <w:t>3635</w:t>
             </w:r>
           </w:p>
         </w:tc>
@@ -1432,7 +1432,7 @@
               <w:spacing w:after="40" w:line="240" w:lineRule="auto"/>
             </w:pPr>
             <w:r>
-              <w:t>0.09653</w:t>
+              <w:t>0.09625</w:t>
             </w:r>
           </w:p>
         </w:tc>
@@ -1445,7 +1445,7 @@
               <w:spacing w:after="40" w:line="240" w:lineRule="auto"/>
             </w:pPr>
             <w:r>
-              <w:t>运行中</w:t>
+              <w:t>训练完成，待工具评测</w:t>
             </w:r>
           </w:p>
         </w:tc>
@@ -1575,6 +1575,19 @@
     <w:p>
       <w:r>
         <w:t>这一步要观察两条线：训练 loss 是否继续下降，完整 dev loss 是否也下降。只有两条线和工具结果放在一起，才有依据区分记住训练内容与适应新任务。</w:t>
+      </w:r>
+    </w:p>
+    <w:p>
+      <w:pPr>
+        <w:pStyle w:val="Heading2"/>
+      </w:pPr>
+      <w:r>
+        <w:t>生成评测进行到哪一步？</w:t>
+      </w:r>
+    </w:p>
+    <w:p>
+      <w:r>
+        <w:t>E09-R15 的独立生成评测为 E09-R16，已落盘 448/928 个决策轮。还没有覆盖完整 500 条轨迹，暂时不把当前通过数写成最终成绩。</w:t>
       </w:r>
     </w:p>
     <w:p>

</xml_diff>

<commit_message>
Complete E09 seed 2026 dev evaluation
</commit_message>
<xml_diff>
--- a/docs/reports/02-微调与数据.docx
+++ b/docs/reports/02-微调与数据.docx
@@ -12,7 +12,7 @@
     </w:p>
     <w:p>
       <w:r>
-        <w:t>更新：2026-10-02T09:39:26+08:00。本册按实际实验整理，原始运行记录单独保存。</w:t>
+        <w:t>更新：2026-10-02T09:55:57+08:00。本册按实际实验整理，原始运行记录单独保存。</w:t>
       </w:r>
     </w:p>
     <w:p>
@@ -30,12 +30,12 @@
     </w:p>
     <w:p>
       <w:r>
-        <w:t>最近这轮用了 10,000 条训练轨迹，完整 dev 通过 410/500；调用轮为 492/568，不调用轮为 338/360。loss 与实际工具决策分开看，不能把更容易生成调用当成任务成功率提升。</w:t>
+        <w:t>10,000 条训练轨迹的最佳 dev 结果为 411/500，较固定示例基线多 56 条。三个 10k seed 落在 409—411/500；不调用轮为 334—338/360，低于 5k 的 342/360。规模与 seed 队列已完成，但这些仍是同一份 dev 上的成绩，不能替代独立 test。loss 和工具决策分开看，不能把更容易生成调用当成任务成功率提升。</w:t>
       </w:r>
     </w:p>
     <w:p>
       <w:r>
-        <w:t>训练已解决 LoRA 重复准备和缓存压力问题，失败条件与处理过程保留在正文。规模与 seed 比较仍按既定队列推进；尚未完成的对照和最终 test 保持未完成，不提前选择最终配置。</w:t>
+        <w:t>LoRA 重复准备和验证阶段的显存缓存问题已经找到处理办法，失败条件与经过保留在正文。下一步转向相同数据、rank、训练步数和提示条件下的 BF16 LoRA/QLoRA 对照，再开展 rank、学习率与数据质量实验；最终配置仍不能由 test 选择。</w:t>
       </w:r>
     </w:p>
     <w:p>
@@ -492,7 +492,7 @@
     </w:p>
     <w:p>
       <w:r>
-        <w:t>这轮用了 10,000 条训练轨迹，完整 dev 通过 410/500；原模型加固定示例为 355/500。调用轮相差 +36 条，不调用轮相差 +39 条。先把这两类决策分开，才看得清模型具体改变了什么；其余规模和 seed 仍需继续比较。</w:t>
+        <w:t>这轮用了 10,000 条训练轨迹，完整 dev 通过 411/500，比原模型加固定示例多 56 条。1k、5k、10k 和三个 10k seed 的队列已经跑完；三个 10k seed 分别通过 409、410、411 条，差距很小，但这仍是同一份 dev 上的结果。另一个值得留意的地方是，不调用轮没有随数据量一直变好：5k 是 342/360，三个 10k seed 落在 334—338/360。</w:t>
       </w:r>
     </w:p>
     <w:p>
@@ -1445,7 +1445,7 @@
               <w:spacing w:after="40" w:line="240" w:lineRule="auto"/>
             </w:pPr>
             <w:r>
-              <w:t>训练完成，待工具评测</w:t>
+              <w:t>训练与完整 dev 工具评测结束</w:t>
             </w:r>
           </w:p>
         </w:tc>
@@ -1582,25 +1582,12 @@
         <w:pStyle w:val="Heading2"/>
       </w:pPr>
       <w:r>
-        <w:t>生成评测进行到哪一步？</w:t>
-      </w:r>
-    </w:p>
-    <w:p>
-      <w:r>
-        <w:t>E09-R15 的独立生成评测为 E09-R16，已落盘 448/928 个决策轮。还没有覆盖完整 500 条轨迹，暂时不把当前通过数写成最终成绩。</w:t>
-      </w:r>
-    </w:p>
-    <w:p>
-      <w:pPr>
-        <w:pStyle w:val="Heading2"/>
-      </w:pPr>
-      <w:r>
         <w:t>loss 降下来了，工具调用也改善了吗？</w:t>
       </w:r>
     </w:p>
     <w:p>
       <w:r>
-        <w:t>最近完成的 E09-R13 通过 410/500；调用轮为 492/568，不调用轮为 338/360。是否比原模型好，要在相同条件下逐项比较。</w:t>
+        <w:t>最近完成的 E09-R15 通过 411/500；调用轮为 494/568，不调用轮为 334/360。是否比原模型好，要在相同条件下逐项比较。</w:t>
       </w:r>
     </w:p>
     <w:p>
@@ -2145,6 +2132,89 @@
           </w:p>
         </w:tc>
       </w:tr>
+      <w:tr>
+        <w:trPr>
+          <w:cantSplit/>
+        </w:trPr>
+        <w:tc>
+          <w:tcPr>
+            <w:tcW w:type="dxa" w:w="1606"/>
+          </w:tcPr>
+          <w:p>
+            <w:pPr>
+              <w:spacing w:after="40" w:line="240" w:lineRule="auto"/>
+            </w:pPr>
+            <w:r>
+              <w:t>E09-R15</w:t>
+            </w:r>
+          </w:p>
+        </w:tc>
+        <w:tc>
+          <w:tcPr>
+            <w:tcW w:type="dxa" w:w="1606"/>
+          </w:tcPr>
+          <w:p>
+            <w:pPr>
+              <w:spacing w:after="40" w:line="240" w:lineRule="auto"/>
+            </w:pPr>
+            <w:r>
+              <w:t>10,000 / 2026</w:t>
+            </w:r>
+          </w:p>
+        </w:tc>
+        <w:tc>
+          <w:tcPr>
+            <w:tcW w:type="dxa" w:w="1606"/>
+          </w:tcPr>
+          <w:p>
+            <w:pPr>
+              <w:spacing w:after="40" w:line="240" w:lineRule="auto"/>
+            </w:pPr>
+            <w:r>
+              <w:t>411/500</w:t>
+            </w:r>
+          </w:p>
+        </w:tc>
+        <w:tc>
+          <w:tcPr>
+            <w:tcW w:type="dxa" w:w="1606"/>
+          </w:tcPr>
+          <w:p>
+            <w:pPr>
+              <w:spacing w:after="40" w:line="240" w:lineRule="auto"/>
+            </w:pPr>
+            <w:r>
+              <w:t>494/568</w:t>
+            </w:r>
+          </w:p>
+        </w:tc>
+        <w:tc>
+          <w:tcPr>
+            <w:tcW w:type="dxa" w:w="1606"/>
+          </w:tcPr>
+          <w:p>
+            <w:pPr>
+              <w:spacing w:after="40" w:line="240" w:lineRule="auto"/>
+            </w:pPr>
+            <w:r>
+              <w:t>334/360</w:t>
+            </w:r>
+          </w:p>
+        </w:tc>
+        <w:tc>
+          <w:tcPr>
+            <w:tcW w:type="dxa" w:w="1606"/>
+          </w:tcPr>
+          <w:p>
+            <w:pPr>
+              <w:spacing w:after="40" w:line="240" w:lineRule="auto"/>
+            </w:pPr>
+            <w:r>
+              <w:t>1</w:t>
+            </w:r>
+          </w:p>
+        </w:tc>
+      </w:tr>
     </w:tbl>
     <w:p>
       <w:pPr>
@@ -2197,7 +2267,7 @@
     </w:p>
     <w:p>
       <w:r>
-        <w:t>最近完成的 E09-R13 通过 410/500，与原模型相差 +55 条，即 +11.0 个百分点。调用轮相差 +36 条，不调用轮相差 +39 条。先分别看这两类决策，才能判断模型是否只是更愿意调工具。</w:t>
+        <w:t>最近完成的 E09-R15 通过 411/500，与原模型相差 +56 条，即 +11.2 个百分点。调用轮相差 +38 条，不调用轮相差 +35 条。先分别看这两类决策，才能判断模型是否只是更愿意调工具。</w:t>
       </w:r>
     </w:p>
     <w:p>
@@ -2247,7 +2317,7 @@
     </w:p>
     <w:p>
       <w:r>
-        <w:t>这条 JSON 和参数类型都有效，问题在于 pop 是模型自行补出的。两个例子都来自本轮实际回复。接下来继续原定 5k、10k 比较，观察这种多调用、少询问的倾向是否改变；数据质量和学习率的对照再单独排查，当前不为了让成绩变好而改评分。</w:t>
+        <w:t>这条 JSON 和参数类型都有效，问题在于 pop 是模型自行补出的。两个例子都来自本轮实际回复。回看 5k 与三个 10k seed，整条轨迹通过数从 406/500 变化到 409—411/500，但不调用轮在 10k 时没有超过 5k。模型少猜参数的情况确实出现过，过度调用也没有消失；数据质量和学习率的影响还要分别对照，评分规则没有因这个例子而改变。</w:t>
       </w:r>
     </w:p>
     <w:p>
@@ -2284,7 +2354,7 @@
     </w:p>
     <w:p>
       <w:r>
-        <w:t>标注里的任务内容是小写的“buy groceries”。这次只改了首字母，仍被既定的严格字符串评分判为失败，所以整条轨迹没有通过。这不是缺参数错误，却也不能临时放宽评分把它算对。一个决策改好了，不代表整条轨迹都修好了。这里各轮输入使用标注历史，尚未执行模型自己的连续Agent对话；接着完成原定10k和三个训练seed，再看收益是否稳定。</w:t>
+        <w:t>标注里的任务内容是小写的“buy groceries”。这次只改了首字母，仍被既定的严格字符串评分判为失败，所以整条轨迹没有通过。这不是缺参数错误，却也不能临时放宽评分把它算对。一个决策改好了，不代表整条轨迹都修好了。各轮输入使用标注历史，还没有执行模型自己的连续 Agent 对话。后来完成的三个 10k seed 在整条轨迹上是 409—411/500，但不调用轮只有 334—338/360，和 5k 的 342/360 相比没有继续上升；Agent 连续执行效果留给 Pi 阶段验证。</w:t>
       </w:r>
     </w:p>
     <w:p>

</xml_diff>

<commit_message>
Fix adjacent Word tables and record E10 progress
</commit_message>
<xml_diff>
--- a/docs/reports/02-微调与数据.docx
+++ b/docs/reports/02-微调与数据.docx
@@ -12,7 +12,7 @@
     </w:p>
     <w:p>
       <w:r>
-        <w:t>更新：2026-10-02T09:55:57+08:00。本册按实际实验整理，原始运行记录单独保存。</w:t>
+        <w:t>更新：2026-10-02T10:14:44+08:00。本册按实际实验整理，原始运行记录单独保存。</w:t>
       </w:r>
     </w:p>
     <w:p>
@@ -46,6 +46,19 @@
     <w:p>
       <w:r>
         <w:t>数据质量对照按来源和类别匹配两份 5k 数据，逐条复查也保留了规则误删和漏检。筛选成本、监督量与后续模型表现分开记录，效果不能由“通过筛选”直接推出。</w:t>
+      </w:r>
+    </w:p>
+    <w:p>
+      <w:pPr>
+        <w:pStyle w:val="Heading2"/>
+      </w:pPr>
+      <w:r>
+        <w:t>精度对照</w:t>
+      </w:r>
+    </w:p>
+    <w:p>
+      <w:r>
+        <w:t>BF16 对照正在执行，目前还不能回答质量和成本是否改善。NF4 参考已经完成，BF16 的训练、完整验证与生成评测分别记录。</w:t>
       </w:r>
     </w:p>
     <w:p>
@@ -2514,6 +2527,1060 @@
         <w:pageBreakBefore/>
       </w:pPr>
       <w:r>
+        <w:t>E10：QLoRA 省了多少显存，效果是否变化？</w:t>
+      </w:r>
+    </w:p>
+    <w:p>
+      <w:r>
+        <w:t>BF16 对照正在执行，目前还不能回答质量和成本是否改善。NF4 参考已经完成，BF16 的训练、完整验证与生成评测分别记录。</w:t>
+      </w:r>
+    </w:p>
+    <w:p>
+      <w:pPr>
+        <w:pStyle w:val="Heading2"/>
+      </w:pPr>
+      <w:r>
+        <w:t>怎样让这个比较尽量公平？</w:t>
+      </w:r>
+    </w:p>
+    <w:p>
+      <w:r>
+        <w:t>两组使用相同的 5,000 条轨迹、14,502 个回复单元和 638,598 个监督 token。seed 为 17，rank=16、alpha=32、dropout=0.05；学习率为 1e-4，单卡 batch=1，累积 8 次梯度，训练一个 epoch，共 1,813 次更新。NF4 参考沿用已完成的 E09 运行，没有为了这个对照再训练一遍。</w:t>
+      </w:r>
+    </w:p>
+    <w:p>
+      <w:r>
+        <w:t>主变量是基础权重以 BF16 还是 NF4 存储。量化模型需要 k-bit 准备，普通模型走正常 PEFT 分支；库还可能改变适配器和非量化层的 dtype，所以它是两套实际训练方案的比较，不能把所有差异都归因于四位编码。下面记录实际可训练参数和 dtype。</w:t>
+      </w:r>
+    </w:p>
+    <w:p>
+      <w:pPr>
+        <w:pStyle w:val="CodeBlock"/>
+        <w:shd w:fill="F3F4F6"/>
+      </w:pPr>
+      <w:r>
+        <w:t>options = dict(torch_dtype=torch.bfloat16, device_map={"": 0})</w:t>
+        <w:br/>
+        <w:t>if load_in_4bit:</w:t>
+        <w:br/>
+        <w:t xml:space="preserve">    options["quantization_config"] = BitsAndBytesConfig(</w:t>
+        <w:br/>
+        <w:t xml:space="preserve">        load_in_4bit=True, bnb_4bit_quant_type="nf4",</w:t>
+        <w:br/>
+        <w:t xml:space="preserve">        bnb_4bit_use_double_quant=True,</w:t>
+        <w:br/>
+        <w:t xml:space="preserve">        bnb_4bit_compute_dtype=torch.bfloat16,</w:t>
+        <w:br/>
+        <w:t xml:space="preserve">    )</w:t>
+      </w:r>
+    </w:p>
+    <w:p>
+      <w:r/>
+      <w:r>
+        <w:rPr>
+          <w:rFonts w:ascii="Consolas" w:hAnsi="Consolas"/>
+          <w:sz w:val="20"/>
+        </w:rPr>
+        <w:t>load_in_4bit</w:t>
+      </w:r>
+      <w:r>
+        <w:t xml:space="preserve"> 是存储方式开关；</w:t>
+      </w:r>
+      <w:r>
+        <w:rPr>
+          <w:rFonts w:ascii="Consolas" w:hAnsi="Consolas"/>
+          <w:sz w:val="20"/>
+        </w:rPr>
+        <w:t>options</w:t>
+      </w:r>
+      <w:r>
+        <w:t xml:space="preserve"> 传给同一个官方模型加载入口。无论哪一组，模型都交给 TRL 准备后再添加 LoRA，模板、监督位置和缓存释放方式保持一致。</w:t>
+      </w:r>
+    </w:p>
+    <w:tbl>
+      <w:tblPr>
+        <w:tblStyle w:val="TableGrid"/>
+        <w:tblW w:type="auto" w:w="0"/>
+        <w:tblLook w:firstColumn="1" w:firstRow="1" w:lastColumn="0" w:lastRow="0" w:noHBand="0" w:noVBand="1" w:val="04A0"/>
+      </w:tblPr>
+      <w:tblGrid>
+        <w:gridCol w:w="2409"/>
+        <w:gridCol w:w="2409"/>
+        <w:gridCol w:w="2409"/>
+        <w:gridCol w:w="2409"/>
+      </w:tblGrid>
+      <w:tr>
+        <w:trPr>
+          <w:cantSplit/>
+          <w:tblHeader/>
+        </w:trPr>
+        <w:tc>
+          <w:tcPr>
+            <w:tcW w:type="dxa" w:w="2409"/>
+            <w:shd w:fill="F3F4F6"/>
+          </w:tcPr>
+          <w:p>
+            <w:pPr>
+              <w:spacing w:after="40" w:line="240" w:lineRule="auto"/>
+            </w:pPr>
+            <w:r>
+              <w:rPr>
+                <w:b/>
+              </w:rPr>
+              <w:t>运行 / 存储方式</w:t>
+            </w:r>
+          </w:p>
+        </w:tc>
+        <w:tc>
+          <w:tcPr>
+            <w:tcW w:type="dxa" w:w="2409"/>
+            <w:shd w:fill="F3F4F6"/>
+          </w:tcPr>
+          <w:p>
+            <w:pPr>
+              <w:spacing w:after="40" w:line="240" w:lineRule="auto"/>
+            </w:pPr>
+            <w:r>
+              <w:rPr>
+                <w:b/>
+              </w:rPr>
+              <w:t>可训练参数</w:t>
+            </w:r>
+          </w:p>
+        </w:tc>
+        <w:tc>
+          <w:tcPr>
+            <w:tcW w:type="dxa" w:w="2409"/>
+            <w:shd w:fill="F3F4F6"/>
+          </w:tcPr>
+          <w:p>
+            <w:pPr>
+              <w:spacing w:after="40" w:line="240" w:lineRule="auto"/>
+            </w:pPr>
+            <w:r>
+              <w:rPr>
+                <w:b/>
+              </w:rPr>
+              <w:t>适配器 dtype</w:t>
+            </w:r>
+          </w:p>
+        </w:tc>
+        <w:tc>
+          <w:tcPr>
+            <w:tcW w:type="dxa" w:w="2409"/>
+            <w:shd w:fill="F3F4F6"/>
+          </w:tcPr>
+          <w:p>
+            <w:pPr>
+              <w:spacing w:after="40" w:line="240" w:lineRule="auto"/>
+            </w:pPr>
+            <w:r>
+              <w:rPr>
+                <w:b/>
+              </w:rPr>
+              <w:t>基础层 dtype</w:t>
+            </w:r>
+          </w:p>
+        </w:tc>
+      </w:tr>
+      <w:tr>
+        <w:trPr>
+          <w:cantSplit/>
+        </w:trPr>
+        <w:tc>
+          <w:tcPr>
+            <w:tcW w:type="dxa" w:w="2409"/>
+          </w:tcPr>
+          <w:p>
+            <w:pPr>
+              <w:spacing w:after="40" w:line="240" w:lineRule="auto"/>
+            </w:pPr>
+            <w:r>
+              <w:t>E09-R09 / NF4</w:t>
+            </w:r>
+          </w:p>
+        </w:tc>
+        <w:tc>
+          <w:tcPr>
+            <w:tcW w:type="dxa" w:w="2409"/>
+          </w:tcPr>
+          <w:p>
+            <w:pPr>
+              <w:spacing w:after="40" w:line="240" w:lineRule="auto"/>
+            </w:pPr>
+            <w:r>
+              <w:t>17432576</w:t>
+            </w:r>
+          </w:p>
+        </w:tc>
+        <w:tc>
+          <w:tcPr>
+            <w:tcW w:type="dxa" w:w="2409"/>
+          </w:tcPr>
+          <w:p>
+            <w:pPr>
+              <w:spacing w:after="40" w:line="240" w:lineRule="auto"/>
+            </w:pPr>
+            <w:r>
+              <w:t>torch.float32</w:t>
+            </w:r>
+          </w:p>
+        </w:tc>
+        <w:tc>
+          <w:tcPr>
+            <w:tcW w:type="dxa" w:w="2409"/>
+          </w:tcPr>
+          <w:p>
+            <w:pPr>
+              <w:spacing w:after="40" w:line="240" w:lineRule="auto"/>
+            </w:pPr>
+            <w:r>
+              <w:t>原参考未另记此项</w:t>
+            </w:r>
+          </w:p>
+        </w:tc>
+      </w:tr>
+      <w:tr>
+        <w:trPr>
+          <w:cantSplit/>
+        </w:trPr>
+        <w:tc>
+          <w:tcPr>
+            <w:tcW w:type="dxa" w:w="2409"/>
+          </w:tcPr>
+          <w:p>
+            <w:pPr>
+              <w:spacing w:after="40" w:line="240" w:lineRule="auto"/>
+            </w:pPr>
+            <w:r>
+              <w:t>E10-R01 / BF16</w:t>
+            </w:r>
+          </w:p>
+        </w:tc>
+        <w:tc>
+          <w:tcPr>
+            <w:tcW w:type="dxa" w:w="2409"/>
+          </w:tcPr>
+          <w:p>
+            <w:pPr>
+              <w:spacing w:after="40" w:line="240" w:lineRule="auto"/>
+            </w:pPr>
+            <w:r>
+              <w:t>17432576</w:t>
+            </w:r>
+          </w:p>
+        </w:tc>
+        <w:tc>
+          <w:tcPr>
+            <w:tcW w:type="dxa" w:w="2409"/>
+          </w:tcPr>
+          <w:p>
+            <w:pPr>
+              <w:spacing w:after="40" w:line="240" w:lineRule="auto"/>
+            </w:pPr>
+            <w:r>
+              <w:t>torch.float32</w:t>
+            </w:r>
+          </w:p>
+        </w:tc>
+        <w:tc>
+          <w:tcPr>
+            <w:tcW w:type="dxa" w:w="2409"/>
+          </w:tcPr>
+          <w:p>
+            <w:pPr>
+              <w:spacing w:after="40" w:line="240" w:lineRule="auto"/>
+            </w:pPr>
+            <w:r>
+              <w:t>torch.bfloat16</w:t>
+            </w:r>
+          </w:p>
+        </w:tc>
+      </w:tr>
+    </w:tbl>
+    <w:p>
+      <w:pPr>
+        <w:pStyle w:val="Heading2"/>
+      </w:pPr>
+      <w:r>
+        <w:t>训练省下了哪些资源？</w:t>
+      </w:r>
+    </w:p>
+    <w:p>
+      <w:r>
+        <w:t>显存表来自训练更新时 PyTorch 实际记录的数值；allocated 表示张量占用，reserved 还包含分配器保留的缓存。更新耗时包括该步计算与缓存释放，不含后续完整验证和 Word 整理。失败条件只列已有测量，不把缺失的最终成绩写成零。</w:t>
+      </w:r>
+    </w:p>
+    <w:tbl>
+      <w:tblPr>
+        <w:tblStyle w:val="TableGrid"/>
+        <w:tblW w:type="auto" w:w="0"/>
+        <w:tblLook w:firstColumn="1" w:firstRow="1" w:lastColumn="0" w:lastRow="0" w:noHBand="0" w:noVBand="1" w:val="04A0"/>
+      </w:tblPr>
+      <w:tblGrid>
+        <w:gridCol w:w="1928"/>
+        <w:gridCol w:w="1928"/>
+        <w:gridCol w:w="1928"/>
+        <w:gridCol w:w="1928"/>
+        <w:gridCol w:w="1928"/>
+      </w:tblGrid>
+      <w:tr>
+        <w:trPr>
+          <w:cantSplit/>
+          <w:tblHeader/>
+        </w:trPr>
+        <w:tc>
+          <w:tcPr>
+            <w:tcW w:type="dxa" w:w="1928"/>
+            <w:shd w:fill="F3F4F6"/>
+          </w:tcPr>
+          <w:p>
+            <w:pPr>
+              <w:spacing w:after="40" w:line="240" w:lineRule="auto"/>
+            </w:pPr>
+            <w:r>
+              <w:rPr>
+                <w:b/>
+              </w:rPr>
+              <w:t>运行</w:t>
+            </w:r>
+          </w:p>
+        </w:tc>
+        <w:tc>
+          <w:tcPr>
+            <w:tcW w:type="dxa" w:w="1928"/>
+            <w:shd w:fill="F3F4F6"/>
+          </w:tcPr>
+          <w:p>
+            <w:pPr>
+              <w:spacing w:after="40" w:line="240" w:lineRule="auto"/>
+            </w:pPr>
+            <w:r>
+              <w:rPr>
+                <w:b/>
+              </w:rPr>
+              <w:t>已记录更新</w:t>
+            </w:r>
+          </w:p>
+        </w:tc>
+        <w:tc>
+          <w:tcPr>
+            <w:tcW w:type="dxa" w:w="1928"/>
+            <w:shd w:fill="F3F4F6"/>
+          </w:tcPr>
+          <w:p>
+            <w:pPr>
+              <w:spacing w:after="40" w:line="240" w:lineRule="auto"/>
+            </w:pPr>
+            <w:r>
+              <w:rPr>
+                <w:b/>
+              </w:rPr>
+              <w:t>更新耗时中位数（s）</w:t>
+            </w:r>
+          </w:p>
+        </w:tc>
+        <w:tc>
+          <w:tcPr>
+            <w:tcW w:type="dxa" w:w="1928"/>
+            <w:shd w:fill="F3F4F6"/>
+          </w:tcPr>
+          <w:p>
+            <w:pPr>
+              <w:spacing w:after="40" w:line="240" w:lineRule="auto"/>
+            </w:pPr>
+            <w:r>
+              <w:rPr>
+                <w:b/>
+              </w:rPr>
+              <w:t>最大 allocated / reserved（MiB）</w:t>
+            </w:r>
+          </w:p>
+        </w:tc>
+        <w:tc>
+          <w:tcPr>
+            <w:tcW w:type="dxa" w:w="1928"/>
+            <w:shd w:fill="F3F4F6"/>
+          </w:tcPr>
+          <w:p>
+            <w:pPr>
+              <w:spacing w:after="40" w:line="240" w:lineRule="auto"/>
+            </w:pPr>
+            <w:r>
+              <w:rPr>
+                <w:b/>
+              </w:rPr>
+              <w:t>训练状态</w:t>
+            </w:r>
+          </w:p>
+        </w:tc>
+      </w:tr>
+      <w:tr>
+        <w:trPr>
+          <w:cantSplit/>
+        </w:trPr>
+        <w:tc>
+          <w:tcPr>
+            <w:tcW w:type="dxa" w:w="1928"/>
+          </w:tcPr>
+          <w:p>
+            <w:pPr>
+              <w:spacing w:after="40" w:line="240" w:lineRule="auto"/>
+            </w:pPr>
+            <w:r>
+              <w:t>E09-R09</w:t>
+            </w:r>
+          </w:p>
+        </w:tc>
+        <w:tc>
+          <w:tcPr>
+            <w:tcW w:type="dxa" w:w="1928"/>
+          </w:tcPr>
+          <w:p>
+            <w:pPr>
+              <w:spacing w:after="40" w:line="240" w:lineRule="auto"/>
+            </w:pPr>
+            <w:r>
+              <w:t>1813</w:t>
+            </w:r>
+          </w:p>
+        </w:tc>
+        <w:tc>
+          <w:tcPr>
+            <w:tcW w:type="dxa" w:w="1928"/>
+          </w:tcPr>
+          <w:p>
+            <w:pPr>
+              <w:spacing w:after="40" w:line="240" w:lineRule="auto"/>
+            </w:pPr>
+            <w:r>
+              <w:t>3.01</w:t>
+            </w:r>
+          </w:p>
+        </w:tc>
+        <w:tc>
+          <w:tcPr>
+            <w:tcW w:type="dxa" w:w="1928"/>
+          </w:tcPr>
+          <w:p>
+            <w:pPr>
+              <w:spacing w:after="40" w:line="240" w:lineRule="auto"/>
+            </w:pPr>
+            <w:r>
+              <w:t>7918 / 15472</w:t>
+            </w:r>
+          </w:p>
+        </w:tc>
+        <w:tc>
+          <w:tcPr>
+            <w:tcW w:type="dxa" w:w="1928"/>
+          </w:tcPr>
+          <w:p>
+            <w:pPr>
+              <w:spacing w:after="40" w:line="240" w:lineRule="auto"/>
+            </w:pPr>
+            <w:r>
+              <w:t>一个 epoch 已完成</w:t>
+            </w:r>
+          </w:p>
+        </w:tc>
+      </w:tr>
+      <w:tr>
+        <w:trPr>
+          <w:cantSplit/>
+        </w:trPr>
+        <w:tc>
+          <w:tcPr>
+            <w:tcW w:type="dxa" w:w="1928"/>
+          </w:tcPr>
+          <w:p>
+            <w:pPr>
+              <w:spacing w:after="40" w:line="240" w:lineRule="auto"/>
+            </w:pPr>
+            <w:r>
+              <w:t>E10-R01</w:t>
+            </w:r>
+          </w:p>
+        </w:tc>
+        <w:tc>
+          <w:tcPr>
+            <w:tcW w:type="dxa" w:w="1928"/>
+          </w:tcPr>
+          <w:p>
+            <w:pPr>
+              <w:spacing w:after="40" w:line="240" w:lineRule="auto"/>
+            </w:pPr>
+            <w:r>
+              <w:t>184</w:t>
+            </w:r>
+          </w:p>
+        </w:tc>
+        <w:tc>
+          <w:tcPr>
+            <w:tcW w:type="dxa" w:w="1928"/>
+          </w:tcPr>
+          <w:p>
+            <w:pPr>
+              <w:spacing w:after="40" w:line="240" w:lineRule="auto"/>
+            </w:pPr>
+            <w:r>
+              <w:t>2.50</w:t>
+            </w:r>
+          </w:p>
+        </w:tc>
+        <w:tc>
+          <w:tcPr>
+            <w:tcW w:type="dxa" w:w="1928"/>
+          </w:tcPr>
+          <w:p>
+            <w:pPr>
+              <w:spacing w:after="40" w:line="240" w:lineRule="auto"/>
+            </w:pPr>
+            <w:r>
+              <w:t>9427 / 12364</w:t>
+            </w:r>
+          </w:p>
+        </w:tc>
+        <w:tc>
+          <w:tcPr>
+            <w:tcW w:type="dxa" w:w="1928"/>
+          </w:tcPr>
+          <w:p>
+            <w:pPr>
+              <w:spacing w:after="40" w:line="240" w:lineRule="auto"/>
+            </w:pPr>
+            <w:r>
+              <w:t>进行中</w:t>
+            </w:r>
+          </w:p>
+        </w:tc>
+      </w:tr>
+    </w:tbl>
+    <w:p/>
+    <w:tbl>
+      <w:tblPr>
+        <w:tblStyle w:val="TableGrid"/>
+        <w:tblW w:type="auto" w:w="0"/>
+        <w:tblLook w:firstColumn="1" w:firstRow="1" w:lastColumn="0" w:lastRow="0" w:noHBand="0" w:noVBand="1" w:val="04A0"/>
+      </w:tblPr>
+      <w:tblGrid>
+        <w:gridCol w:w="2409"/>
+        <w:gridCol w:w="2409"/>
+        <w:gridCol w:w="2409"/>
+        <w:gridCol w:w="2409"/>
+      </w:tblGrid>
+      <w:tr>
+        <w:trPr>
+          <w:cantSplit/>
+          <w:tblHeader/>
+        </w:trPr>
+        <w:tc>
+          <w:tcPr>
+            <w:tcW w:type="dxa" w:w="2409"/>
+            <w:shd w:fill="F3F4F6"/>
+          </w:tcPr>
+          <w:p>
+            <w:pPr>
+              <w:spacing w:after="40" w:line="240" w:lineRule="auto"/>
+            </w:pPr>
+            <w:r>
+              <w:rPr>
+                <w:b/>
+              </w:rPr>
+              <w:t>运行</w:t>
+            </w:r>
+          </w:p>
+        </w:tc>
+        <w:tc>
+          <w:tcPr>
+            <w:tcW w:type="dxa" w:w="2409"/>
+            <w:shd w:fill="F3F4F6"/>
+          </w:tcPr>
+          <w:p>
+            <w:pPr>
+              <w:spacing w:after="40" w:line="240" w:lineRule="auto"/>
+            </w:pPr>
+            <w:r>
+              <w:rPr>
+                <w:b/>
+              </w:rPr>
+              <w:t>训练循环耗时（s）</w:t>
+            </w:r>
+          </w:p>
+        </w:tc>
+        <w:tc>
+          <w:tcPr>
+            <w:tcW w:type="dxa" w:w="2409"/>
+            <w:shd w:fill="F3F4F6"/>
+          </w:tcPr>
+          <w:p>
+            <w:pPr>
+              <w:spacing w:after="40" w:line="240" w:lineRule="auto"/>
+            </w:pPr>
+            <w:r>
+              <w:rPr>
+                <w:b/>
+              </w:rPr>
+              <w:t>监督 tokens/s</w:t>
+            </w:r>
+          </w:p>
+        </w:tc>
+        <w:tc>
+          <w:tcPr>
+            <w:tcW w:type="dxa" w:w="2409"/>
+            <w:shd w:fill="F3F4F6"/>
+          </w:tcPr>
+          <w:p>
+            <w:pPr>
+              <w:spacing w:after="40" w:line="240" w:lineRule="auto"/>
+            </w:pPr>
+            <w:r>
+              <w:rPr>
+                <w:b/>
+              </w:rPr>
+              <w:t>最低完整 dev loss</w:t>
+            </w:r>
+          </w:p>
+        </w:tc>
+      </w:tr>
+      <w:tr>
+        <w:trPr>
+          <w:cantSplit/>
+        </w:trPr>
+        <w:tc>
+          <w:tcPr>
+            <w:tcW w:type="dxa" w:w="2409"/>
+          </w:tcPr>
+          <w:p>
+            <w:pPr>
+              <w:spacing w:after="40" w:line="240" w:lineRule="auto"/>
+            </w:pPr>
+            <w:r>
+              <w:t>E09-R09</w:t>
+            </w:r>
+          </w:p>
+        </w:tc>
+        <w:tc>
+          <w:tcPr>
+            <w:tcW w:type="dxa" w:w="2409"/>
+          </w:tcPr>
+          <w:p>
+            <w:pPr>
+              <w:spacing w:after="40" w:line="240" w:lineRule="auto"/>
+            </w:pPr>
+            <w:r>
+              <w:t>10272</w:t>
+            </w:r>
+          </w:p>
+        </w:tc>
+        <w:tc>
+          <w:tcPr>
+            <w:tcW w:type="dxa" w:w="2409"/>
+          </w:tcPr>
+          <w:p>
+            <w:pPr>
+              <w:spacing w:after="40" w:line="240" w:lineRule="auto"/>
+            </w:pPr>
+            <w:r>
+              <w:t>62.17</w:t>
+            </w:r>
+          </w:p>
+        </w:tc>
+        <w:tc>
+          <w:tcPr>
+            <w:tcW w:type="dxa" w:w="2409"/>
+          </w:tcPr>
+          <w:p>
+            <w:pPr>
+              <w:spacing w:after="40" w:line="240" w:lineRule="auto"/>
+            </w:pPr>
+            <w:r>
+              <w:t>0.10856</w:t>
+            </w:r>
+          </w:p>
+        </w:tc>
+      </w:tr>
+      <w:tr>
+        <w:trPr>
+          <w:cantSplit/>
+        </w:trPr>
+        <w:tc>
+          <w:tcPr>
+            <w:tcW w:type="dxa" w:w="2409"/>
+          </w:tcPr>
+          <w:p>
+            <w:pPr>
+              <w:spacing w:after="40" w:line="240" w:lineRule="auto"/>
+            </w:pPr>
+            <w:r>
+              <w:t>E10-R01</w:t>
+            </w:r>
+          </w:p>
+        </w:tc>
+        <w:tc>
+          <w:tcPr>
+            <w:tcW w:type="dxa" w:w="2409"/>
+          </w:tcPr>
+          <w:p>
+            <w:pPr>
+              <w:spacing w:after="40" w:line="240" w:lineRule="auto"/>
+            </w:pPr>
+            <w:r>
+              <w:t>未完成</w:t>
+            </w:r>
+          </w:p>
+        </w:tc>
+        <w:tc>
+          <w:tcPr>
+            <w:tcW w:type="dxa" w:w="2409"/>
+          </w:tcPr>
+          <w:p>
+            <w:pPr>
+              <w:spacing w:after="40" w:line="240" w:lineRule="auto"/>
+            </w:pPr>
+            <w:r>
+              <w:t>未完成</w:t>
+            </w:r>
+          </w:p>
+        </w:tc>
+        <w:tc>
+          <w:tcPr>
+            <w:tcW w:type="dxa" w:w="2409"/>
+          </w:tcPr>
+          <w:p>
+            <w:pPr>
+              <w:spacing w:after="40" w:line="240" w:lineRule="auto"/>
+            </w:pPr>
+            <w:r>
+              <w:t>未完成</w:t>
+            </w:r>
+          </w:p>
+        </w:tc>
+      </w:tr>
+    </w:tbl>
+    <w:p>
+      <w:r>
+        <w:t>训练循环耗时使用 Trainer 的实际计时，包含循环内完整验证和报告回调，不含模型加载及训练前验证；监督吞吐按本轮真实目标 token 总数除以这段耗时计算，不能与纯推理 tokens/s 混用。</w:t>
+      </w:r>
+    </w:p>
+    <w:p>
+      <w:pPr>
+        <w:keepNext/>
+        <w:spacing w:before="120"/>
+        <w:jc w:val="center"/>
+      </w:pPr>
+      <w:r>
+        <w:drawing>
+          <wp:inline xmlns:a="http://schemas.openxmlformats.org/drawingml/2006/main" xmlns:pic="http://schemas.openxmlformats.org/drawingml/2006/picture">
+            <wp:extent cx="5400000" cy="2953125"/>
+            <wp:docPr id="5" name="Picture 5"/>
+            <wp:cNvGraphicFramePr>
+              <a:graphicFrameLocks noChangeAspect="1"/>
+            </wp:cNvGraphicFramePr>
+            <a:graphic>
+              <a:graphicData uri="http://schemas.openxmlformats.org/drawingml/2006/picture">
+                <pic:pic>
+                  <pic:nvPicPr>
+                    <pic:cNvPr id="0" name="E10-R01-loss.png"/>
+                    <pic:cNvPicPr/>
+                  </pic:nvPicPr>
+                  <pic:blipFill>
+                    <a:blip r:embed="rId15"/>
+                    <a:stretch>
+                      <a:fillRect/>
+                    </a:stretch>
+                  </pic:blipFill>
+                  <pic:spPr>
+                    <a:xfrm>
+                      <a:off x="0" y="0"/>
+                      <a:ext cx="5400000" cy="2953125"/>
+                    </a:xfrm>
+                    <a:prstGeom prst="rect"/>
+                  </pic:spPr>
+                </pic:pic>
+              </a:graphicData>
+            </a:graphic>
+          </wp:inline>
+        </w:drawing>
+      </w:r>
+    </w:p>
+    <w:p>
+      <w:pPr>
+        <w:jc w:val="center"/>
+      </w:pPr>
+      <w:r>
+        <w:t>图 E10-1：E10-R01 的真实 loss；训练 184 点，完整 dev 2 点，未平滑。</w:t>
+      </w:r>
+    </w:p>
+    <w:p>
+      <w:r>
+        <w:t>训练和验证 loss 分别保留原始测量。验证覆盖全部 500 条轨迹的 1,484 个回复，按 66,664 个监督 token 加权；缺失的验证点不插值补齐。</w:t>
+      </w:r>
+    </w:p>
+    <w:p>
+      <w:pPr>
+        <w:pStyle w:val="Heading2"/>
+      </w:pPr>
+      <w:r>
+        <w:t>训练精度不同，生成评测也一起改吗？</w:t>
+      </w:r>
+    </w:p>
+    <w:p>
+      <w:r>
+        <w:t>这一步的生成后端保持一致：两组适配器都加载到相同 NF4 学生，用固定提示、标注历史和贪心解码评测。这样比较的是训练后适配器的变化；BF16 推理本身的质量和速度另做部署实验。</w:t>
+      </w:r>
+    </w:p>
+    <w:tbl>
+      <w:tblPr>
+        <w:tblStyle w:val="TableGrid"/>
+        <w:tblW w:type="auto" w:w="0"/>
+        <w:tblLook w:firstColumn="1" w:firstRow="1" w:lastColumn="0" w:lastRow="0" w:noHBand="0" w:noVBand="1" w:val="04A0"/>
+      </w:tblPr>
+      <w:tblGrid>
+        <w:gridCol w:w="1928"/>
+        <w:gridCol w:w="1928"/>
+        <w:gridCol w:w="1928"/>
+        <w:gridCol w:w="1928"/>
+        <w:gridCol w:w="1928"/>
+      </w:tblGrid>
+      <w:tr>
+        <w:trPr>
+          <w:cantSplit/>
+          <w:tblHeader/>
+        </w:trPr>
+        <w:tc>
+          <w:tcPr>
+            <w:tcW w:type="dxa" w:w="1928"/>
+            <w:shd w:fill="F3F4F6"/>
+          </w:tcPr>
+          <w:p>
+            <w:pPr>
+              <w:spacing w:after="40" w:line="240" w:lineRule="auto"/>
+            </w:pPr>
+            <w:r>
+              <w:rPr>
+                <w:b/>
+              </w:rPr>
+              <w:t>训练运行</w:t>
+            </w:r>
+          </w:p>
+        </w:tc>
+        <w:tc>
+          <w:tcPr>
+            <w:tcW w:type="dxa" w:w="1928"/>
+            <w:shd w:fill="F3F4F6"/>
+          </w:tcPr>
+          <w:p>
+            <w:pPr>
+              <w:spacing w:after="40" w:line="240" w:lineRule="auto"/>
+            </w:pPr>
+            <w:r>
+              <w:rPr>
+                <w:b/>
+              </w:rPr>
+              <w:t>完整轨迹通过</w:t>
+            </w:r>
+          </w:p>
+        </w:tc>
+        <w:tc>
+          <w:tcPr>
+            <w:tcW w:type="dxa" w:w="1928"/>
+            <w:shd w:fill="F3F4F6"/>
+          </w:tcPr>
+          <w:p>
+            <w:pPr>
+              <w:spacing w:after="40" w:line="240" w:lineRule="auto"/>
+            </w:pPr>
+            <w:r>
+              <w:rPr>
+                <w:b/>
+              </w:rPr>
+              <w:t>调用轮通过</w:t>
+            </w:r>
+          </w:p>
+        </w:tc>
+        <w:tc>
+          <w:tcPr>
+            <w:tcW w:type="dxa" w:w="1928"/>
+            <w:shd w:fill="F3F4F6"/>
+          </w:tcPr>
+          <w:p>
+            <w:pPr>
+              <w:spacing w:after="40" w:line="240" w:lineRule="auto"/>
+            </w:pPr>
+            <w:r>
+              <w:rPr>
+                <w:b/>
+              </w:rPr>
+              <w:t>不调用轮通过</w:t>
+            </w:r>
+          </w:p>
+        </w:tc>
+        <w:tc>
+          <w:tcPr>
+            <w:tcW w:type="dxa" w:w="1928"/>
+            <w:shd w:fill="F3F4F6"/>
+          </w:tcPr>
+          <w:p>
+            <w:pPr>
+              <w:spacing w:after="40" w:line="240" w:lineRule="auto"/>
+            </w:pPr>
+            <w:r>
+              <w:rPr>
+                <w:b/>
+              </w:rPr>
+              <w:t>截断</w:t>
+            </w:r>
+          </w:p>
+        </w:tc>
+      </w:tr>
+      <w:tr>
+        <w:trPr>
+          <w:cantSplit/>
+        </w:trPr>
+        <w:tc>
+          <w:tcPr>
+            <w:tcW w:type="dxa" w:w="1928"/>
+          </w:tcPr>
+          <w:p>
+            <w:pPr>
+              <w:spacing w:after="40" w:line="240" w:lineRule="auto"/>
+            </w:pPr>
+            <w:r>
+              <w:t>E09-R09</w:t>
+            </w:r>
+          </w:p>
+        </w:tc>
+        <w:tc>
+          <w:tcPr>
+            <w:tcW w:type="dxa" w:w="1928"/>
+          </w:tcPr>
+          <w:p>
+            <w:pPr>
+              <w:spacing w:after="40" w:line="240" w:lineRule="auto"/>
+            </w:pPr>
+            <w:r>
+              <w:t>406/500</w:t>
+            </w:r>
+          </w:p>
+        </w:tc>
+        <w:tc>
+          <w:tcPr>
+            <w:tcW w:type="dxa" w:w="1928"/>
+          </w:tcPr>
+          <w:p>
+            <w:pPr>
+              <w:spacing w:after="40" w:line="240" w:lineRule="auto"/>
+            </w:pPr>
+            <w:r>
+              <w:t>482/568</w:t>
+            </w:r>
+          </w:p>
+        </w:tc>
+        <w:tc>
+          <w:tcPr>
+            <w:tcW w:type="dxa" w:w="1928"/>
+          </w:tcPr>
+          <w:p>
+            <w:pPr>
+              <w:spacing w:after="40" w:line="240" w:lineRule="auto"/>
+            </w:pPr>
+            <w:r>
+              <w:t>342/360</w:t>
+            </w:r>
+          </w:p>
+        </w:tc>
+        <w:tc>
+          <w:tcPr>
+            <w:tcW w:type="dxa" w:w="1928"/>
+          </w:tcPr>
+          <w:p>
+            <w:pPr>
+              <w:spacing w:after="40" w:line="240" w:lineRule="auto"/>
+            </w:pPr>
+            <w:r>
+              <w:t>1</w:t>
+            </w:r>
+          </w:p>
+        </w:tc>
+      </w:tr>
+      <w:tr>
+        <w:trPr>
+          <w:cantSplit/>
+        </w:trPr>
+        <w:tc>
+          <w:tcPr>
+            <w:tcW w:type="dxa" w:w="1928"/>
+          </w:tcPr>
+          <w:p>
+            <w:pPr>
+              <w:spacing w:after="40" w:line="240" w:lineRule="auto"/>
+            </w:pPr>
+            <w:r>
+              <w:t>E10-R01</w:t>
+            </w:r>
+          </w:p>
+        </w:tc>
+        <w:tc>
+          <w:tcPr>
+            <w:tcW w:type="dxa" w:w="1928"/>
+          </w:tcPr>
+          <w:p>
+            <w:pPr>
+              <w:spacing w:after="40" w:line="240" w:lineRule="auto"/>
+            </w:pPr>
+            <w:r>
+              <w:t>未完成</w:t>
+            </w:r>
+          </w:p>
+        </w:tc>
+        <w:tc>
+          <w:tcPr>
+            <w:tcW w:type="dxa" w:w="1928"/>
+          </w:tcPr>
+          <w:p>
+            <w:pPr>
+              <w:spacing w:after="40" w:line="240" w:lineRule="auto"/>
+            </w:pPr>
+            <w:r>
+              <w:t>未完成</w:t>
+            </w:r>
+          </w:p>
+        </w:tc>
+        <w:tc>
+          <w:tcPr>
+            <w:tcW w:type="dxa" w:w="1928"/>
+          </w:tcPr>
+          <w:p>
+            <w:pPr>
+              <w:spacing w:after="40" w:line="240" w:lineRule="auto"/>
+            </w:pPr>
+            <w:r>
+              <w:t>未完成</w:t>
+            </w:r>
+          </w:p>
+        </w:tc>
+        <w:tc>
+          <w:tcPr>
+            <w:tcW w:type="dxa" w:w="1928"/>
+          </w:tcPr>
+          <w:p>
+            <w:pPr>
+              <w:spacing w:after="40" w:line="240" w:lineRule="auto"/>
+            </w:pPr>
+            <w:r>
+              <w:t>未完成</w:t>
+            </w:r>
+          </w:p>
+        </w:tc>
+      </w:tr>
+    </w:tbl>
+    <w:p>
+      <w:pPr>
+        <w:pStyle w:val="Heading1"/>
+        <w:pageBreakBefore/>
+      </w:pPr>
+      <w:r>
         <w:t>E11：rank 翻倍，能学得更好吗？</w:t>
       </w:r>
     </w:p>
@@ -3464,7 +4531,7 @@
         <w:drawing>
           <wp:inline xmlns:a="http://schemas.openxmlformats.org/drawingml/2006/main" xmlns:pic="http://schemas.openxmlformats.org/drawingml/2006/picture">
             <wp:extent cx="5400000" cy="2784375"/>
-            <wp:docPr id="5" name="Picture 5"/>
+            <wp:docPr id="6" name="Picture 6"/>
             <wp:cNvGraphicFramePr>
               <a:graphicFrameLocks noChangeAspect="1"/>
             </wp:cNvGraphicFramePr>
@@ -3476,7 +4543,7 @@
                     <pic:cNvPicPr/>
                   </pic:nvPicPr>
                   <pic:blipFill>
-                    <a:blip r:embed="rId15"/>
+                    <a:blip r:embed="rId16"/>
                     <a:stretch>
                       <a:fillRect/>
                     </a:stretch>
@@ -4307,6 +5374,37 @@
               <w:spacing w:after="40" w:line="240" w:lineRule="auto"/>
             </w:pPr>
             <w:r>
+              <w:t>精度对照</w:t>
+            </w:r>
+          </w:p>
+        </w:tc>
+        <w:tc>
+          <w:tcPr>
+            <w:tcW w:type="dxa" w:w="7200"/>
+          </w:tcPr>
+          <w:p>
+            <w:pPr>
+              <w:spacing w:after="40" w:line="240" w:lineRule="auto"/>
+            </w:pPr>
+            <w:r>
+              <w:t>experiments/E10/notes.md；experiments/E10/E10-R01-metrics.csv；experiments/E10/figures/E10-R01-loss.png；configs/sft-bf16.json</w:t>
+            </w:r>
+          </w:p>
+        </w:tc>
+      </w:tr>
+      <w:tr>
+        <w:trPr>
+          <w:cantSplit/>
+        </w:trPr>
+        <w:tc>
+          <w:tcPr>
+            <w:tcW w:type="dxa" w:w="2381"/>
+          </w:tcPr>
+          <w:p>
+            <w:pPr>
+              <w:spacing w:after="40" w:line="240" w:lineRule="auto"/>
+            </w:pPr>
+            <w:r>
               <w:t>后续训练与生成结果</w:t>
             </w:r>
           </w:p>

</xml_diff>

<commit_message>
Complete E10 BF16 comparison and records
</commit_message>
<xml_diff>
--- a/docs/reports/02-微调与数据.docx
+++ b/docs/reports/02-微调与数据.docx
@@ -12,7 +12,7 @@
     </w:p>
     <w:p>
       <w:r>
-        <w:t>更新：2026-10-02T10:14:44+08:00。本册按实际实验整理，原始运行记录单独保存。</w:t>
+        <w:t>更新：2026-10-02T13:21:56+08:00。本册按实际实验整理，原始运行记录单独保存。</w:t>
       </w:r>
     </w:p>
     <w:p>
@@ -58,7 +58,7 @@
     </w:p>
     <w:p>
       <w:r>
-        <w:t>BF16 对照正在执行，目前还不能回答质量和成本是否改善。NF4 参考已经完成，BF16 的训练、完整验证与生成评测分别记录。</w:t>
+        <w:t>两组已完成相同完整 dev：NF4 训练通过 406/500，BF16 训练通过 403/500，相差 -3 条。先看训练成本和两类决策，再解释精度的影响。</w:t>
       </w:r>
     </w:p>
     <w:p>
@@ -2532,7 +2532,7 @@
     </w:p>
     <w:p>
       <w:r>
-        <w:t>BF16 对照正在执行，目前还不能回答质量和成本是否改善。NF4 参考已经完成，BF16 的训练、完整验证与生成评测分别记录。</w:t>
+        <w:t>两组已完成相同完整 dev：NF4 训练通过 406/500，BF16 训练通过 403/500，相差 -3 条。先看训练成本和两类决策，再解释精度的影响。</w:t>
       </w:r>
     </w:p>
     <w:p>
@@ -3011,7 +3011,7 @@
               <w:spacing w:after="40" w:line="240" w:lineRule="auto"/>
             </w:pPr>
             <w:r>
-              <w:t>184</w:t>
+              <w:t>1813</w:t>
             </w:r>
           </w:p>
         </w:tc>
@@ -3024,7 +3024,7 @@
               <w:spacing w:after="40" w:line="240" w:lineRule="auto"/>
             </w:pPr>
             <w:r>
-              <w:t>2.50</w:t>
+              <w:t>2.52</w:t>
             </w:r>
           </w:p>
         </w:tc>
@@ -3037,7 +3037,7 @@
               <w:spacing w:after="40" w:line="240" w:lineRule="auto"/>
             </w:pPr>
             <w:r>
-              <w:t>9427 / 12364</w:t>
+              <w:t>9698 / 17048</w:t>
             </w:r>
           </w:p>
         </w:tc>
@@ -3050,7 +3050,7 @@
               <w:spacing w:after="40" w:line="240" w:lineRule="auto"/>
             </w:pPr>
             <w:r>
-              <w:t>进行中</w:t>
+              <w:t>一个 epoch 已完成</w:t>
             </w:r>
           </w:p>
         </w:tc>
@@ -3226,7 +3226,7 @@
               <w:spacing w:after="40" w:line="240" w:lineRule="auto"/>
             </w:pPr>
             <w:r>
-              <w:t>未完成</w:t>
+              <w:t>8725</w:t>
             </w:r>
           </w:p>
         </w:tc>
@@ -3239,7 +3239,7 @@
               <w:spacing w:after="40" w:line="240" w:lineRule="auto"/>
             </w:pPr>
             <w:r>
-              <w:t>未完成</w:t>
+              <w:t>73.19</w:t>
             </w:r>
           </w:p>
         </w:tc>
@@ -3252,7 +3252,7 @@
               <w:spacing w:after="40" w:line="240" w:lineRule="auto"/>
             </w:pPr>
             <w:r>
-              <w:t>未完成</w:t>
+              <w:t>0.10641</w:t>
             </w:r>
           </w:p>
         </w:tc>
@@ -3309,7 +3309,7 @@
         <w:jc w:val="center"/>
       </w:pPr>
       <w:r>
-        <w:t>图 E10-1：E10-R01 的真实 loss；训练 184 点，完整 dev 2 点，未平滑。</w:t>
+        <w:t>图 E10-1：E10-R01 的真实 loss；训练 1813 点，完整 dev 20 点，未平滑。</w:t>
       </w:r>
     </w:p>
     <w:p>
@@ -3530,7 +3530,7 @@
               <w:spacing w:after="40" w:line="240" w:lineRule="auto"/>
             </w:pPr>
             <w:r>
-              <w:t>未完成</w:t>
+              <w:t>403/500</w:t>
             </w:r>
           </w:p>
         </w:tc>
@@ -3543,7 +3543,7 @@
               <w:spacing w:after="40" w:line="240" w:lineRule="auto"/>
             </w:pPr>
             <w:r>
-              <w:t>未完成</w:t>
+              <w:t>468/568</w:t>
             </w:r>
           </w:p>
         </w:tc>
@@ -3556,7 +3556,7 @@
               <w:spacing w:after="40" w:line="240" w:lineRule="auto"/>
             </w:pPr>
             <w:r>
-              <w:t>未完成</w:t>
+              <w:t>349/360</w:t>
             </w:r>
           </w:p>
         </w:tc>
@@ -3569,7 +3569,7 @@
               <w:spacing w:after="40" w:line="240" w:lineRule="auto"/>
             </w:pPr>
             <w:r>
-              <w:t>未完成</w:t>
+              <w:t>0</w:t>
             </w:r>
           </w:p>
         </w:tc>

</xml_diff>

<commit_message>
Record E11 Python environment launch failure
</commit_message>
<xml_diff>
--- a/docs/reports/02-微调与数据.docx
+++ b/docs/reports/02-微调与数据.docx
@@ -12,7 +12,7 @@
     </w:p>
     <w:p>
       <w:r>
-        <w:t>更新：2026-10-02T13:21:56+08:00。本册按实际实验整理，原始运行记录单独保存。</w:t>
+        <w:t>更新：2026-10-02T13:30:27+08:00。本册按实际实验整理，原始运行记录单独保存。</w:t>
       </w:r>
     </w:p>
     <w:p>
@@ -3899,17 +3899,70 @@
         <w:pStyle w:val="Heading2"/>
       </w:pPr>
       <w:r>
+        <w:t>第一次启动时，先把解释器路径纠正了</w:t>
+      </w:r>
+    </w:p>
+    <w:p>
+      <w:r>
+        <w:t xml:space="preserve">第一次启动队列时，我从系统默认 Python 进入了 </w:t>
+      </w:r>
+      <w:r>
+        <w:rPr>
+          <w:rFonts w:ascii="Consolas" w:hAnsi="Consolas"/>
+          <w:sz w:val="20"/>
+        </w:rPr>
+        <w:t>scale.py</w:t>
+      </w:r>
+      <w:r>
+        <w:t xml:space="preserve">。它不在项目锁定的训练环境里，子进程导入数据集库时便报 </w:t>
+      </w:r>
+      <w:r>
+        <w:rPr>
+          <w:rFonts w:ascii="Consolas" w:hAnsi="Consolas"/>
+          <w:sz w:val="20"/>
+        </w:rPr>
+        <w:t>ModuleNotFoundError: No module named 'datasets'</w:t>
+      </w:r>
+      <w:r>
+        <w:t>。这次停在训练脚本导入阶段，没有创建 E11 训练运行、没有加载模型，也没有占用 GPU；它是启动环境选错，不是 rank 条件跑坏了。</w:t>
+      </w:r>
+    </w:p>
+    <w:p>
+      <w:r>
+        <w:t xml:space="preserve">回看 E10 的训练配置，实际使用的是项目内锁定的 Python 环境。我用这个解释器确认 </w:t>
+      </w:r>
+      <w:r>
+        <w:rPr>
+          <w:rFonts w:ascii="Consolas" w:hAnsi="Consolas"/>
+          <w:sz w:val="20"/>
+        </w:rPr>
+        <w:t>datasets==4.0.0</w:t>
+      </w:r>
+      <w:r>
+        <w:t>、</w:t>
+      </w:r>
+      <w:r>
+        <w:rPr>
+          <w:rFonts w:ascii="Consolas" w:hAnsi="Consolas"/>
+          <w:sz w:val="20"/>
+        </w:rPr>
+        <w:t>torch==2.8.0+cu128</w:t>
+      </w:r>
+      <w:r>
+        <w:t xml:space="preserve"> 可导入，并且 CUDA 可用。下一步沿用原来的数据、模型和 rank 配置重新启动队列，不改训练参数；第一次失败也留在记录里。</w:t>
+      </w:r>
+    </w:p>
+    <w:p>
+      <w:pPr>
+        <w:pStyle w:val="Heading2"/>
+      </w:pPr>
+      <w:r>
         <w:t>目前哪些条件已经实际运行？</w:t>
       </w:r>
     </w:p>
     <w:p>
       <w:r>
-        <w:t>E11 尚未开始 GPU 训练。队列入口在参考训练或完整 dev 工具评测缺失时会停止；参考条件的训练过程保留在 E09 章节。已有 E09 进程继续运行，没有启动第二个 GPU 任务。</w:t>
-      </w:r>
-    </w:p>
-    <w:p>
-      <w:r>
-        <w:t>选择配置前还要看失败条件、实际参数 dtype、显存和耗时。准备检查只确认入口与计算条件，表现比较等正式结果到齐后再归纳。</w:t>
+        <w:t>E11 的正式 rank 训练仍未开始。5k、seed 17、rank 8/16/32、学习率 1e-4 的比较条件已经固定；rank 16 复用 E09 的同条件训练和完整 dev 工具评测。接下来从 rank 8 开始按队列顺序训练，每组完成 500 条 dev 后再进入下一组。</w:t>
       </w:r>
     </w:p>
     <w:p>
@@ -5219,6 +5272,37 @@
               <w:spacing w:after="40" w:line="240" w:lineRule="auto"/>
             </w:pPr>
             <w:r>
+              <w:t>E11 启动环境排错</w:t>
+            </w:r>
+          </w:p>
+        </w:tc>
+        <w:tc>
+          <w:tcPr>
+            <w:tcW w:type="dxa" w:w="7200"/>
+          </w:tcPr>
+          <w:p>
+            <w:pPr>
+              <w:spacing w:after="40" w:line="240" w:lineRule="auto"/>
+            </w:pPr>
+            <w:r>
+              <w:t>.local/archive/E11-launch-failure-2026-10-02.json；.local/logs/scale-5000-17-train-1790918774639450600.log</w:t>
+            </w:r>
+          </w:p>
+        </w:tc>
+      </w:tr>
+      <w:tr>
+        <w:trPr>
+          <w:cantSplit/>
+        </w:trPr>
+        <w:tc>
+          <w:tcPr>
+            <w:tcW w:type="dxa" w:w="2381"/>
+          </w:tcPr>
+          <w:p>
+            <w:pPr>
+              <w:spacing w:after="40" w:line="240" w:lineRule="auto"/>
+            </w:pPr>
+            <w:r>
               <w:t>等量数据筛选与复查</w:t>
             </w:r>
           </w:p>

</xml_diff>

<commit_message>
Record E11 rank 8 run startup
</commit_message>
<xml_diff>
--- a/docs/reports/02-微调与数据.docx
+++ b/docs/reports/02-微调与数据.docx
@@ -12,7 +12,7 @@
     </w:p>
     <w:p>
       <w:r>
-        <w:t>更新：2026-10-02T13:30:27+08:00。本册按实际实验整理，原始运行记录单独保存。</w:t>
+        <w:t>更新：2026-10-02T13:36:03+08:00。本册按实际实验整理，原始运行记录单独保存。</w:t>
       </w:r>
     </w:p>
     <w:p>
@@ -3586,7 +3586,7 @@
     </w:p>
     <w:p>
       <w:r>
-        <w:t>rank 对照还没有开始正式训练。目前核验的是固定配置和参数量，不能据此判断 rank 越大越好。</w:t>
+        <w:t>E11-R01 已经进入 rank 8 条件，正按相同数据和预算往前跑。现在只有加载与起始验证信息，完整训练和 dev 工具结果尚未出来，暂时不能判断 rank 越大越好。</w:t>
       </w:r>
     </w:p>
     <w:p>
@@ -3962,7 +3962,12 @@
     </w:p>
     <w:p>
       <w:r>
-        <w:t>E11 的正式 rank 训练仍未开始。5k、seed 17、rank 8/16/32、学习率 1e-4 的比较条件已经固定；rank 16 复用 E09 的同条件训练和完整 dev 工具评测。接下来从 rank 8 开始按队列顺序训练，每组完成 500 条 dev 后再进入下一组。</w:t>
+        <w:t>第一次初始化后，训练参数检查到 8,716,288 个可训练参数、392 个 LoRA 张量，基础权重处于 NF4 加 BF16 计算条件，适配器 dtype 为 FP32。R01 正在跑起始 dev loss；截至 13:35 的进度记录，已处理 600/1,484 个回复单元，用时 124.0 秒，reserved 1,754 MiB，还没有 optimizer step。</w:t>
+      </w:r>
+    </w:p>
+    <w:p>
+      <w:r>
+        <w:t>本轮的 rank 8、5k、seed 17 和学习率 1e-4 均已落到运行配置。接下来等待整轮训练与 500 条 dev 工具评测结束，再按队列进入 rank 32；rank 16 继续复用 E09-R09/E09-R10。这个启动过程中的 Python 解释器错误没有混进模型成绩。</w:t>
       </w:r>
     </w:p>
     <w:p>
@@ -5303,6 +5308,37 @@
               <w:spacing w:after="40" w:line="240" w:lineRule="auto"/>
             </w:pPr>
             <w:r>
+              <w:t>E11 rank 8 当前运行</w:t>
+            </w:r>
+          </w:p>
+        </w:tc>
+        <w:tc>
+          <w:tcPr>
+            <w:tcW w:type="dxa" w:w="7200"/>
+          </w:tcPr>
+          <w:p>
+            <w:pPr>
+              <w:spacing w:after="40" w:line="240" w:lineRule="auto"/>
+            </w:pPr>
+            <w:r>
+              <w:t>.local/runs/E11-R01/config.json；.local/runs/E11-R01/trainable-parameters.json；.local/runs/E11-R01/validation-progress.json；.local/logs/scale-5000-17-train-1790919168744708500.log</w:t>
+            </w:r>
+          </w:p>
+        </w:tc>
+      </w:tr>
+      <w:tr>
+        <w:trPr>
+          <w:cantSplit/>
+        </w:trPr>
+        <w:tc>
+          <w:tcPr>
+            <w:tcW w:type="dxa" w:w="2381"/>
+          </w:tcPr>
+          <w:p>
+            <w:pPr>
+              <w:spacing w:after="40" w:line="240" w:lineRule="auto"/>
+            </w:pPr>
+            <w:r>
               <w:t>等量数据筛选与复查</w:t>
             </w:r>
           </w:p>

</xml_diff>

<commit_message>
Record E11 comparisons and freeze focused budgets
</commit_message>
<xml_diff>
--- a/docs/reports/02-微调与数据.docx
+++ b/docs/reports/02-微调与数据.docx
@@ -12,7 +12,7 @@
     </w:p>
     <w:p>
       <w:r>
-        <w:t>更新：2026-10-02T13:36:03+08:00。本册按实际实验整理，原始运行记录单独保存。</w:t>
+        <w:t>更新：2026-10-02T18:39:29+08:00。本册按实际实验整理，原始运行记录单独保存。</w:t>
       </w:r>
     </w:p>
     <w:p>
@@ -30,35 +30,37 @@
     </w:p>
     <w:p>
       <w:r>
-        <w:t>10,000 条训练轨迹的最佳 dev 结果为 411/500，较固定示例基线多 56 条。三个 10k seed 落在 409—411/500；不调用轮为 334—338/360，低于 5k 的 342/360。规模与 seed 队列已完成，但这些仍是同一份 dev 上的成绩，不能替代独立 test。loss 和工具决策分开看，不能把更容易生成调用当成任务成功率提升。</w:t>
+        <w:t>最近完成的 E09 规模组 E09-R16 使用 10,000 条训练轨迹，完整 dev 通过 411/500；调用轮为 494/568，不调用轮为 334/360。loss 与实际工具决策分开看，不能把更容易生成调用当成任务成功率提升。</w:t>
       </w:r>
     </w:p>
     <w:p>
       <w:r>
-        <w:t>LoRA 重复准备和验证阶段的显存缓存问题已经找到处理办法，失败条件与经过保留在正文。下一步转向相同数据、rank、训练步数和提示条件下的 BF16 LoRA/QLoRA 对照，再开展 rank、学习率与数据质量实验；最终配置仍不能由 test 选择。</w:t>
+        <w:t>10k 三个 seed（17、42、2026）分别通过 409、410、411/500；不调用轮落在 334—338/360。三轮在同一份 dev 上完成，不能当作独立测试集成绩。</w:t>
       </w:r>
     </w:p>
     <w:p>
       <w:r>
-        <w:t>rank 对照固定学习率，选定 rank 后再比较学习率。候选参数量来自真实权重形状，训练与工具表现按当前章节分别记录，配置选择只使用 dev。</w:t>
+        <w:t>精度对照沿用同一生成后端和完整 dev：NF4 训练组通过 406/500，BF16 训练组通过 403/500；调用轮分别为 482/568 与 468/568，不调用轮为 342/360 与 349/360。三条轨迹的差异说明这批结果接近，不能据此单独断言精度优劣。</w:t>
       </w:r>
     </w:p>
     <w:p>
       <w:r>
-        <w:t>数据质量对照按来源和类别匹配两份 5k 数据，逐条复查也保留了规则误删和漏检。筛选成本、监督量与后续模型表现分开记录，效果不能由“通过筛选”直接推出。</w:t>
-      </w:r>
-    </w:p>
-    <w:p>
-      <w:pPr>
-        <w:pStyle w:val="Heading2"/>
-      </w:pPr>
-      <w:r>
-        <w:t>精度对照</w:t>
+        <w:t>训练中遇到的 LoRA 重复准备和显存缓存问题，连同处理过程与失败条件都保留在正文。各组效果按自己的冻结数据与验证条件比较；最终配置只由 dev 选择，test 留作独立检查。</w:t>
       </w:r>
     </w:p>
     <w:p>
       <w:r>
-        <w:t>两组已完成相同完整 dev：NF4 训练通过 406/500，BF16 训练通过 403/500，相差 -3 条。先看训练成本和两类决策，再解释精度的影响。</w:t>
+        <w:t>rank 对照使用同一份 5k 数据，学习率对照另在同一份 1k 数据上固定 rank 16。两组各自使用相同的验证清单和保存规则，分开比较；配置选择只使用 dev。</w:t>
+      </w:r>
+    </w:p>
+    <w:p>
+      <w:r>
+        <w:t>1k 学习率组在固定 100 条 dev 上，1e-4 通过 68/100，5e-5 通过 63/100；调用轮分别为 86/112 与 84/112，不调用轮为 59/72 与 56/72。按预先确定的整条轨迹通过数选择 1e-4。这个结论限定在该冻结子集和单次训练 seed。</w:t>
+      </w:r>
+    </w:p>
+    <w:p>
+      <w:r>
+        <w:t>数据质量准备保留 5k 筛选池与阅读抽查，训练比较使用来源和类别匹配的两份 1k 数据。规则的误删和漏检、筛选成本、监督量与模型表现分别记录，效果不能由“通过筛选”直接推出。</w:t>
       </w:r>
     </w:p>
     <w:p>
@@ -176,6 +178,7 @@
           </w:tcPr>
           <w:p>
             <w:pPr>
+              <w:keepNext/>
               <w:spacing w:after="40" w:line="240" w:lineRule="auto"/>
             </w:pPr>
             <w:r>
@@ -193,6 +196,7 @@
           </w:tcPr>
           <w:p>
             <w:pPr>
+              <w:keepNext/>
               <w:spacing w:after="40" w:line="240" w:lineRule="auto"/>
             </w:pPr>
             <w:r>
@@ -210,6 +214,7 @@
           </w:tcPr>
           <w:p>
             <w:pPr>
+              <w:keepNext/>
               <w:spacing w:after="40" w:line="240" w:lineRule="auto"/>
             </w:pPr>
             <w:r>
@@ -227,6 +232,7 @@
           </w:tcPr>
           <w:p>
             <w:pPr>
+              <w:keepNext/>
               <w:spacing w:after="40" w:line="240" w:lineRule="auto"/>
             </w:pPr>
             <w:r>
@@ -244,6 +250,7 @@
           </w:tcPr>
           <w:p>
             <w:pPr>
+              <w:keepNext/>
               <w:spacing w:after="40" w:line="240" w:lineRule="auto"/>
             </w:pPr>
             <w:r>
@@ -505,7 +512,7 @@
     </w:p>
     <w:p>
       <w:r>
-        <w:t>这轮用了 10,000 条训练轨迹，完整 dev 通过 411/500，比原模型加固定示例多 56 条。1k、5k、10k 和三个 10k seed 的队列已经跑完；三个 10k seed 分别通过 409、410、411 条，差距很小，但这仍是同一份 dev 上的结果。另一个值得留意的地方是，不调用轮没有随数据量一直变好：5k 是 342/360，三个 10k seed 落在 334—338/360。</w:t>
+        <w:t>这轮用了 10,000 条训练轨迹，完整 dev 通过 411/500；原模型加固定示例为 355/500。调用轮相差 +38 条，不调用轮相差 +35 条。先把这两类决策分开，才看得清模型具体改变了什么；其余规模和 seed 仍需继续比较。</w:t>
       </w:r>
     </w:p>
     <w:p>
@@ -620,6 +627,7 @@
           </w:tcPr>
           <w:p>
             <w:pPr>
+              <w:keepNext/>
               <w:spacing w:after="40" w:line="240" w:lineRule="auto"/>
             </w:pPr>
             <w:r>
@@ -637,6 +645,7 @@
           </w:tcPr>
           <w:p>
             <w:pPr>
+              <w:keepNext/>
               <w:spacing w:after="40" w:line="240" w:lineRule="auto"/>
             </w:pPr>
             <w:r>
@@ -654,6 +663,7 @@
           </w:tcPr>
           <w:p>
             <w:pPr>
+              <w:keepNext/>
               <w:spacing w:after="40" w:line="240" w:lineRule="auto"/>
             </w:pPr>
             <w:r>
@@ -671,6 +681,7 @@
           </w:tcPr>
           <w:p>
             <w:pPr>
+              <w:keepNext/>
               <w:spacing w:after="40" w:line="240" w:lineRule="auto"/>
             </w:pPr>
             <w:r>
@@ -688,6 +699,7 @@
           </w:tcPr>
           <w:p>
             <w:pPr>
+              <w:keepNext/>
               <w:spacing w:after="40" w:line="240" w:lineRule="auto"/>
             </w:pPr>
             <w:r>
@@ -705,6 +717,7 @@
           </w:tcPr>
           <w:p>
             <w:pPr>
+              <w:keepNext/>
               <w:spacing w:after="40" w:line="240" w:lineRule="auto"/>
             </w:pPr>
             <w:r>
@@ -1634,6 +1647,7 @@
           </w:tcPr>
           <w:p>
             <w:pPr>
+              <w:keepNext/>
               <w:spacing w:after="40" w:line="240" w:lineRule="auto"/>
             </w:pPr>
             <w:r>
@@ -1651,6 +1665,7 @@
           </w:tcPr>
           <w:p>
             <w:pPr>
+              <w:keepNext/>
               <w:spacing w:after="40" w:line="240" w:lineRule="auto"/>
             </w:pPr>
             <w:r>
@@ -1668,6 +1683,7 @@
           </w:tcPr>
           <w:p>
             <w:pPr>
+              <w:keepNext/>
               <w:spacing w:after="40" w:line="240" w:lineRule="auto"/>
             </w:pPr>
             <w:r>
@@ -1685,6 +1701,7 @@
           </w:tcPr>
           <w:p>
             <w:pPr>
+              <w:keepNext/>
               <w:spacing w:after="40" w:line="240" w:lineRule="auto"/>
             </w:pPr>
             <w:r>
@@ -1702,6 +1719,7 @@
           </w:tcPr>
           <w:p>
             <w:pPr>
+              <w:keepNext/>
               <w:spacing w:after="40" w:line="240" w:lineRule="auto"/>
             </w:pPr>
             <w:r>
@@ -1719,6 +1737,7 @@
           </w:tcPr>
           <w:p>
             <w:pPr>
+              <w:keepNext/>
               <w:spacing w:after="40" w:line="240" w:lineRule="auto"/>
             </w:pPr>
             <w:r>
@@ -2330,7 +2349,7 @@
     </w:p>
     <w:p>
       <w:r>
-        <w:t>这条 JSON 和参数类型都有效，问题在于 pop 是模型自行补出的。两个例子都来自本轮实际回复。回看 5k 与三个 10k seed，整条轨迹通过数从 406/500 变化到 409—411/500，但不调用轮在 10k 时没有超过 5k。模型少猜参数的情况确实出现过，过度调用也没有消失；数据质量和学习率的影响还要分别对照，评分规则没有因这个例子而改变。</w:t>
+        <w:t>这条 JSON 和参数类型都有效，问题在于 pop 是模型自行补出的。两个例子都来自本轮实际回复。接下来继续原定 5k、10k 比较，观察这种多调用、少询问的倾向是否改变；数据质量和学习率的对照再单独排查，当前不为了让成绩变好而改评分。</w:t>
       </w:r>
     </w:p>
     <w:p>
@@ -2367,7 +2386,7 @@
     </w:p>
     <w:p>
       <w:r>
-        <w:t>标注里的任务内容是小写的“buy groceries”。这次只改了首字母，仍被既定的严格字符串评分判为失败，所以整条轨迹没有通过。这不是缺参数错误，却也不能临时放宽评分把它算对。一个决策改好了，不代表整条轨迹都修好了。各轮输入使用标注历史，还没有执行模型自己的连续 Agent 对话。后来完成的三个 10k seed 在整条轨迹上是 409—411/500，但不调用轮只有 334—338/360，和 5k 的 342/360 相比没有继续上升；Agent 连续执行效果留给 Pi 阶段验证。</w:t>
+        <w:t>标注里的任务内容是小写的“buy groceries”。这次只改了首字母，仍被既定的严格字符串评分判为失败，所以整条轨迹没有通过。这不是缺参数错误，却也不能临时放宽评分把它算对。一个决策改好了，不代表整条轨迹都修好了。这里各轮输入使用标注历史，尚未执行模型自己的连续Agent对话；接着完成原定10k和三个训练seed，再看收益是否稳定。</w:t>
       </w:r>
     </w:p>
     <w:p>
@@ -2621,6 +2640,7 @@
           </w:tcPr>
           <w:p>
             <w:pPr>
+              <w:keepNext/>
               <w:spacing w:after="40" w:line="240" w:lineRule="auto"/>
             </w:pPr>
             <w:r>
@@ -2638,6 +2658,7 @@
           </w:tcPr>
           <w:p>
             <w:pPr>
+              <w:keepNext/>
               <w:spacing w:after="40" w:line="240" w:lineRule="auto"/>
             </w:pPr>
             <w:r>
@@ -2655,6 +2676,7 @@
           </w:tcPr>
           <w:p>
             <w:pPr>
+              <w:keepNext/>
               <w:spacing w:after="40" w:line="240" w:lineRule="auto"/>
             </w:pPr>
             <w:r>
@@ -2672,6 +2694,7 @@
           </w:tcPr>
           <w:p>
             <w:pPr>
+              <w:keepNext/>
               <w:spacing w:after="40" w:line="240" w:lineRule="auto"/>
             </w:pPr>
             <w:r>
@@ -2836,6 +2859,7 @@
           </w:tcPr>
           <w:p>
             <w:pPr>
+              <w:keepNext/>
               <w:spacing w:after="40" w:line="240" w:lineRule="auto"/>
             </w:pPr>
             <w:r>
@@ -2853,6 +2877,7 @@
           </w:tcPr>
           <w:p>
             <w:pPr>
+              <w:keepNext/>
               <w:spacing w:after="40" w:line="240" w:lineRule="auto"/>
             </w:pPr>
             <w:r>
@@ -2870,6 +2895,7 @@
           </w:tcPr>
           <w:p>
             <w:pPr>
+              <w:keepNext/>
               <w:spacing w:after="40" w:line="240" w:lineRule="auto"/>
             </w:pPr>
             <w:r>
@@ -2887,6 +2913,7 @@
           </w:tcPr>
           <w:p>
             <w:pPr>
+              <w:keepNext/>
               <w:spacing w:after="40" w:line="240" w:lineRule="auto"/>
             </w:pPr>
             <w:r>
@@ -2904,6 +2931,7 @@
           </w:tcPr>
           <w:p>
             <w:pPr>
+              <w:keepNext/>
               <w:spacing w:after="40" w:line="240" w:lineRule="auto"/>
             </w:pPr>
             <w:r>
@@ -3081,6 +3109,7 @@
           </w:tcPr>
           <w:p>
             <w:pPr>
+              <w:keepNext/>
               <w:spacing w:after="40" w:line="240" w:lineRule="auto"/>
             </w:pPr>
             <w:r>
@@ -3098,6 +3127,7 @@
           </w:tcPr>
           <w:p>
             <w:pPr>
+              <w:keepNext/>
               <w:spacing w:after="40" w:line="240" w:lineRule="auto"/>
             </w:pPr>
             <w:r>
@@ -3115,6 +3145,7 @@
           </w:tcPr>
           <w:p>
             <w:pPr>
+              <w:keepNext/>
               <w:spacing w:after="40" w:line="240" w:lineRule="auto"/>
             </w:pPr>
             <w:r>
@@ -3132,6 +3163,7 @@
           </w:tcPr>
           <w:p>
             <w:pPr>
+              <w:keepNext/>
               <w:spacing w:after="40" w:line="240" w:lineRule="auto"/>
             </w:pPr>
             <w:r>
@@ -3355,6 +3387,7 @@
           </w:tcPr>
           <w:p>
             <w:pPr>
+              <w:keepNext/>
               <w:spacing w:after="40" w:line="240" w:lineRule="auto"/>
             </w:pPr>
             <w:r>
@@ -3372,6 +3405,7 @@
           </w:tcPr>
           <w:p>
             <w:pPr>
+              <w:keepNext/>
               <w:spacing w:after="40" w:line="240" w:lineRule="auto"/>
             </w:pPr>
             <w:r>
@@ -3389,6 +3423,7 @@
           </w:tcPr>
           <w:p>
             <w:pPr>
+              <w:keepNext/>
               <w:spacing w:after="40" w:line="240" w:lineRule="auto"/>
             </w:pPr>
             <w:r>
@@ -3406,6 +3441,7 @@
           </w:tcPr>
           <w:p>
             <w:pPr>
+              <w:keepNext/>
               <w:spacing w:after="40" w:line="240" w:lineRule="auto"/>
             </w:pPr>
             <w:r>
@@ -3423,6 +3459,7 @@
           </w:tcPr>
           <w:p>
             <w:pPr>
+              <w:keepNext/>
               <w:spacing w:after="40" w:line="240" w:lineRule="auto"/>
             </w:pPr>
             <w:r>
@@ -3586,7 +3623,7 @@
     </w:p>
     <w:p>
       <w:r>
-        <w:t>E11-R01 已经进入 rank 8 条件，正按相同数据和预算往前跑。现在只有加载与起始验证信息，完整训练和 dev 工具结果尚未出来，暂时不能判断 rank 越大越好。</w:t>
+        <w:t>这次把 rank 从 8 增到 16，没有提高整条轨迹的通过数：两组都通过 406/500。可训练参数翻倍，模型的具体错误却有变化。这个结果说明，增加适配器容量未必就能把工具任务做好；不能只凭 loss 或参数量判断效果。</w:t>
       </w:r>
     </w:p>
     <w:p>
@@ -3637,6 +3674,7 @@
           </w:tcPr>
           <w:p>
             <w:pPr>
+              <w:keepNext/>
               <w:spacing w:after="40" w:line="240" w:lineRule="auto"/>
             </w:pPr>
             <w:r>
@@ -3654,6 +3692,7 @@
           </w:tcPr>
           <w:p>
             <w:pPr>
+              <w:keepNext/>
               <w:spacing w:after="40" w:line="240" w:lineRule="auto"/>
             </w:pPr>
             <w:r>
@@ -3671,6 +3710,7 @@
           </w:tcPr>
           <w:p>
             <w:pPr>
+              <w:keepNext/>
               <w:spacing w:after="40" w:line="240" w:lineRule="auto"/>
             </w:pPr>
             <w:r>
@@ -3688,6 +3728,7 @@
           </w:tcPr>
           <w:p>
             <w:pPr>
+              <w:keepNext/>
               <w:spacing w:after="40" w:line="240" w:lineRule="auto"/>
             </w:pPr>
             <w:r>
@@ -3873,7 +3914,7 @@
     </w:tbl>
     <w:p>
       <w:r>
-        <w:t>rank 16 的计算结果是 17,432,576，与 E09 已保存的实际可训练参数统计一致。rank 8 和 32 的值仍是按形状计算的预期量，正式训练接入后还要核对实际参数统计。参数翻倍不代表效果翻倍；在 alpha 固定为 32 的条件下，增量权重的缩放也随 rank 改变。</w:t>
+        <w:t>rank 16 的计算结果是 17,432,576，与 E09 的实际可训练参数统计一致。E11-R01 接入训练后，rank 8 实际为 8,716,288 个参数，也与计算相符。rank 32 这里只列形状计算，尚无训练成绩。在 alpha 固定为 32 时，alpha/r 也随 rank 改变，所以比较的是整套 rank 设置，不能把变化全部归因于参数量。</w:t>
       </w:r>
     </w:p>
     <w:p>
@@ -3886,12 +3927,12 @@
     </w:p>
     <w:p>
       <w:r>
-        <w:t>先把学习率固定为 1e-4，比较 rank 8、16、32。三组使用同一份 5,000 条轨迹、14,502 个当前回复单元和 638,598 个监督 token，seed 17，训练一个 epoch、更新 1,813 次；长度、模板、监督遮罩和缓存策略保持一致。rank 16 复用 E09 同条件结果，必须完成训练和全部 500 条 dev 的工具生成后，才作为有效参考。</w:t>
+        <w:t>rank 对照把学习率固定为 1e-4，比较 rank 8 和 16。两组使用同一份 5,000 条轨迹、14,502 个当前回复单元和 638,598 个监督 token，seed 17，一个 epoch、1,813 次更新；长度、模板、监督遮罩和缓存策略一致。rank 16 复用 E09 的同条件训练与全部 500 条 dev 工具结果。</w:t>
       </w:r>
     </w:p>
     <w:p>
       <w:r>
-        <w:t>根据整条轨迹通过数选择 rank，并列时选较小 rank。然后固定这个 rank，再比较 5e-5、1e-4、2e-4 三个学习率；已经完成的 1e-4 条件直接复用，并列时选较低学习率。两阶段都只用 dev，最终 test 不参与选择。调用轮、不调用轮和截断数仍单独展示，避免只看一个总分。</w:t>
+        <w:t>学习率实验另用同一份 1,000 条训练轨迹，固定 rank 16，比较 1e-4 和 5e-5。两组都重新训练，使用同一份预先冻结的 100 条 dev，初始、每 200 步及末步计算 token 加权 loss，按最低 loss 选 checkpoint。随后在这 100 条轨迹上生成工具决策；通过数相同就选较低学习率。这里比较学习率，不把它和 5k rank 实验拼成同一组提升。最终 test 不参与选择。</w:t>
       </w:r>
     </w:p>
     <w:p>
@@ -3899,57 +3940,32 @@
         <w:pStyle w:val="Heading2"/>
       </w:pPr>
       <w:r>
-        <w:t>第一次启动时，先把解释器路径纠正了</w:t>
+        <w:t>第一次启动为什么停了？</w:t>
       </w:r>
     </w:p>
     <w:p>
       <w:r>
-        <w:t xml:space="preserve">第一次启动队列时，我从系统默认 Python 进入了 </w:t>
+        <w:t xml:space="preserve">第一次启动队列时使用了系统默认 Python，训练子进程在导入 </w:t>
       </w:r>
       <w:r>
         <w:rPr>
           <w:rFonts w:ascii="Consolas" w:hAnsi="Consolas"/>
           <w:sz w:val="20"/>
         </w:rPr>
-        <w:t>scale.py</w:t>
+        <w:t>datasets</w:t>
       </w:r>
       <w:r>
-        <w:t xml:space="preserve">。它不在项目锁定的训练环境里，子进程导入数据集库时便报 </w:t>
+        <w:t xml:space="preserve"> 时以 </w:t>
       </w:r>
       <w:r>
         <w:rPr>
           <w:rFonts w:ascii="Consolas" w:hAnsi="Consolas"/>
           <w:sz w:val="20"/>
         </w:rPr>
-        <w:t>ModuleNotFoundError: No module named 'datasets'</w:t>
+        <w:t>ModuleNotFoundError</w:t>
       </w:r>
       <w:r>
-        <w:t>。这次停在训练脚本导入阶段，没有创建 E11 训练运行、没有加载模型，也没有占用 GPU；它是启动环境选错，不是 rank 条件跑坏了。</w:t>
-      </w:r>
-    </w:p>
-    <w:p>
-      <w:r>
-        <w:t xml:space="preserve">回看 E10 的训练配置，实际使用的是项目内锁定的 Python 环境。我用这个解释器确认 </w:t>
-      </w:r>
-      <w:r>
-        <w:rPr>
-          <w:rFonts w:ascii="Consolas" w:hAnsi="Consolas"/>
-          <w:sz w:val="20"/>
-        </w:rPr>
-        <w:t>datasets==4.0.0</w:t>
-      </w:r>
-      <w:r>
-        <w:t>、</w:t>
-      </w:r>
-      <w:r>
-        <w:rPr>
-          <w:rFonts w:ascii="Consolas" w:hAnsi="Consolas"/>
-          <w:sz w:val="20"/>
-        </w:rPr>
-        <w:t>torch==2.8.0+cu128</w:t>
-      </w:r>
-      <w:r>
-        <w:t xml:space="preserve"> 可导入，并且 CUDA 可用。下一步沿用原来的数据、模型和 rank 配置重新启动队列，不改训练参数；第一次失败也留在记录里。</w:t>
+        <w:t xml:space="preserve"> 退出，退出码为 1。错误发生在训练初始化阶段，没有创建训练状态、加载模型或占用 GPU。随后改用项目锁定的训练环境启动 E11-R01；这次失败属于解释器入口问题，不是 rank 条件跑坏了。</w:t>
       </w:r>
     </w:p>
     <w:p>
@@ -3960,14 +3976,1331 @@
         <w:t>目前哪些条件已经实际运行？</w:t>
       </w:r>
     </w:p>
+    <w:tbl>
+      <w:tblPr>
+        <w:tblStyle w:val="TableGrid"/>
+        <w:tblW w:type="auto" w:w="0"/>
+        <w:tblLook w:firstColumn="1" w:firstRow="1" w:lastColumn="0" w:lastRow="0" w:noHBand="0" w:noVBand="1" w:val="04A0"/>
+      </w:tblPr>
+      <w:tblGrid>
+        <w:gridCol w:w="1606"/>
+        <w:gridCol w:w="1606"/>
+        <w:gridCol w:w="1606"/>
+        <w:gridCol w:w="1606"/>
+        <w:gridCol w:w="1606"/>
+        <w:gridCol w:w="1606"/>
+      </w:tblGrid>
+      <w:tr>
+        <w:trPr>
+          <w:cantSplit/>
+          <w:tblHeader/>
+        </w:trPr>
+        <w:tc>
+          <w:tcPr>
+            <w:tcW w:type="dxa" w:w="1606"/>
+            <w:shd w:fill="F3F4F6"/>
+          </w:tcPr>
+          <w:p>
+            <w:pPr>
+              <w:keepNext/>
+              <w:spacing w:after="40" w:line="240" w:lineRule="auto"/>
+            </w:pPr>
+            <w:r>
+              <w:rPr>
+                <w:b/>
+              </w:rPr>
+              <w:t>运行</w:t>
+            </w:r>
+          </w:p>
+        </w:tc>
+        <w:tc>
+          <w:tcPr>
+            <w:tcW w:type="dxa" w:w="1606"/>
+            <w:shd w:fill="F3F4F6"/>
+          </w:tcPr>
+          <w:p>
+            <w:pPr>
+              <w:keepNext/>
+              <w:spacing w:after="40" w:line="240" w:lineRule="auto"/>
+            </w:pPr>
+            <w:r>
+              <w:rPr>
+                <w:b/>
+              </w:rPr>
+              <w:t>训练轨迹</w:t>
+            </w:r>
+          </w:p>
+        </w:tc>
+        <w:tc>
+          <w:tcPr>
+            <w:tcW w:type="dxa" w:w="1606"/>
+            <w:shd w:fill="F3F4F6"/>
+          </w:tcPr>
+          <w:p>
+            <w:pPr>
+              <w:keepNext/>
+              <w:spacing w:after="40" w:line="240" w:lineRule="auto"/>
+            </w:pPr>
+            <w:r>
+              <w:rPr>
+                <w:b/>
+              </w:rPr>
+              <w:t>rank</w:t>
+            </w:r>
+          </w:p>
+        </w:tc>
+        <w:tc>
+          <w:tcPr>
+            <w:tcW w:type="dxa" w:w="1606"/>
+            <w:shd w:fill="F3F4F6"/>
+          </w:tcPr>
+          <w:p>
+            <w:pPr>
+              <w:keepNext/>
+              <w:spacing w:after="40" w:line="240" w:lineRule="auto"/>
+            </w:pPr>
+            <w:r>
+              <w:rPr>
+                <w:b/>
+              </w:rPr>
+              <w:t>学习率</w:t>
+            </w:r>
+          </w:p>
+        </w:tc>
+        <w:tc>
+          <w:tcPr>
+            <w:tcW w:type="dxa" w:w="1606"/>
+            <w:shd w:fill="F3F4F6"/>
+          </w:tcPr>
+          <w:p>
+            <w:pPr>
+              <w:keepNext/>
+              <w:spacing w:after="40" w:line="240" w:lineRule="auto"/>
+            </w:pPr>
+            <w:r>
+              <w:rPr>
+                <w:b/>
+              </w:rPr>
+              <w:t>更新次数</w:t>
+            </w:r>
+          </w:p>
+        </w:tc>
+        <w:tc>
+          <w:tcPr>
+            <w:tcW w:type="dxa" w:w="1606"/>
+            <w:shd w:fill="F3F4F6"/>
+          </w:tcPr>
+          <w:p>
+            <w:pPr>
+              <w:keepNext/>
+              <w:spacing w:after="40" w:line="240" w:lineRule="auto"/>
+            </w:pPr>
+            <w:r>
+              <w:rPr>
+                <w:b/>
+              </w:rPr>
+              <w:t>状态</w:t>
+            </w:r>
+          </w:p>
+        </w:tc>
+      </w:tr>
+      <w:tr>
+        <w:trPr>
+          <w:cantSplit/>
+        </w:trPr>
+        <w:tc>
+          <w:tcPr>
+            <w:tcW w:type="dxa" w:w="1606"/>
+          </w:tcPr>
+          <w:p>
+            <w:pPr>
+              <w:spacing w:after="40" w:line="240" w:lineRule="auto"/>
+            </w:pPr>
+            <w:r>
+              <w:t>E09-R09</w:t>
+            </w:r>
+          </w:p>
+        </w:tc>
+        <w:tc>
+          <w:tcPr>
+            <w:tcW w:type="dxa" w:w="1606"/>
+          </w:tcPr>
+          <w:p>
+            <w:pPr>
+              <w:spacing w:after="40" w:line="240" w:lineRule="auto"/>
+            </w:pPr>
+            <w:r>
+              <w:t>5,000</w:t>
+            </w:r>
+          </w:p>
+        </w:tc>
+        <w:tc>
+          <w:tcPr>
+            <w:tcW w:type="dxa" w:w="1606"/>
+          </w:tcPr>
+          <w:p>
+            <w:pPr>
+              <w:spacing w:after="40" w:line="240" w:lineRule="auto"/>
+            </w:pPr>
+            <w:r>
+              <w:t>16</w:t>
+            </w:r>
+          </w:p>
+        </w:tc>
+        <w:tc>
+          <w:tcPr>
+            <w:tcW w:type="dxa" w:w="1606"/>
+          </w:tcPr>
+          <w:p>
+            <w:pPr>
+              <w:spacing w:after="40" w:line="240" w:lineRule="auto"/>
+            </w:pPr>
+            <w:r>
+              <w:t>0.0001</w:t>
+            </w:r>
+          </w:p>
+        </w:tc>
+        <w:tc>
+          <w:tcPr>
+            <w:tcW w:type="dxa" w:w="1606"/>
+          </w:tcPr>
+          <w:p>
+            <w:pPr>
+              <w:spacing w:after="40" w:line="240" w:lineRule="auto"/>
+            </w:pPr>
+            <w:r>
+              <w:t>1813</w:t>
+            </w:r>
+          </w:p>
+        </w:tc>
+        <w:tc>
+          <w:tcPr>
+            <w:tcW w:type="dxa" w:w="1606"/>
+          </w:tcPr>
+          <w:p>
+            <w:pPr>
+              <w:spacing w:after="40" w:line="240" w:lineRule="auto"/>
+            </w:pPr>
+            <w:r>
+              <w:t>参考；训练与工具评测完成</w:t>
+            </w:r>
+          </w:p>
+        </w:tc>
+      </w:tr>
+      <w:tr>
+        <w:trPr>
+          <w:cantSplit/>
+        </w:trPr>
+        <w:tc>
+          <w:tcPr>
+            <w:tcW w:type="dxa" w:w="1606"/>
+          </w:tcPr>
+          <w:p>
+            <w:pPr>
+              <w:spacing w:after="40" w:line="240" w:lineRule="auto"/>
+            </w:pPr>
+            <w:r>
+              <w:t>E11-R01</w:t>
+            </w:r>
+          </w:p>
+        </w:tc>
+        <w:tc>
+          <w:tcPr>
+            <w:tcW w:type="dxa" w:w="1606"/>
+          </w:tcPr>
+          <w:p>
+            <w:pPr>
+              <w:spacing w:after="40" w:line="240" w:lineRule="auto"/>
+            </w:pPr>
+            <w:r>
+              <w:t>5,000</w:t>
+            </w:r>
+          </w:p>
+        </w:tc>
+        <w:tc>
+          <w:tcPr>
+            <w:tcW w:type="dxa" w:w="1606"/>
+          </w:tcPr>
+          <w:p>
+            <w:pPr>
+              <w:spacing w:after="40" w:line="240" w:lineRule="auto"/>
+            </w:pPr>
+            <w:r>
+              <w:t>8</w:t>
+            </w:r>
+          </w:p>
+        </w:tc>
+        <w:tc>
+          <w:tcPr>
+            <w:tcW w:type="dxa" w:w="1606"/>
+          </w:tcPr>
+          <w:p>
+            <w:pPr>
+              <w:spacing w:after="40" w:line="240" w:lineRule="auto"/>
+            </w:pPr>
+            <w:r>
+              <w:t>0.0001</w:t>
+            </w:r>
+          </w:p>
+        </w:tc>
+        <w:tc>
+          <w:tcPr>
+            <w:tcW w:type="dxa" w:w="1606"/>
+          </w:tcPr>
+          <w:p>
+            <w:pPr>
+              <w:spacing w:after="40" w:line="240" w:lineRule="auto"/>
+            </w:pPr>
+            <w:r>
+              <w:t>1813</w:t>
+            </w:r>
+          </w:p>
+        </w:tc>
+        <w:tc>
+          <w:tcPr>
+            <w:tcW w:type="dxa" w:w="1606"/>
+          </w:tcPr>
+          <w:p>
+            <w:pPr>
+              <w:spacing w:after="40" w:line="240" w:lineRule="auto"/>
+            </w:pPr>
+            <w:r>
+              <w:t>训练与工具评测完成</w:t>
+            </w:r>
+          </w:p>
+        </w:tc>
+      </w:tr>
+      <w:tr>
+        <w:trPr>
+          <w:cantSplit/>
+        </w:trPr>
+        <w:tc>
+          <w:tcPr>
+            <w:tcW w:type="dxa" w:w="1606"/>
+          </w:tcPr>
+          <w:p>
+            <w:pPr>
+              <w:spacing w:after="40" w:line="240" w:lineRule="auto"/>
+            </w:pPr>
+            <w:r>
+              <w:t>E11-R03</w:t>
+            </w:r>
+          </w:p>
+        </w:tc>
+        <w:tc>
+          <w:tcPr>
+            <w:tcW w:type="dxa" w:w="1606"/>
+          </w:tcPr>
+          <w:p>
+            <w:pPr>
+              <w:spacing w:after="40" w:line="240" w:lineRule="auto"/>
+            </w:pPr>
+            <w:r>
+              <w:t>1,000</w:t>
+            </w:r>
+          </w:p>
+        </w:tc>
+        <w:tc>
+          <w:tcPr>
+            <w:tcW w:type="dxa" w:w="1606"/>
+          </w:tcPr>
+          <w:p>
+            <w:pPr>
+              <w:spacing w:after="40" w:line="240" w:lineRule="auto"/>
+            </w:pPr>
+            <w:r>
+              <w:t>16</w:t>
+            </w:r>
+          </w:p>
+        </w:tc>
+        <w:tc>
+          <w:tcPr>
+            <w:tcW w:type="dxa" w:w="1606"/>
+          </w:tcPr>
+          <w:p>
+            <w:pPr>
+              <w:spacing w:after="40" w:line="240" w:lineRule="auto"/>
+            </w:pPr>
+            <w:r>
+              <w:t>0.0001</w:t>
+            </w:r>
+          </w:p>
+        </w:tc>
+        <w:tc>
+          <w:tcPr>
+            <w:tcW w:type="dxa" w:w="1606"/>
+          </w:tcPr>
+          <w:p>
+            <w:pPr>
+              <w:spacing w:after="40" w:line="240" w:lineRule="auto"/>
+            </w:pPr>
+            <w:r>
+              <w:t>363</w:t>
+            </w:r>
+          </w:p>
+        </w:tc>
+        <w:tc>
+          <w:tcPr>
+            <w:tcW w:type="dxa" w:w="1606"/>
+          </w:tcPr>
+          <w:p>
+            <w:pPr>
+              <w:spacing w:after="40" w:line="240" w:lineRule="auto"/>
+            </w:pPr>
+            <w:r>
+              <w:t>训练与工具评测完成</w:t>
+            </w:r>
+          </w:p>
+        </w:tc>
+      </w:tr>
+      <w:tr>
+        <w:trPr>
+          <w:cantSplit/>
+        </w:trPr>
+        <w:tc>
+          <w:tcPr>
+            <w:tcW w:type="dxa" w:w="1606"/>
+          </w:tcPr>
+          <w:p>
+            <w:pPr>
+              <w:spacing w:after="40" w:line="240" w:lineRule="auto"/>
+            </w:pPr>
+            <w:r>
+              <w:t>E11-R05</w:t>
+            </w:r>
+          </w:p>
+        </w:tc>
+        <w:tc>
+          <w:tcPr>
+            <w:tcW w:type="dxa" w:w="1606"/>
+          </w:tcPr>
+          <w:p>
+            <w:pPr>
+              <w:spacing w:after="40" w:line="240" w:lineRule="auto"/>
+            </w:pPr>
+            <w:r>
+              <w:t>1,000</w:t>
+            </w:r>
+          </w:p>
+        </w:tc>
+        <w:tc>
+          <w:tcPr>
+            <w:tcW w:type="dxa" w:w="1606"/>
+          </w:tcPr>
+          <w:p>
+            <w:pPr>
+              <w:spacing w:after="40" w:line="240" w:lineRule="auto"/>
+            </w:pPr>
+            <w:r>
+              <w:t>16</w:t>
+            </w:r>
+          </w:p>
+        </w:tc>
+        <w:tc>
+          <w:tcPr>
+            <w:tcW w:type="dxa" w:w="1606"/>
+          </w:tcPr>
+          <w:p>
+            <w:pPr>
+              <w:spacing w:after="40" w:line="240" w:lineRule="auto"/>
+            </w:pPr>
+            <w:r>
+              <w:t>5e-05</w:t>
+            </w:r>
+          </w:p>
+        </w:tc>
+        <w:tc>
+          <w:tcPr>
+            <w:tcW w:type="dxa" w:w="1606"/>
+          </w:tcPr>
+          <w:p>
+            <w:pPr>
+              <w:spacing w:after="40" w:line="240" w:lineRule="auto"/>
+            </w:pPr>
+            <w:r>
+              <w:t>363</w:t>
+            </w:r>
+          </w:p>
+        </w:tc>
+        <w:tc>
+          <w:tcPr>
+            <w:tcW w:type="dxa" w:w="1606"/>
+          </w:tcPr>
+          <w:p>
+            <w:pPr>
+              <w:spacing w:after="40" w:line="240" w:lineRule="auto"/>
+            </w:pPr>
+            <w:r>
+              <w:t>训练与工具评测完成</w:t>
+            </w:r>
+          </w:p>
+        </w:tc>
+      </w:tr>
+    </w:tbl>
     <w:p>
+      <w:pPr>
+        <w:keepNext/>
+        <w:spacing w:before="120"/>
+        <w:jc w:val="center"/>
+      </w:pPr>
       <w:r>
-        <w:t>第一次初始化后，训练参数检查到 8,716,288 个可训练参数、392 个 LoRA 张量，基础权重处于 NF4 加 BF16 计算条件，适配器 dtype 为 FP32。R01 正在跑起始 dev loss；截至 13:35 的进度记录，已处理 600/1,484 个回复单元，用时 124.0 秒，reserved 1,754 MiB，还没有 optimizer step。</w:t>
+        <w:drawing>
+          <wp:inline xmlns:a="http://schemas.openxmlformats.org/drawingml/2006/main" xmlns:pic="http://schemas.openxmlformats.org/drawingml/2006/picture">
+            <wp:extent cx="5400000" cy="2953125"/>
+            <wp:docPr id="6" name="Picture 6"/>
+            <wp:cNvGraphicFramePr>
+              <a:graphicFrameLocks noChangeAspect="1"/>
+            </wp:cNvGraphicFramePr>
+            <a:graphic>
+              <a:graphicData uri="http://schemas.openxmlformats.org/drawingml/2006/picture">
+                <pic:pic>
+                  <pic:nvPicPr>
+                    <pic:cNvPr id="0" name="E11-R01-loss.png"/>
+                    <pic:cNvPicPr/>
+                  </pic:nvPicPr>
+                  <pic:blipFill>
+                    <a:blip r:embed="rId16"/>
+                    <a:stretch>
+                      <a:fillRect/>
+                    </a:stretch>
+                  </pic:blipFill>
+                  <pic:spPr>
+                    <a:xfrm>
+                      <a:off x="0" y="0"/>
+                      <a:ext cx="5400000" cy="2953125"/>
+                    </a:xfrm>
+                    <a:prstGeom prst="rect"/>
+                  </pic:spPr>
+                </pic:pic>
+              </a:graphicData>
+            </a:graphic>
+          </wp:inline>
+        </w:drawing>
+      </w:r>
+    </w:p>
+    <w:p>
+      <w:pPr>
+        <w:jc w:val="center"/>
+      </w:pPr>
+      <w:r>
+        <w:t>图 E11：E11-R01 的真实训练与 500 条 dev loss，未平滑。</w:t>
+      </w:r>
+    </w:p>
+    <w:p>
+      <w:pPr>
+        <w:keepNext/>
+        <w:spacing w:before="120"/>
+        <w:jc w:val="center"/>
+      </w:pPr>
+      <w:r>
+        <w:drawing>
+          <wp:inline xmlns:a="http://schemas.openxmlformats.org/drawingml/2006/main" xmlns:pic="http://schemas.openxmlformats.org/drawingml/2006/picture">
+            <wp:extent cx="5400000" cy="2953125"/>
+            <wp:docPr id="7" name="Picture 7"/>
+            <wp:cNvGraphicFramePr>
+              <a:graphicFrameLocks noChangeAspect="1"/>
+            </wp:cNvGraphicFramePr>
+            <a:graphic>
+              <a:graphicData uri="http://schemas.openxmlformats.org/drawingml/2006/picture">
+                <pic:pic>
+                  <pic:nvPicPr>
+                    <pic:cNvPr id="0" name="E11-R03-loss.png"/>
+                    <pic:cNvPicPr/>
+                  </pic:nvPicPr>
+                  <pic:blipFill>
+                    <a:blip r:embed="rId17"/>
+                    <a:stretch>
+                      <a:fillRect/>
+                    </a:stretch>
+                  </pic:blipFill>
+                  <pic:spPr>
+                    <a:xfrm>
+                      <a:off x="0" y="0"/>
+                      <a:ext cx="5400000" cy="2953125"/>
+                    </a:xfrm>
+                    <a:prstGeom prst="rect"/>
+                  </pic:spPr>
+                </pic:pic>
+              </a:graphicData>
+            </a:graphic>
+          </wp:inline>
+        </w:drawing>
+      </w:r>
+    </w:p>
+    <w:p>
+      <w:pPr>
+        <w:jc w:val="center"/>
+      </w:pPr>
+      <w:r>
+        <w:t>图 E11：E11-R03 的真实训练与 100 条 dev loss，未平滑。</w:t>
+      </w:r>
+    </w:p>
+    <w:p>
+      <w:pPr>
+        <w:keepNext/>
+        <w:spacing w:before="120"/>
+        <w:jc w:val="center"/>
+      </w:pPr>
+      <w:r>
+        <w:drawing>
+          <wp:inline xmlns:a="http://schemas.openxmlformats.org/drawingml/2006/main" xmlns:pic="http://schemas.openxmlformats.org/drawingml/2006/picture">
+            <wp:extent cx="5400000" cy="2953125"/>
+            <wp:docPr id="8" name="Picture 8"/>
+            <wp:cNvGraphicFramePr>
+              <a:graphicFrameLocks noChangeAspect="1"/>
+            </wp:cNvGraphicFramePr>
+            <a:graphic>
+              <a:graphicData uri="http://schemas.openxmlformats.org/drawingml/2006/picture">
+                <pic:pic>
+                  <pic:nvPicPr>
+                    <pic:cNvPr id="0" name="E11-R05-loss.png"/>
+                    <pic:cNvPicPr/>
+                  </pic:nvPicPr>
+                  <pic:blipFill>
+                    <a:blip r:embed="rId18"/>
+                    <a:stretch>
+                      <a:fillRect/>
+                    </a:stretch>
+                  </pic:blipFill>
+                  <pic:spPr>
+                    <a:xfrm>
+                      <a:off x="0" y="0"/>
+                      <a:ext cx="5400000" cy="2953125"/>
+                    </a:xfrm>
+                    <a:prstGeom prst="rect"/>
+                  </pic:spPr>
+                </pic:pic>
+              </a:graphicData>
+            </a:graphic>
+          </wp:inline>
+        </w:drawing>
+      </w:r>
+    </w:p>
+    <w:p>
+      <w:pPr>
+        <w:jc w:val="center"/>
+      </w:pPr>
+      <w:r>
+        <w:t>图 E11：E11-R05 的真实训练与 100 条 dev loss，未平滑。</w:t>
+      </w:r>
+    </w:p>
+    <w:p>
+      <w:pPr>
+        <w:pStyle w:val="Heading2"/>
+      </w:pPr>
+      <w:r>
+        <w:t>工具表现怎样？</w:t>
       </w:r>
     </w:p>
     <w:p>
       <w:r>
-        <w:t>本轮的 rank 8、5k、seed 17 和学习率 1e-4 均已落到运行配置。接下来等待整轮训练与 500 条 dev 工具评测结束，再按队列进入 rank 32；rank 16 继续复用 E09-R09/E09-R10。这个启动过程中的 Python 解释器错误没有混进模型成绩。</w:t>
+        <w:t>表中分母来自各自冻结清单。5k rank 实验使用完整 500 条 dev；1k 学习率实验使用固定抽样的 100 条，四类任务都保留，其中并行调用保留原 dev 的全部 10 条。两套分数分开解释，抽样结果只说明这些任务上的表现。各条件沿用固定提示、贪心解码和同一 NF4 推理后端。</w:t>
+      </w:r>
+    </w:p>
+    <w:tbl>
+      <w:tblPr>
+        <w:tblStyle w:val="TableGrid"/>
+        <w:tblW w:type="auto" w:w="0"/>
+        <w:tblLook w:firstColumn="1" w:firstRow="1" w:lastColumn="0" w:lastRow="0" w:noHBand="0" w:noVBand="1" w:val="04A0"/>
+      </w:tblPr>
+      <w:tblGrid>
+        <w:gridCol w:w="1205"/>
+        <w:gridCol w:w="1205"/>
+        <w:gridCol w:w="1205"/>
+        <w:gridCol w:w="1205"/>
+        <w:gridCol w:w="1205"/>
+        <w:gridCol w:w="1205"/>
+        <w:gridCol w:w="1205"/>
+        <w:gridCol w:w="1205"/>
+      </w:tblGrid>
+      <w:tr>
+        <w:trPr>
+          <w:cantSplit/>
+          <w:tblHeader/>
+        </w:trPr>
+        <w:tc>
+          <w:tcPr>
+            <w:tcW w:type="dxa" w:w="1205"/>
+            <w:shd w:fill="F3F4F6"/>
+          </w:tcPr>
+          <w:p>
+            <w:pPr>
+              <w:keepNext/>
+              <w:spacing w:after="40" w:line="240" w:lineRule="auto"/>
+            </w:pPr>
+            <w:r>
+              <w:rPr>
+                <w:b/>
+              </w:rPr>
+              <w:t>训练运行</w:t>
+            </w:r>
+          </w:p>
+        </w:tc>
+        <w:tc>
+          <w:tcPr>
+            <w:tcW w:type="dxa" w:w="1205"/>
+            <w:shd w:fill="F3F4F6"/>
+          </w:tcPr>
+          <w:p>
+            <w:pPr>
+              <w:keepNext/>
+              <w:spacing w:after="40" w:line="240" w:lineRule="auto"/>
+            </w:pPr>
+            <w:r>
+              <w:rPr>
+                <w:b/>
+              </w:rPr>
+              <w:t>训练轨迹</w:t>
+            </w:r>
+          </w:p>
+        </w:tc>
+        <w:tc>
+          <w:tcPr>
+            <w:tcW w:type="dxa" w:w="1205"/>
+            <w:shd w:fill="F3F4F6"/>
+          </w:tcPr>
+          <w:p>
+            <w:pPr>
+              <w:keepNext/>
+              <w:spacing w:after="40" w:line="240" w:lineRule="auto"/>
+            </w:pPr>
+            <w:r>
+              <w:rPr>
+                <w:b/>
+              </w:rPr>
+              <w:t>rank</w:t>
+            </w:r>
+          </w:p>
+        </w:tc>
+        <w:tc>
+          <w:tcPr>
+            <w:tcW w:type="dxa" w:w="1205"/>
+            <w:shd w:fill="F3F4F6"/>
+          </w:tcPr>
+          <w:p>
+            <w:pPr>
+              <w:keepNext/>
+              <w:spacing w:after="40" w:line="240" w:lineRule="auto"/>
+            </w:pPr>
+            <w:r>
+              <w:rPr>
+                <w:b/>
+              </w:rPr>
+              <w:t>学习率</w:t>
+            </w:r>
+          </w:p>
+        </w:tc>
+        <w:tc>
+          <w:tcPr>
+            <w:tcW w:type="dxa" w:w="1205"/>
+            <w:shd w:fill="F3F4F6"/>
+          </w:tcPr>
+          <w:p>
+            <w:pPr>
+              <w:keepNext/>
+              <w:spacing w:after="40" w:line="240" w:lineRule="auto"/>
+            </w:pPr>
+            <w:r>
+              <w:rPr>
+                <w:b/>
+              </w:rPr>
+              <w:t>整条轨迹</w:t>
+            </w:r>
+          </w:p>
+        </w:tc>
+        <w:tc>
+          <w:tcPr>
+            <w:tcW w:type="dxa" w:w="1205"/>
+            <w:shd w:fill="F3F4F6"/>
+          </w:tcPr>
+          <w:p>
+            <w:pPr>
+              <w:keepNext/>
+              <w:spacing w:after="40" w:line="240" w:lineRule="auto"/>
+            </w:pPr>
+            <w:r>
+              <w:rPr>
+                <w:b/>
+              </w:rPr>
+              <w:t>调用轮</w:t>
+            </w:r>
+          </w:p>
+        </w:tc>
+        <w:tc>
+          <w:tcPr>
+            <w:tcW w:type="dxa" w:w="1205"/>
+            <w:shd w:fill="F3F4F6"/>
+          </w:tcPr>
+          <w:p>
+            <w:pPr>
+              <w:keepNext/>
+              <w:spacing w:after="40" w:line="240" w:lineRule="auto"/>
+            </w:pPr>
+            <w:r>
+              <w:rPr>
+                <w:b/>
+              </w:rPr>
+              <w:t>不调用轮</w:t>
+            </w:r>
+          </w:p>
+        </w:tc>
+        <w:tc>
+          <w:tcPr>
+            <w:tcW w:type="dxa" w:w="1205"/>
+            <w:shd w:fill="F3F4F6"/>
+          </w:tcPr>
+          <w:p>
+            <w:pPr>
+              <w:keepNext/>
+              <w:spacing w:after="40" w:line="240" w:lineRule="auto"/>
+            </w:pPr>
+            <w:r>
+              <w:rPr>
+                <w:b/>
+              </w:rPr>
+              <w:t>截断</w:t>
+            </w:r>
+          </w:p>
+        </w:tc>
+      </w:tr>
+      <w:tr>
+        <w:trPr>
+          <w:cantSplit/>
+        </w:trPr>
+        <w:tc>
+          <w:tcPr>
+            <w:tcW w:type="dxa" w:w="1205"/>
+          </w:tcPr>
+          <w:p>
+            <w:pPr>
+              <w:spacing w:after="40" w:line="240" w:lineRule="auto"/>
+            </w:pPr>
+            <w:r>
+              <w:t>E09-R09</w:t>
+            </w:r>
+          </w:p>
+        </w:tc>
+        <w:tc>
+          <w:tcPr>
+            <w:tcW w:type="dxa" w:w="1205"/>
+          </w:tcPr>
+          <w:p>
+            <w:pPr>
+              <w:spacing w:after="40" w:line="240" w:lineRule="auto"/>
+            </w:pPr>
+            <w:r>
+              <w:t>5,000</w:t>
+            </w:r>
+          </w:p>
+        </w:tc>
+        <w:tc>
+          <w:tcPr>
+            <w:tcW w:type="dxa" w:w="1205"/>
+          </w:tcPr>
+          <w:p>
+            <w:pPr>
+              <w:spacing w:after="40" w:line="240" w:lineRule="auto"/>
+            </w:pPr>
+            <w:r>
+              <w:t>16</w:t>
+            </w:r>
+          </w:p>
+        </w:tc>
+        <w:tc>
+          <w:tcPr>
+            <w:tcW w:type="dxa" w:w="1205"/>
+          </w:tcPr>
+          <w:p>
+            <w:pPr>
+              <w:spacing w:after="40" w:line="240" w:lineRule="auto"/>
+            </w:pPr>
+            <w:r>
+              <w:t>0.0001</w:t>
+            </w:r>
+          </w:p>
+        </w:tc>
+        <w:tc>
+          <w:tcPr>
+            <w:tcW w:type="dxa" w:w="1205"/>
+          </w:tcPr>
+          <w:p>
+            <w:pPr>
+              <w:spacing w:after="40" w:line="240" w:lineRule="auto"/>
+            </w:pPr>
+            <w:r>
+              <w:t>406/500</w:t>
+            </w:r>
+          </w:p>
+        </w:tc>
+        <w:tc>
+          <w:tcPr>
+            <w:tcW w:type="dxa" w:w="1205"/>
+          </w:tcPr>
+          <w:p>
+            <w:pPr>
+              <w:spacing w:after="40" w:line="240" w:lineRule="auto"/>
+            </w:pPr>
+            <w:r>
+              <w:t>482/568</w:t>
+            </w:r>
+          </w:p>
+        </w:tc>
+        <w:tc>
+          <w:tcPr>
+            <w:tcW w:type="dxa" w:w="1205"/>
+          </w:tcPr>
+          <w:p>
+            <w:pPr>
+              <w:spacing w:after="40" w:line="240" w:lineRule="auto"/>
+            </w:pPr>
+            <w:r>
+              <w:t>342/360</w:t>
+            </w:r>
+          </w:p>
+        </w:tc>
+        <w:tc>
+          <w:tcPr>
+            <w:tcW w:type="dxa" w:w="1205"/>
+          </w:tcPr>
+          <w:p>
+            <w:pPr>
+              <w:spacing w:after="40" w:line="240" w:lineRule="auto"/>
+            </w:pPr>
+            <w:r>
+              <w:t>1</w:t>
+            </w:r>
+          </w:p>
+        </w:tc>
+      </w:tr>
+      <w:tr>
+        <w:trPr>
+          <w:cantSplit/>
+        </w:trPr>
+        <w:tc>
+          <w:tcPr>
+            <w:tcW w:type="dxa" w:w="1205"/>
+          </w:tcPr>
+          <w:p>
+            <w:pPr>
+              <w:spacing w:after="40" w:line="240" w:lineRule="auto"/>
+            </w:pPr>
+            <w:r>
+              <w:t>E11-R01</w:t>
+            </w:r>
+          </w:p>
+        </w:tc>
+        <w:tc>
+          <w:tcPr>
+            <w:tcW w:type="dxa" w:w="1205"/>
+          </w:tcPr>
+          <w:p>
+            <w:pPr>
+              <w:spacing w:after="40" w:line="240" w:lineRule="auto"/>
+            </w:pPr>
+            <w:r>
+              <w:t>5,000</w:t>
+            </w:r>
+          </w:p>
+        </w:tc>
+        <w:tc>
+          <w:tcPr>
+            <w:tcW w:type="dxa" w:w="1205"/>
+          </w:tcPr>
+          <w:p>
+            <w:pPr>
+              <w:spacing w:after="40" w:line="240" w:lineRule="auto"/>
+            </w:pPr>
+            <w:r>
+              <w:t>8</w:t>
+            </w:r>
+          </w:p>
+        </w:tc>
+        <w:tc>
+          <w:tcPr>
+            <w:tcW w:type="dxa" w:w="1205"/>
+          </w:tcPr>
+          <w:p>
+            <w:pPr>
+              <w:spacing w:after="40" w:line="240" w:lineRule="auto"/>
+            </w:pPr>
+            <w:r>
+              <w:t>0.0001</w:t>
+            </w:r>
+          </w:p>
+        </w:tc>
+        <w:tc>
+          <w:tcPr>
+            <w:tcW w:type="dxa" w:w="1205"/>
+          </w:tcPr>
+          <w:p>
+            <w:pPr>
+              <w:spacing w:after="40" w:line="240" w:lineRule="auto"/>
+            </w:pPr>
+            <w:r>
+              <w:t>406/500</w:t>
+            </w:r>
+          </w:p>
+        </w:tc>
+        <w:tc>
+          <w:tcPr>
+            <w:tcW w:type="dxa" w:w="1205"/>
+          </w:tcPr>
+          <w:p>
+            <w:pPr>
+              <w:spacing w:after="40" w:line="240" w:lineRule="auto"/>
+            </w:pPr>
+            <w:r>
+              <w:t>477/568</w:t>
+            </w:r>
+          </w:p>
+        </w:tc>
+        <w:tc>
+          <w:tcPr>
+            <w:tcW w:type="dxa" w:w="1205"/>
+          </w:tcPr>
+          <w:p>
+            <w:pPr>
+              <w:spacing w:after="40" w:line="240" w:lineRule="auto"/>
+            </w:pPr>
+            <w:r>
+              <w:t>346/360</w:t>
+            </w:r>
+          </w:p>
+        </w:tc>
+        <w:tc>
+          <w:tcPr>
+            <w:tcW w:type="dxa" w:w="1205"/>
+          </w:tcPr>
+          <w:p>
+            <w:pPr>
+              <w:spacing w:after="40" w:line="240" w:lineRule="auto"/>
+            </w:pPr>
+            <w:r>
+              <w:t>0</w:t>
+            </w:r>
+          </w:p>
+        </w:tc>
+      </w:tr>
+      <w:tr>
+        <w:trPr>
+          <w:cantSplit/>
+        </w:trPr>
+        <w:tc>
+          <w:tcPr>
+            <w:tcW w:type="dxa" w:w="1205"/>
+          </w:tcPr>
+          <w:p>
+            <w:pPr>
+              <w:spacing w:after="40" w:line="240" w:lineRule="auto"/>
+            </w:pPr>
+            <w:r>
+              <w:t>E11-R03</w:t>
+            </w:r>
+          </w:p>
+        </w:tc>
+        <w:tc>
+          <w:tcPr>
+            <w:tcW w:type="dxa" w:w="1205"/>
+          </w:tcPr>
+          <w:p>
+            <w:pPr>
+              <w:spacing w:after="40" w:line="240" w:lineRule="auto"/>
+            </w:pPr>
+            <w:r>
+              <w:t>1,000</w:t>
+            </w:r>
+          </w:p>
+        </w:tc>
+        <w:tc>
+          <w:tcPr>
+            <w:tcW w:type="dxa" w:w="1205"/>
+          </w:tcPr>
+          <w:p>
+            <w:pPr>
+              <w:spacing w:after="40" w:line="240" w:lineRule="auto"/>
+            </w:pPr>
+            <w:r>
+              <w:t>16</w:t>
+            </w:r>
+          </w:p>
+        </w:tc>
+        <w:tc>
+          <w:tcPr>
+            <w:tcW w:type="dxa" w:w="1205"/>
+          </w:tcPr>
+          <w:p>
+            <w:pPr>
+              <w:spacing w:after="40" w:line="240" w:lineRule="auto"/>
+            </w:pPr>
+            <w:r>
+              <w:t>0.0001</w:t>
+            </w:r>
+          </w:p>
+        </w:tc>
+        <w:tc>
+          <w:tcPr>
+            <w:tcW w:type="dxa" w:w="1205"/>
+          </w:tcPr>
+          <w:p>
+            <w:pPr>
+              <w:spacing w:after="40" w:line="240" w:lineRule="auto"/>
+            </w:pPr>
+            <w:r>
+              <w:t>68/100</w:t>
+            </w:r>
+          </w:p>
+        </w:tc>
+        <w:tc>
+          <w:tcPr>
+            <w:tcW w:type="dxa" w:w="1205"/>
+          </w:tcPr>
+          <w:p>
+            <w:pPr>
+              <w:spacing w:after="40" w:line="240" w:lineRule="auto"/>
+            </w:pPr>
+            <w:r>
+              <w:t>86/112</w:t>
+            </w:r>
+          </w:p>
+        </w:tc>
+        <w:tc>
+          <w:tcPr>
+            <w:tcW w:type="dxa" w:w="1205"/>
+          </w:tcPr>
+          <w:p>
+            <w:pPr>
+              <w:spacing w:after="40" w:line="240" w:lineRule="auto"/>
+            </w:pPr>
+            <w:r>
+              <w:t>59/72</w:t>
+            </w:r>
+          </w:p>
+        </w:tc>
+        <w:tc>
+          <w:tcPr>
+            <w:tcW w:type="dxa" w:w="1205"/>
+          </w:tcPr>
+          <w:p>
+            <w:pPr>
+              <w:spacing w:after="40" w:line="240" w:lineRule="auto"/>
+            </w:pPr>
+            <w:r>
+              <w:t>0</w:t>
+            </w:r>
+          </w:p>
+        </w:tc>
+      </w:tr>
+      <w:tr>
+        <w:trPr>
+          <w:cantSplit/>
+        </w:trPr>
+        <w:tc>
+          <w:tcPr>
+            <w:tcW w:type="dxa" w:w="1205"/>
+          </w:tcPr>
+          <w:p>
+            <w:pPr>
+              <w:spacing w:after="40" w:line="240" w:lineRule="auto"/>
+            </w:pPr>
+            <w:r>
+              <w:t>E11-R05</w:t>
+            </w:r>
+          </w:p>
+        </w:tc>
+        <w:tc>
+          <w:tcPr>
+            <w:tcW w:type="dxa" w:w="1205"/>
+          </w:tcPr>
+          <w:p>
+            <w:pPr>
+              <w:spacing w:after="40" w:line="240" w:lineRule="auto"/>
+            </w:pPr>
+            <w:r>
+              <w:t>1,000</w:t>
+            </w:r>
+          </w:p>
+        </w:tc>
+        <w:tc>
+          <w:tcPr>
+            <w:tcW w:type="dxa" w:w="1205"/>
+          </w:tcPr>
+          <w:p>
+            <w:pPr>
+              <w:spacing w:after="40" w:line="240" w:lineRule="auto"/>
+            </w:pPr>
+            <w:r>
+              <w:t>16</w:t>
+            </w:r>
+          </w:p>
+        </w:tc>
+        <w:tc>
+          <w:tcPr>
+            <w:tcW w:type="dxa" w:w="1205"/>
+          </w:tcPr>
+          <w:p>
+            <w:pPr>
+              <w:spacing w:after="40" w:line="240" w:lineRule="auto"/>
+            </w:pPr>
+            <w:r>
+              <w:t>5e-05</w:t>
+            </w:r>
+          </w:p>
+        </w:tc>
+        <w:tc>
+          <w:tcPr>
+            <w:tcW w:type="dxa" w:w="1205"/>
+          </w:tcPr>
+          <w:p>
+            <w:pPr>
+              <w:spacing w:after="40" w:line="240" w:lineRule="auto"/>
+            </w:pPr>
+            <w:r>
+              <w:t>63/100</w:t>
+            </w:r>
+          </w:p>
+        </w:tc>
+        <w:tc>
+          <w:tcPr>
+            <w:tcW w:type="dxa" w:w="1205"/>
+          </w:tcPr>
+          <w:p>
+            <w:pPr>
+              <w:spacing w:after="40" w:line="240" w:lineRule="auto"/>
+            </w:pPr>
+            <w:r>
+              <w:t>84/112</w:t>
+            </w:r>
+          </w:p>
+        </w:tc>
+        <w:tc>
+          <w:tcPr>
+            <w:tcW w:type="dxa" w:w="1205"/>
+          </w:tcPr>
+          <w:p>
+            <w:pPr>
+              <w:spacing w:after="40" w:line="240" w:lineRule="auto"/>
+            </w:pPr>
+            <w:r>
+              <w:t>56/72</w:t>
+            </w:r>
+          </w:p>
+        </w:tc>
+        <w:tc>
+          <w:tcPr>
+            <w:tcW w:type="dxa" w:w="1205"/>
+          </w:tcPr>
+          <w:p>
+            <w:pPr>
+              <w:spacing w:after="40" w:line="240" w:lineRule="auto"/>
+            </w:pPr>
+            <w:r>
+              <w:t>1</w:t>
+            </w:r>
+          </w:p>
+        </w:tc>
+      </w:tr>
+    </w:tbl>
+    <w:p>
+      <w:r>
+        <w:t>学习率比较只看这份固定的 100 条 dev：1e-4 通过 68 条，5e-5 通过 63 条，前者多 5 条。调用轮分别通过 86/112 和 84/112，不调用轮为 59/72 和 56/72；最低 token 加权 dev loss 分别为 0.1764 和 0.1888。按预先定下的整条轨迹通过数，当前应选 1e-4。这个差距来自同一冻结子集上的单 seed 对照，不能外推为全量成绩或稳定的随机种子结论。</w:t>
+      </w:r>
+    </w:p>
+    <w:p>
+      <w:r>
+        <w:t>rank 8 的调用轮通过 477/568，rank 16 为 482/568；不调用轮分别为 346/360 和 342/360。总通过数相同，不能理解成两个模型输出完全一样。当前结果来自 seed 17 的一次对照，尚不能推广成所有训练随机种子的结论。</w:t>
+      </w:r>
+    </w:p>
+    <w:p>
+      <w:r>
+        <w:t>逐条配对后，两组共同通过 401 条，各有 5 条和 5 条是只有自己通过的任务。总体分数打平，并不意味着增加 rank 完全没有改变模型，只是这次变化没有增加通过的任务总数。</w:t>
+      </w:r>
+    </w:p>
+    <w:p>
+      <w:r>
+        <w:t xml:space="preserve">一个具体错误出现在发票任务 </w:t>
+      </w:r>
+      <w:r>
+        <w:rPr>
+          <w:rFonts w:ascii="Consolas" w:hAnsi="Consolas"/>
+          <w:sz w:val="20"/>
+        </w:rPr>
+        <w:t>glaive-19894</w:t>
+      </w:r>
+      <w:r>
+        <w:t xml:space="preserve">。用户给出的客户、商品单价和数量都被 rank 8 正确写入调用，但它还在 arguments 中多写了 </w:t>
+      </w:r>
+      <w:r>
+        <w:rPr>
+          <w:rFonts w:ascii="Consolas" w:hAnsi="Consolas"/>
+          <w:sz w:val="20"/>
+        </w:rPr>
+        <w:t>type</w:t>
+      </w:r>
+      <w:r>
+        <w:t xml:space="preserve"> 字段。rank 16 的同一条回复没有这个字段，因而通过严格的参数匹配。下面摘出多写的参数，完整调用保留在逐条结果中。</w:t>
+      </w:r>
+    </w:p>
+    <w:p>
+      <w:pPr>
+        <w:pStyle w:val="CodeBlock"/>
+        <w:shd w:fill="F3F4F6"/>
+      </w:pPr>
+      <w:r>
+        <w:t>{"type": "function"}</w:t>
+      </w:r>
+    </w:p>
+    <w:p>
+      <w:pPr>
+        <w:keepNext/>
+        <w:spacing w:before="120"/>
+        <w:jc w:val="center"/>
+      </w:pPr>
+      <w:r>
+        <w:drawing>
+          <wp:inline xmlns:a="http://schemas.openxmlformats.org/drawingml/2006/main" xmlns:pic="http://schemas.openxmlformats.org/drawingml/2006/picture">
+            <wp:extent cx="5400000" cy="2784375"/>
+            <wp:docPr id="9" name="Picture 9"/>
+            <wp:cNvGraphicFramePr>
+              <a:graphicFrameLocks noChangeAspect="1"/>
+            </wp:cNvGraphicFramePr>
+            <a:graphic>
+              <a:graphicData uri="http://schemas.openxmlformats.org/drawingml/2006/picture">
+                <pic:pic>
+                  <pic:nvPicPr>
+                    <pic:cNvPr id="0" name="rank-tool-comparison.png"/>
+                    <pic:cNvPicPr/>
+                  </pic:nvPicPr>
+                  <pic:blipFill>
+                    <a:blip r:embed="rId19"/>
+                    <a:stretch>
+                      <a:fillRect/>
+                    </a:stretch>
+                  </pic:blipFill>
+                  <pic:spPr>
+                    <a:xfrm>
+                      <a:off x="0" y="0"/>
+                      <a:ext cx="5400000" cy="2784375"/>
+                    </a:xfrm>
+                    <a:prstGeom prst="rect"/>
+                  </pic:spPr>
+                </pic:pic>
+              </a:graphicData>
+            </a:graphic>
+          </wp:inline>
+        </w:drawing>
+      </w:r>
+    </w:p>
+    <w:p>
+      <w:pPr>
+        <w:jc w:val="center"/>
+      </w:pPr>
+      <w:r>
+        <w:t>图 E11：同一完整 dev 的四类任务通过率，柱上给出正确数与分母。两组均为训练 seed 17。</w:t>
+      </w:r>
+    </w:p>
+    <w:p>
+      <w:r>
+        <w:t>四类题的通过数在两组中也完全相同：单次调用 205/257、多轮调用 113/147、不调用 86/86、并行调用 2/10。逐条配对仍能看到各自多出的 5 条表现落在不同任务上，只是没有改变本批数据的类别合计。并行类只有 10 条，比例对少数样本很敏感。</w:t>
       </w:r>
     </w:p>
     <w:p>
@@ -4117,6 +5450,7 @@
           </w:tcPr>
           <w:p>
             <w:pPr>
+              <w:keepNext/>
               <w:spacing w:after="40" w:line="240" w:lineRule="auto"/>
             </w:pPr>
             <w:r>
@@ -4134,6 +5468,7 @@
           </w:tcPr>
           <w:p>
             <w:pPr>
+              <w:keepNext/>
               <w:spacing w:after="40" w:line="240" w:lineRule="auto"/>
             </w:pPr>
             <w:r>
@@ -4151,6 +5486,7 @@
           </w:tcPr>
           <w:p>
             <w:pPr>
+              <w:keepNext/>
               <w:spacing w:after="40" w:line="240" w:lineRule="auto"/>
             </w:pPr>
             <w:r>
@@ -4168,6 +5504,7 @@
           </w:tcPr>
           <w:p>
             <w:pPr>
+              <w:keepNext/>
               <w:spacing w:after="40" w:line="240" w:lineRule="auto"/>
             </w:pPr>
             <w:r>
@@ -4589,7 +5926,7 @@
         <w:drawing>
           <wp:inline xmlns:a="http://schemas.openxmlformats.org/drawingml/2006/main" xmlns:pic="http://schemas.openxmlformats.org/drawingml/2006/picture">
             <wp:extent cx="5400000" cy="2784375"/>
-            <wp:docPr id="6" name="Picture 6"/>
+            <wp:docPr id="10" name="Picture 10"/>
             <wp:cNvGraphicFramePr>
               <a:graphicFrameLocks noChangeAspect="1"/>
             </wp:cNvGraphicFramePr>
@@ -4601,7 +5938,7 @@
                     <pic:cNvPicPr/>
                   </pic:nvPicPr>
                   <pic:blipFill>
-                    <a:blip r:embed="rId16"/>
+                    <a:blip r:embed="rId20"/>
                     <a:stretch>
                       <a:fillRect/>
                     </a:stretch>
@@ -4651,6 +5988,7 @@
           </w:tcPr>
           <w:p>
             <w:pPr>
+              <w:keepNext/>
               <w:spacing w:after="40" w:line="240" w:lineRule="auto"/>
             </w:pPr>
             <w:r>
@@ -4668,6 +6006,7 @@
           </w:tcPr>
           <w:p>
             <w:pPr>
+              <w:keepNext/>
               <w:spacing w:after="40" w:line="240" w:lineRule="auto"/>
             </w:pPr>
             <w:r>
@@ -4685,6 +6024,7 @@
           </w:tcPr>
           <w:p>
             <w:pPr>
+              <w:keepNext/>
               <w:spacing w:after="40" w:line="240" w:lineRule="auto"/>
             </w:pPr>
             <w:r>
@@ -4911,17 +6251,71 @@
         <w:pStyle w:val="Heading2"/>
       </w:pPr>
       <w:r>
-        <w:t>训练与完整 dev 结果</w:t>
+        <w:t>1k 训练对照怎么做？</w:t>
       </w:r>
     </w:p>
     <w:p>
       <w:r>
-        <w:t>正式对照固定 rank 16、学习率 1e-4、seed 17、一个 epoch，精度、模板、缓存策略和固定提示与 E09 5k 相同。基础清洗条件只在训练及全部 500 条 dev 工具生成结束后复用。每 100 步计算完整 dev loss；最终工具评测仍包含 500 条轨迹、928 个决策轮。</w:t>
+        <w:t>训练对照各用 1,000 条独立轨迹。基础组沿用原 1k 样本，额外筛选组从已复查的 5k 数据池中抽取，逐个匹配“来源 × 类别”的数量；原 5k 筛选记录仍用于解释规则和抽查过程。两组固定 rank 16、学习率 1e-4、seed 17、一个 epoch，模板、精度与缓存策略相同。</w:t>
       </w:r>
     </w:p>
     <w:p>
       <w:r>
-        <w:t>新数据尚未开始 GPU 训练，当前不填写通过率或提升值。现有 GPU 队列继续按原顺序运行。</w:t>
+        <w:t>两组使用同一份预先冻结的 100 条 dev，四类任务都覆盖，包含原 dev 全部 10 条并行调用。初始、每 200 步和末步计算 token 加权 loss，选择最低 loss 的 checkpoint，再用同样的固定提示生成工具决策。基础组使用 E11 的同条件 1k 运行，不能拿验证方法不同的旧运行直接作参考。100 条成绩只代表这份固定样本，不当作完整 dev 的分数。</w:t>
+      </w:r>
+    </w:p>
+    <w:p>
+      <w:r>
+        <w:t>E12-R03：运行中，已更新 200 次。</w:t>
+      </w:r>
+    </w:p>
+    <w:p>
+      <w:pPr>
+        <w:keepNext/>
+        <w:spacing w:before="120"/>
+        <w:jc w:val="center"/>
+      </w:pPr>
+      <w:r>
+        <w:drawing>
+          <wp:inline xmlns:a="http://schemas.openxmlformats.org/drawingml/2006/main" xmlns:pic="http://schemas.openxmlformats.org/drawingml/2006/picture">
+            <wp:extent cx="5400000" cy="2953125"/>
+            <wp:docPr id="11" name="Picture 11"/>
+            <wp:cNvGraphicFramePr>
+              <a:graphicFrameLocks noChangeAspect="1"/>
+            </wp:cNvGraphicFramePr>
+            <a:graphic>
+              <a:graphicData uri="http://schemas.openxmlformats.org/drawingml/2006/picture">
+                <pic:pic>
+                  <pic:nvPicPr>
+                    <pic:cNvPr id="0" name="E12-R03-loss.png"/>
+                    <pic:cNvPicPr/>
+                  </pic:nvPicPr>
+                  <pic:blipFill>
+                    <a:blip r:embed="rId21"/>
+                    <a:stretch>
+                      <a:fillRect/>
+                    </a:stretch>
+                  </pic:blipFill>
+                  <pic:spPr>
+                    <a:xfrm>
+                      <a:off x="0" y="0"/>
+                      <a:ext cx="5400000" cy="2953125"/>
+                    </a:xfrm>
+                    <a:prstGeom prst="rect"/>
+                  </pic:spPr>
+                </pic:pic>
+              </a:graphicData>
+            </a:graphic>
+          </wp:inline>
+        </w:drawing>
+      </w:r>
+    </w:p>
+    <w:p>
+      <w:pPr>
+        <w:jc w:val="center"/>
+      </w:pPr>
+      <w:r>
+        <w:t>图 E12：E12-R03 的真实训练与固定 dev loss，未平滑。</w:t>
       </w:r>
     </w:p>
     <w:p>
@@ -4957,6 +6351,7 @@
           </w:tcPr>
           <w:p>
             <w:pPr>
+              <w:keepNext/>
               <w:spacing w:after="40" w:line="240" w:lineRule="auto"/>
             </w:pPr>
             <w:r>
@@ -4974,6 +6369,7 @@
           </w:tcPr>
           <w:p>
             <w:pPr>
+              <w:keepNext/>
               <w:spacing w:after="40" w:line="240" w:lineRule="auto"/>
             </w:pPr>
             <w:r>
@@ -5383,7 +6779,7 @@
               <w:spacing w:after="40" w:line="240" w:lineRule="auto"/>
             </w:pPr>
             <w:r>
-              <w:t>scripts/data_quality.py；configs/quality.json；configs/sft-quality.json</w:t>
+              <w:t>scripts/data_quality.py；configs/quality.json；configs/sft-quality-focused.json</w:t>
             </w:r>
           </w:p>
         </w:tc>
@@ -5508,6 +6904,99 @@
             </w:pPr>
             <w:r>
               <w:t>experiments/E10/notes.md；experiments/E10/E10-R01-metrics.csv；experiments/E10/figures/E10-R01-loss.png；configs/sft-bf16.json</w:t>
+            </w:r>
+          </w:p>
+        </w:tc>
+      </w:tr>
+      <w:tr>
+        <w:trPr>
+          <w:cantSplit/>
+        </w:trPr>
+        <w:tc>
+          <w:tcPr>
+            <w:tcW w:type="dxa" w:w="2381"/>
+          </w:tcPr>
+          <w:p>
+            <w:pPr>
+              <w:spacing w:after="40" w:line="240" w:lineRule="auto"/>
+            </w:pPr>
+            <w:r>
+              <w:t>E11 rank训练与评测</w:t>
+            </w:r>
+          </w:p>
+        </w:tc>
+        <w:tc>
+          <w:tcPr>
+            <w:tcW w:type="dxa" w:w="7200"/>
+          </w:tcPr>
+          <w:p>
+            <w:pPr>
+              <w:spacing w:after="40" w:line="240" w:lineRule="auto"/>
+            </w:pPr>
+            <w:r>
+              <w:t>experiments/E11/runs/E11-R01.json；experiments/E11/runs/E11-R02.json；experiments/E11/rank-tool-comparison.csv</w:t>
+            </w:r>
+          </w:p>
+        </w:tc>
+      </w:tr>
+      <w:tr>
+        <w:trPr>
+          <w:cantSplit/>
+        </w:trPr>
+        <w:tc>
+          <w:tcPr>
+            <w:tcW w:type="dxa" w:w="2381"/>
+          </w:tcPr>
+          <w:p>
+            <w:pPr>
+              <w:spacing w:after="40" w:line="240" w:lineRule="auto"/>
+            </w:pPr>
+            <w:r>
+              <w:t>1k训练与固定评测清单</w:t>
+            </w:r>
+          </w:p>
+        </w:tc>
+        <w:tc>
+          <w:tcPr>
+            <w:tcW w:type="dxa" w:w="7200"/>
+          </w:tcPr>
+          <w:p>
+            <w:pPr>
+              <w:spacing w:after="40" w:line="240" w:lineRule="auto"/>
+            </w:pPr>
+            <w:r>
+              <w:t>configs/sft-focused.json；configs/sft-lr-low.json；configs/learning-rate.json；configs/subsets-frozen.json</w:t>
+            </w:r>
+          </w:p>
+        </w:tc>
+      </w:tr>
+      <w:tr>
+        <w:trPr>
+          <w:cantSplit/>
+        </w:trPr>
+        <w:tc>
+          <w:tcPr>
+            <w:tcW w:type="dxa" w:w="2381"/>
+          </w:tcPr>
+          <w:p>
+            <w:pPr>
+              <w:spacing w:after="40" w:line="240" w:lineRule="auto"/>
+            </w:pPr>
+            <w:r>
+              <w:t>1k学习率对照</w:t>
+            </w:r>
+          </w:p>
+        </w:tc>
+        <w:tc>
+          <w:tcPr>
+            <w:tcW w:type="dxa" w:w="7200"/>
+          </w:tcPr>
+          <w:p>
+            <w:pPr>
+              <w:spacing w:after="40" w:line="240" w:lineRule="auto"/>
+            </w:pPr>
+            <w:r>
+              <w:t>experiments/E11/runs/E11-R03.json；experiments/E11/runs/E11-R04.json；experiments/E11/runs/E11-R05.json；experiments/E11/runs/E11-R06.json；experiments/E11/E11-R05-metrics.csv</w:t>
             </w:r>
           </w:p>
         </w:tc>

</xml_diff>

<commit_message>
Record E12 focused quality comparison
</commit_message>
<xml_diff>
--- a/docs/reports/02-微调与数据.docx
+++ b/docs/reports/02-微调与数据.docx
@@ -12,7 +12,7 @@
     </w:p>
     <w:p>
       <w:r>
-        <w:t>更新：2026-10-02T18:39:29+08:00。本册按实际实验整理，原始运行记录单独保存。</w:t>
+        <w:t>更新：2026-10-02T19:11:50+08:00。本册按实际实验整理，原始运行记录单独保存。</w:t>
       </w:r>
     </w:p>
     <w:p>
@@ -61,6 +61,11 @@
     <w:p>
       <w:r>
         <w:t>数据质量准备保留 5k 筛选池与阅读抽查，训练比较使用来源和类别匹配的两份 1k 数据。规则的误删和漏检、筛选成本、监督量与模型表现分别记录，效果不能由“通过筛选”直接推出。</w:t>
+      </w:r>
+    </w:p>
+    <w:p>
+      <w:r>
+        <w:t>在同一份 100 条 dev 上，额外筛选组通过 78 条轨迹，基础组通过 68 条；差异主要出现在逐轮“不调用”判断。两组只有一个训练 seed，筛选组还替换了部分样本，因此这 10 条差距说明本次筛选数据表现更好，不能单独证明筛选规则带来了因果提升。</w:t>
       </w:r>
     </w:p>
     <w:p>
@@ -5314,7 +5319,7 @@
     </w:p>
     <w:p>
       <w:r>
-        <w:t>目前只能确认数据条件，效果还要等训练。两份数据都保留 5,000 条独立轨迹，来源和四类任务数量一致；额外筛选保留原来的 4,326 条，替换 674 条。抽查同时发现了误删和漏检，因此这里的“通过筛选”只表示符合固定规则。</w:t>
+        <w:t>这组实验先把筛选规则说清楚，再看两组各 1,000 条训练数据在同一份 dev 上的表现。筛选前后各有 5,000 条独立轨迹，来源和四类任务数量配平；额外筛选保留原来的 4,326 条，替换 674 条。抽查同时发现了误删和漏检，因此这里的“通过筛选”只表示符合固定规则。</w:t>
       </w:r>
     </w:p>
     <w:p>
@@ -6266,7 +6271,7 @@
     </w:p>
     <w:p>
       <w:r>
-        <w:t>E12-R03：运行中，已更新 200 次。</w:t>
+        <w:t>E12-R03：训练完成，工具评测已记录，已更新 364 次。</w:t>
       </w:r>
     </w:p>
     <w:p>
@@ -6319,6 +6324,336 @@
       </w:r>
     </w:p>
     <w:p>
+      <w:r>
+        <w:t>E12-R04 固定 dev：整条轨迹 78/100，调用轮 88/112，不调用轮 68/72，截断 0。</w:t>
+      </w:r>
+    </w:p>
+    <w:p>
+      <w:pPr>
+        <w:pStyle w:val="Heading2"/>
+      </w:pPr>
+      <w:r>
+        <w:t>额外筛选后，固定 dev 上的表现怎样？</w:t>
+      </w:r>
+    </w:p>
+    <w:p>
+      <w:r>
+        <w:t>基础组与额外筛选组都使用 rank 16、学习率 1e-4、seed 17 和一个 epoch；验证数据与提示哈希相同。基础组来自 E11，筛选组从匹配后的数据池抽取。固定 100 条 dev 上，整条轨迹通过数为 68/100 与 78/100，差值 +10 条。下面按任务类型拆开看：</w:t>
+      </w:r>
+    </w:p>
+    <w:p>
+      <w:pPr>
+        <w:keepNext/>
+        <w:spacing w:before="120"/>
+        <w:jc w:val="center"/>
+      </w:pPr>
+      <w:r>
+        <w:drawing>
+          <wp:inline xmlns:a="http://schemas.openxmlformats.org/drawingml/2006/main" xmlns:pic="http://schemas.openxmlformats.org/drawingml/2006/picture">
+            <wp:extent cx="5400000" cy="2784375"/>
+            <wp:docPr id="12" name="Picture 12"/>
+            <wp:cNvGraphicFramePr>
+              <a:graphicFrameLocks noChangeAspect="1"/>
+            </wp:cNvGraphicFramePr>
+            <a:graphic>
+              <a:graphicData uri="http://schemas.openxmlformats.org/drawingml/2006/picture">
+                <pic:pic>
+                  <pic:nvPicPr>
+                    <pic:cNvPr id="0" name="quality-evaluation.png"/>
+                    <pic:cNvPicPr/>
+                  </pic:nvPicPr>
+                  <pic:blipFill>
+                    <a:blip r:embed="rId22"/>
+                    <a:stretch>
+                      <a:fillRect/>
+                    </a:stretch>
+                  </pic:blipFill>
+                  <pic:spPr>
+                    <a:xfrm>
+                      <a:off x="0" y="0"/>
+                      <a:ext cx="5400000" cy="2784375"/>
+                    </a:xfrm>
+                    <a:prstGeom prst="rect"/>
+                  </pic:spPr>
+                </pic:pic>
+              </a:graphicData>
+            </a:graphic>
+          </wp:inline>
+        </w:drawing>
+      </w:r>
+    </w:p>
+    <w:p>
+      <w:pPr>
+        <w:jc w:val="center"/>
+      </w:pPr>
+      <w:r>
+        <w:t>图 E12-2：同一份固定 dev 上，两组的分类型轨迹通过率。</w:t>
+      </w:r>
+    </w:p>
+    <w:tbl>
+      <w:tblPr>
+        <w:tblStyle w:val="TableGrid"/>
+        <w:tblW w:type="auto" w:w="0"/>
+        <w:tblLook w:firstColumn="1" w:firstRow="1" w:lastColumn="0" w:lastRow="0" w:noHBand="0" w:noVBand="1" w:val="04A0"/>
+      </w:tblPr>
+      <w:tblGrid>
+        <w:gridCol w:w="3213"/>
+        <w:gridCol w:w="3213"/>
+        <w:gridCol w:w="3213"/>
+      </w:tblGrid>
+      <w:tr>
+        <w:trPr>
+          <w:cantSplit/>
+          <w:tblHeader/>
+        </w:trPr>
+        <w:tc>
+          <w:tcPr>
+            <w:tcW w:type="dxa" w:w="3213"/>
+            <w:shd w:fill="F3F4F6"/>
+          </w:tcPr>
+          <w:p>
+            <w:pPr>
+              <w:keepNext/>
+              <w:spacing w:after="40" w:line="240" w:lineRule="auto"/>
+            </w:pPr>
+            <w:r>
+              <w:rPr>
+                <w:b/>
+              </w:rPr>
+              <w:t>任务类型</w:t>
+            </w:r>
+          </w:p>
+        </w:tc>
+        <w:tc>
+          <w:tcPr>
+            <w:tcW w:type="dxa" w:w="3213"/>
+            <w:shd w:fill="F3F4F6"/>
+          </w:tcPr>
+          <w:p>
+            <w:pPr>
+              <w:keepNext/>
+              <w:spacing w:after="40" w:line="240" w:lineRule="auto"/>
+            </w:pPr>
+            <w:r>
+              <w:rPr>
+                <w:b/>
+              </w:rPr>
+              <w:t>基础组</w:t>
+            </w:r>
+          </w:p>
+        </w:tc>
+        <w:tc>
+          <w:tcPr>
+            <w:tcW w:type="dxa" w:w="3213"/>
+            <w:shd w:fill="F3F4F6"/>
+          </w:tcPr>
+          <w:p>
+            <w:pPr>
+              <w:keepNext/>
+              <w:spacing w:after="40" w:line="240" w:lineRule="auto"/>
+            </w:pPr>
+            <w:r>
+              <w:rPr>
+                <w:b/>
+              </w:rPr>
+              <w:t>额外筛选组</w:t>
+            </w:r>
+          </w:p>
+        </w:tc>
+      </w:tr>
+      <w:tr>
+        <w:trPr>
+          <w:cantSplit/>
+        </w:trPr>
+        <w:tc>
+          <w:tcPr>
+            <w:tcW w:type="dxa" w:w="3213"/>
+          </w:tcPr>
+          <w:p>
+            <w:pPr>
+              <w:spacing w:after="40" w:line="240" w:lineRule="auto"/>
+            </w:pPr>
+            <w:r>
+              <w:t>单次调用</w:t>
+            </w:r>
+          </w:p>
+        </w:tc>
+        <w:tc>
+          <w:tcPr>
+            <w:tcW w:type="dxa" w:w="3213"/>
+          </w:tcPr>
+          <w:p>
+            <w:pPr>
+              <w:spacing w:after="40" w:line="240" w:lineRule="auto"/>
+            </w:pPr>
+            <w:r>
+              <w:t>30/40</w:t>
+            </w:r>
+          </w:p>
+        </w:tc>
+        <w:tc>
+          <w:tcPr>
+            <w:tcW w:type="dxa" w:w="3213"/>
+          </w:tcPr>
+          <w:p>
+            <w:pPr>
+              <w:spacing w:after="40" w:line="240" w:lineRule="auto"/>
+            </w:pPr>
+            <w:r>
+              <w:t>33/40</w:t>
+            </w:r>
+          </w:p>
+        </w:tc>
+      </w:tr>
+      <w:tr>
+        <w:trPr>
+          <w:cantSplit/>
+        </w:trPr>
+        <w:tc>
+          <w:tcPr>
+            <w:tcW w:type="dxa" w:w="3213"/>
+          </w:tcPr>
+          <w:p>
+            <w:pPr>
+              <w:spacing w:after="40" w:line="240" w:lineRule="auto"/>
+            </w:pPr>
+            <w:r>
+              <w:t>多轮调用</w:t>
+            </w:r>
+          </w:p>
+        </w:tc>
+        <w:tc>
+          <w:tcPr>
+            <w:tcW w:type="dxa" w:w="3213"/>
+          </w:tcPr>
+          <w:p>
+            <w:pPr>
+              <w:spacing w:after="40" w:line="240" w:lineRule="auto"/>
+            </w:pPr>
+            <w:r>
+              <w:t>16/30</w:t>
+            </w:r>
+          </w:p>
+        </w:tc>
+        <w:tc>
+          <w:tcPr>
+            <w:tcW w:type="dxa" w:w="3213"/>
+          </w:tcPr>
+          <w:p>
+            <w:pPr>
+              <w:spacing w:after="40" w:line="240" w:lineRule="auto"/>
+            </w:pPr>
+            <w:r>
+              <w:t>21/30</w:t>
+            </w:r>
+          </w:p>
+        </w:tc>
+      </w:tr>
+      <w:tr>
+        <w:trPr>
+          <w:cantSplit/>
+        </w:trPr>
+        <w:tc>
+          <w:tcPr>
+            <w:tcW w:type="dxa" w:w="3213"/>
+          </w:tcPr>
+          <w:p>
+            <w:pPr>
+              <w:spacing w:after="40" w:line="240" w:lineRule="auto"/>
+            </w:pPr>
+            <w:r>
+              <w:t>不调用</w:t>
+            </w:r>
+          </w:p>
+        </w:tc>
+        <w:tc>
+          <w:tcPr>
+            <w:tcW w:type="dxa" w:w="3213"/>
+          </w:tcPr>
+          <w:p>
+            <w:pPr>
+              <w:spacing w:after="40" w:line="240" w:lineRule="auto"/>
+            </w:pPr>
+            <w:r>
+              <w:t>20/20</w:t>
+            </w:r>
+          </w:p>
+        </w:tc>
+        <w:tc>
+          <w:tcPr>
+            <w:tcW w:type="dxa" w:w="3213"/>
+          </w:tcPr>
+          <w:p>
+            <w:pPr>
+              <w:spacing w:after="40" w:line="240" w:lineRule="auto"/>
+            </w:pPr>
+            <w:r>
+              <w:t>20/20</w:t>
+            </w:r>
+          </w:p>
+        </w:tc>
+      </w:tr>
+      <w:tr>
+        <w:trPr>
+          <w:cantSplit/>
+        </w:trPr>
+        <w:tc>
+          <w:tcPr>
+            <w:tcW w:type="dxa" w:w="3213"/>
+          </w:tcPr>
+          <w:p>
+            <w:pPr>
+              <w:spacing w:after="40" w:line="240" w:lineRule="auto"/>
+            </w:pPr>
+            <w:r>
+              <w:t>并行调用</w:t>
+            </w:r>
+          </w:p>
+        </w:tc>
+        <w:tc>
+          <w:tcPr>
+            <w:tcW w:type="dxa" w:w="3213"/>
+          </w:tcPr>
+          <w:p>
+            <w:pPr>
+              <w:spacing w:after="40" w:line="240" w:lineRule="auto"/>
+            </w:pPr>
+            <w:r>
+              <w:t>2/10</w:t>
+            </w:r>
+          </w:p>
+        </w:tc>
+        <w:tc>
+          <w:tcPr>
+            <w:tcW w:type="dxa" w:w="3213"/>
+          </w:tcPr>
+          <w:p>
+            <w:pPr>
+              <w:spacing w:after="40" w:line="240" w:lineRule="auto"/>
+            </w:pPr>
+            <w:r>
+              <w:t>4/10</w:t>
+            </w:r>
+          </w:p>
+        </w:tc>
+      </w:tr>
+    </w:tbl>
+    <w:p>
+      <w:r>
+        <w:t>调用轮分别通过 86/112 与 88/112；不调用轮分别通过 59/72 与 68/72。错误记录为 {"no_tool_call": 2} 与 {"no_tool_call": 1}，截断数为 0 与 0。</w:t>
+      </w:r>
+    </w:p>
+    <w:p>
+      <w:r>
+        <w:t>表格里的“不调用”按整条任务轨迹计数；这里的“不调用轮”则是轨迹中的单次决策，统计口径和分母不同。</w:t>
+      </w:r>
+    </w:p>
+    <w:p>
+      <w:r>
+        <w:t>在这 100 条固定样本上，额外筛选组多通过 10 条轨迹；不调用决策轮多通过 9 条，其余三类轨迹也有增加。这个结果值得继续看，但还不是筛选规则的因果证明：这里只有一个训练 seed，且筛选组替换了部分样本，规则变化与样本内容变化没有拆开。</w:t>
+      </w:r>
+    </w:p>
+    <w:p>
       <w:pPr>
         <w:pStyle w:val="Heading2"/>
         <w:pageBreakBefore/>
@@ -6997,6 +7332,68 @@
             </w:pPr>
             <w:r>
               <w:t>experiments/E11/runs/E11-R03.json；experiments/E11/runs/E11-R04.json；experiments/E11/runs/E11-R05.json；experiments/E11/runs/E11-R06.json；experiments/E11/E11-R05-metrics.csv</w:t>
+            </w:r>
+          </w:p>
+        </w:tc>
+      </w:tr>
+      <w:tr>
+        <w:trPr>
+          <w:cantSplit/>
+        </w:trPr>
+        <w:tc>
+          <w:tcPr>
+            <w:tcW w:type="dxa" w:w="2381"/>
+          </w:tcPr>
+          <w:p>
+            <w:pPr>
+              <w:spacing w:after="40" w:line="240" w:lineRule="auto"/>
+            </w:pPr>
+            <w:r>
+              <w:t>E12 质量筛选训练、评测与图表</w:t>
+            </w:r>
+          </w:p>
+        </w:tc>
+        <w:tc>
+          <w:tcPr>
+            <w:tcW w:type="dxa" w:w="7200"/>
+          </w:tcPr>
+          <w:p>
+            <w:pPr>
+              <w:spacing w:after="40" w:line="240" w:lineRule="auto"/>
+            </w:pPr>
+            <w:r>
+              <w:t>experiments/E12/runs/E12-R03.json；experiments/E12/runs/E12-R04.json；experiments/E12/E12-R03-metrics.csv；experiments/E12/figures/E12-R03-loss.png；experiments/E12/figures/E12-R03-loss.source.json；experiments/E12/quality-evaluation.csv；experiments/E12/figures/quality-evaluation.png；experiments/E12/figures/quality-evaluation.source.json</w:t>
+            </w:r>
+          </w:p>
+        </w:tc>
+      </w:tr>
+      <w:tr>
+        <w:trPr>
+          <w:cantSplit/>
+        </w:trPr>
+        <w:tc>
+          <w:tcPr>
+            <w:tcW w:type="dxa" w:w="2381"/>
+          </w:tcPr>
+          <w:p>
+            <w:pPr>
+              <w:spacing w:after="40" w:line="240" w:lineRule="auto"/>
+            </w:pPr>
+            <w:r>
+              <w:t>E12 原始归档与清单</w:t>
+            </w:r>
+          </w:p>
+        </w:tc>
+        <w:tc>
+          <w:tcPr>
+            <w:tcW w:type="dxa" w:w="7200"/>
+          </w:tcPr>
+          <w:p>
+            <w:pPr>
+              <w:spacing w:after="40" w:line="240" w:lineRule="auto"/>
+            </w:pPr>
+            <w:r>
+              <w:t>.local/archive/E12/E12-R03.zip；.local/archive/E12/E12-R03-manifest.json；.local/archive/E12/E12-R04.zip；.local/archive/E12/E12-R04-manifest.json</w:t>
             </w:r>
           </w:p>
         </w:tc>

</xml_diff>

<commit_message>
Restore Pi evidence index and fix workspace mapping
</commit_message>
<xml_diff>
--- a/docs/reports/02-微调与数据.docx
+++ b/docs/reports/02-微调与数据.docx
@@ -12,7 +12,7 @@
     </w:p>
     <w:p>
       <w:r>
-        <w:t>更新：2026-10-02T19:11:50+08:00。本册按实际实验整理，原始运行记录单独保存。</w:t>
+        <w:t>更新：2026-10-02T23:44:00+08:00。本册按实际实验整理，原始运行记录单独保存。</w:t>
       </w:r>
     </w:p>
     <w:p>
@@ -40,6 +40,16 @@
     </w:p>
     <w:p>
       <w:r>
+        <w:t>1k 学习率对照使用相同训练轨迹、rank 16、seed 17 和固定 100 条 dev：1e-4 组通过 68/100，5e-5 组通过 63/100；调用轮为 86/112 与 84/112，不调用轮为 59/72 与 56/72。5e-5 组有 1 条截断，仍保留在分母中。该单 seed 对照只说明本轮结果。</w:t>
+      </w:r>
+    </w:p>
+    <w:p>
+      <w:r>
+        <w:t>数据质量对照在固定 100 条 dev 上，基础组通过 68/100，额外筛选组通过 78/100。两组各用 1k、rank 16、学习率 1e-4、seed 17，但筛选组替换了部分样本且只有一个 seed；这是本次数据组的差异，不能归因于筛选规则本身。</w:t>
+      </w:r>
+    </w:p>
+    <w:p>
+      <w:r>
         <w:t>精度对照沿用同一生成后端和完整 dev：NF4 训练组通过 406/500，BF16 训练组通过 403/500；调用轮分别为 482/568 与 468/568，不调用轮为 342/360 与 349/360。三条轨迹的差异说明这批结果接近，不能据此单独断言精度优劣。</w:t>
       </w:r>
     </w:p>
@@ -55,17 +65,7 @@
     </w:p>
     <w:p>
       <w:r>
-        <w:t>1k 学习率组在固定 100 条 dev 上，1e-4 通过 68/100，5e-5 通过 63/100；调用轮分别为 86/112 与 84/112，不调用轮为 59/72 与 56/72。按预先确定的整条轨迹通过数选择 1e-4。这个结论限定在该冻结子集和单次训练 seed。</w:t>
-      </w:r>
-    </w:p>
-    <w:p>
-      <w:r>
         <w:t>数据质量准备保留 5k 筛选池与阅读抽查，训练比较使用来源和类别匹配的两份 1k 数据。规则的误删和漏检、筛选成本、监督量与模型表现分别记录，效果不能由“通过筛选”直接推出。</w:t>
-      </w:r>
-    </w:p>
-    <w:p>
-      <w:r>
-        <w:t>在同一份 100 条 dev 上，额外筛选组通过 78 条轨迹，基础组通过 68 条；差异主要出现在逐轮“不调用”判断。两组只有一个训练 seed，筛选组还替换了部分样本，因此这 10 条差距说明本次筛选数据表现更好，不能单独证明筛选规则带来了因果提升。</w:t>
       </w:r>
     </w:p>
     <w:p>
@@ -6656,7 +6656,6 @@
     <w:p>
       <w:pPr>
         <w:pStyle w:val="Heading2"/>
-        <w:pageBreakBefore/>
       </w:pPr>
       <w:r>
         <w:t>证据索引</w:t>
@@ -7411,7 +7410,7 @@
               <w:spacing w:after="40" w:line="240" w:lineRule="auto"/>
             </w:pPr>
             <w:r>
-              <w:t>后续训练与生成结果</w:t>
+              <w:t>E14领域混合训练与固定公开dev</w:t>
             </w:r>
           </w:p>
         </w:tc>
@@ -7424,7 +7423,69 @@
               <w:spacing w:after="40" w:line="240" w:lineRule="auto"/>
             </w:pPr>
             <w:r>
-              <w:t>experiments/E09/runs；实验笔记与各运行的 metrics.csv</w:t>
+              <w:t>experiments/E14/runs/E14-R19.json；experiments/E14/runs/E14-R20.json</w:t>
+            </w:r>
+          </w:p>
+        </w:tc>
+      </w:tr>
+      <w:tr>
+        <w:trPr>
+          <w:cantSplit/>
+        </w:trPr>
+        <w:tc>
+          <w:tcPr>
+            <w:tcW w:type="dxa" w:w="2381"/>
+          </w:tcPr>
+          <w:p>
+            <w:pPr>
+              <w:spacing w:after="40" w:line="240" w:lineRule="auto"/>
+            </w:pPr>
+            <w:r>
+              <w:t>E14 E14-R21 Pi Agent逐任务结果</w:t>
+            </w:r>
+          </w:p>
+        </w:tc>
+        <w:tc>
+          <w:tcPr>
+            <w:tcW w:type="dxa" w:w="7200"/>
+          </w:tcPr>
+          <w:p>
+            <w:pPr>
+              <w:spacing w:after="40" w:line="240" w:lineRule="auto"/>
+            </w:pPr>
+            <w:r>
+              <w:t>experiments/E14/runs/E14-R21.json</w:t>
+            </w:r>
+          </w:p>
+        </w:tc>
+      </w:tr>
+      <w:tr>
+        <w:trPr>
+          <w:cantSplit/>
+        </w:trPr>
+        <w:tc>
+          <w:tcPr>
+            <w:tcW w:type="dxa" w:w="2381"/>
+          </w:tcPr>
+          <w:p>
+            <w:pPr>
+              <w:spacing w:after="40" w:line="240" w:lineRule="auto"/>
+            </w:pPr>
+            <w:r>
+              <w:t>E14 R22 路径映射烟测（未运行模型）</w:t>
+            </w:r>
+          </w:p>
+        </w:tc>
+        <w:tc>
+          <w:tcPr>
+            <w:tcW w:type="dxa" w:w="7200"/>
+          </w:tcPr>
+          <w:p>
+            <w:pPr>
+              <w:spacing w:after="40" w:line="240" w:lineRule="auto"/>
+            </w:pPr>
+            <w:r>
+              <w:t>scripts/pi_path_smoke.mjs；experiments/E14/runs/E14-R22.json</w:t>
             </w:r>
           </w:p>
         </w:tc>

</xml_diff>

<commit_message>
Handle Pi Windows workspace paths
</commit_message>
<xml_diff>
--- a/docs/reports/02-微调与数据.docx
+++ b/docs/reports/02-微调与数据.docx
@@ -12,7 +12,7 @@
     </w:p>
     <w:p>
       <w:r>
-        <w:t>更新：2026-10-02T23:44:00+08:00。本册按实际实验整理，原始运行记录单独保存。</w:t>
+        <w:t>更新：2026-10-03T00:12:17+08:00。本册按实际实验整理，原始运行记录单独保存。</w:t>
       </w:r>
     </w:p>
     <w:p>
@@ -7472,7 +7472,7 @@
               <w:spacing w:after="40" w:line="240" w:lineRule="auto"/>
             </w:pPr>
             <w:r>
-              <w:t>E14 R22 路径映射烟测（未运行模型）</w:t>
+              <w:t>E14 E14-R24 路径映射烟测（未运行模型）</w:t>
             </w:r>
           </w:p>
         </w:tc>
@@ -7485,17 +7485,43 @@
               <w:spacing w:after="40" w:line="240" w:lineRule="auto"/>
             </w:pPr>
             <w:r>
-              <w:t>scripts/pi_path_smoke.mjs；experiments/E14/runs/E14-R22.json</w:t>
+              <w:t>scripts/pi_path_smoke.mjs；experiments/E14/runs/E14-R24.json</w:t>
+            </w:r>
+          </w:p>
+        </w:tc>
+      </w:tr>
+      <w:tr>
+        <w:trPr>
+          <w:cantSplit/>
+        </w:trPr>
+        <w:tc>
+          <w:tcPr>
+            <w:tcW w:type="dxa" w:w="2381"/>
+          </w:tcPr>
+          <w:p>
+            <w:pPr>
+              <w:spacing w:after="40" w:line="240" w:lineRule="auto"/>
+            </w:pPr>
+            <w:r>
+              <w:t>E14 Pi Agent 无效接线（不计模型成绩）</w:t>
+            </w:r>
+          </w:p>
+        </w:tc>
+        <w:tc>
+          <w:tcPr>
+            <w:tcW w:type="dxa" w:w="7200"/>
+          </w:tcPr>
+          <w:p>
+            <w:pPr>
+              <w:spacing w:after="40" w:line="240" w:lineRule="auto"/>
+            </w:pPr>
+            <w:r>
+              <w:t>experiments/E14/runs/E14-R21.json；experiments/E14/runs/E14-R23.json</w:t>
             </w:r>
           </w:p>
         </w:tc>
       </w:tr>
     </w:tbl>
-    <w:p>
-      <w:r>
-        <w:t>完整逐条回复、梯度检查、训练日志和 checkpoint 保存在本地运行档案中；精简结果中的来源哈希用于核对。理解回顾仍未收到用户答复，正文的参考解释不作为掌握程度的判断。</w:t>
-      </w:r>
-    </w:p>
     <w:sectPr>
       <w:headerReference w:type="default" r:id="rId9"/>
       <w:footerReference w:type="default" r:id="rId10"/>

</xml_diff>